<commit_message>
Reescribir Ensayo 3 desde cero con estructura propia
</commit_message>
<xml_diff>
--- a/Ensayo3_Institutional Voids.docx
+++ b/Ensayo3_Institutional Voids.docx
@@ -27,7 +27,7 @@
           <w:b/>
           <w:sz w:val="24"/>
         </w:rPr>
-        <w:t>Diferenciarse cuesta dinero: crédito, garantías y riesgo detrás del precio alto</w:t>
+        <w:t>Quién puede pagar por diferenciarse en la agroindustria latinoamericana</w:t>
       </w:r>
     </w:p>
     <w:p>
@@ -41,7 +41,7 @@
           <w:rFonts w:ascii="Calibri" w:hAnsi="Calibri"/>
           <w:sz w:val="24"/>
         </w:rPr>
-        <w:t>Brenes, Montoya y Ciravegna (2014) no escriben otro estudio más sobre Porter; se preguntan qué hace distinta a una agroindustria latinoamericana que sí logra cobrar más caro que su competencia. La respuesta no es una sola cosa, sino cinco dimensiones que se mueven juntas, y de esas cinco pesan dos, capacidad de innovación y habilidades de mercadeo. Hasta ahí se lee como un estudio de estrategia, pero cuando lo cruzo con la Unidad III del curso, que habla de operaciones ante instituciones de crédito, garantías bancarias, lavado de activos y contrato de seguro (Soto, 2026), aparece algo que no dice de frente, y es que todo lo que hacen esas empresas para diferenciarse necesita plata prestada, garantías que respalden esa plata y cobertura para el riesgo, y no todas llegan con esas tres cosas. Todavía no tengo claro si es una lectura complementaria o una critica al modelo.</w:t>
+        <w:t>Sesenta y seis gerentes de agroindustrias llenaron un formulario en línea, y de ahí sale todo lo que este estudio afirma sobre la diferenciación en América Latina (Brenes, Montoya y Ciravegna, 2014). Arranco por ahí porque ese dato condiciona lo demás. La pregunta que persiguen los autores es qué separa a una empresa que consigue cobrar por encima del promedio de otra que no lo consigue, y la contestan con cinco dimensiones, calidad de la gerencia, capacidad de innovación, alcance del agronegocio, habilidades de mercadeo y habilidades de operaciones. El orden se deja leer, pero mientras avanzaba en el articulo me fue quedando otra sensación, y es que casi todo lo que ahí se presenta como decisión estratégica supone antes un banco dispuesto a prestar. La Unidad III del curso, que trata operaciones ante instituciones de crédito, garantías, lavado de activos y contrato de seguro (Soto, 2026), me sirvió para ponerle nombre a eso que falta.</w:t>
       </w:r>
     </w:p>
     <w:p>
@@ -54,7 +54,7 @@
           <w:b/>
           <w:sz w:val="24"/>
         </w:rPr>
-        <w:t>Innovación y mercadeo, donde de verdad se separan</w:t>
+        <w:t>Lo primero es preguntar de dónde salió la muestra</w:t>
       </w:r>
     </w:p>
     <w:p>
@@ -68,7 +68,7 @@
           <w:rFonts w:ascii="Calibri" w:hAnsi="Calibri"/>
           <w:sz w:val="24"/>
         </w:rPr>
-        <w:t>El estudio compara treinta y tres empresas que dicen cobrar por encima del promedio contra treinta y tres que no, todas del trópico húmedo, privadas, fuera de bolsa y con la familia del fundador en la gerencia (Brenes et al., 2014). Las diferencias mayores aparecen en innovación, con cero punto cincuenta y seis, y mercadeo, con cero punto cincuenta y cinco; luego vienen alcance del agronegocio, operaciones y calidad de la gerencia, esta última con apenas cero punto veinte. Lo que me llamó la atención es lo chicos que son, ya que hablamos de medio punto en una escala de siete y sobre eso se construye todo un modelo. Los autores aclaran que ahí significativo no denota significancia estadística sino nada mas indicativa (Brenes et al., 2014), y agradezco la honestidad, perp igual dudo cuánto sobreviviría esa brecha con una muestra grande.</w:t>
+        <w:t>Los autores contactaron doscientas setenta y cinco empresas, recibieron ochenta y seis respuestas, descartaron veinte por venir incompletas y se quedaron con sesenta y seis de ocho países, con una tasa de respuesta de treinta y uno punto tres por ciento (Brenes et al., 2014). Además dejaron fuera a las que cotizan en bolsa, a las multinacionales y a las que solo hacen producción básica sin agregar valor. Eso deja una muestra particular, son empresas privadas, familiares, del trópico húmedo y que ya subieron por la cadena de valor. Ósea que el estudio no compara agroindustrias en general, compara sobrevivientes entre sí. Los productores de commodities, que son los que aguantan la peor parte de la volatilidad del precio, quedaron afuera desde el diseño, y eso no es un descuido, los autores lo advierten, pero sí limita a quién le sirve la conclusión.</w:t>
       </w:r>
     </w:p>
     <w:p>
@@ -82,7 +82,20 @@
           <w:rFonts w:ascii="Calibri" w:hAnsi="Calibri"/>
           <w:sz w:val="24"/>
         </w:rPr>
-        <w:t>En innovación el detalle sí es fuerte, puesto a que setenta y tres por ciento de las empresas diferenciadas califican sus procesos internos como altos o excelentes, invierten cincuenta por ciento más en investigación y desarrollo, y dieciocho por ciento destina más del siete por ciento de sus ventas a eso, mientras del otro grupo solo tres por ciento lo hace (Brenes et al., 2014). Ese contraste de dieciocho contra tres me parece el dato más duro del artículo. La innovación abierta va en la misma linea, y estas empresas se relacionan con universidades, reciben pasantes y hacen investigación conjunta al doble de intensidad. Grupo Britt es el caso que usan, con una jefatura de innovación que reporta directo a la gerencia general y un sistema formal de desarrollo de productos.</w:t>
+        <w:t>Más delicado todavía es cómo se decidió quién cuenta como empresa diferenciada. Al no existir datos financieros públicos, los autores preguntaron de frente si la empresa cobra precios consistentemente por encima de su competencia, en escala de uno a siete, y clasificaron como diferenciadas a las que contestaron cinco, seis o siete (Brenes et al., 2014). Así quedaron treinta y tres empresas en cada grupo, la muestra partida casi por mitad. Ellos aclaran que preguntar así es práctica aceptada en investigación de estrategia y no lo discuto, aunque el problema no se va; el gerente que ya metió dinero en marca, en certificaciones y en innovación tiene todos los motivos para creer que cobra más caro que el vecino. Entonces la variable que divide la muestra puede estar midiendo precio o puede estar midiendo la confianza de quien responde, y quedan pegadas.</w:t>
+      </w:r>
+    </w:p>
+    <w:p>
+      <w:pPr>
+        <w:spacing w:line="480" w:lineRule="auto" w:after="120" w:before="240"/>
+      </w:pPr>
+      <w:r>
+        <w:rPr>
+          <w:rFonts w:ascii="Calibri" w:hAnsi="Calibri"/>
+          <w:b/>
+          <w:sz w:val="24"/>
+        </w:rPr>
+        <w:t>Las dos dimensiones que de verdad se despegan</w:t>
       </w:r>
     </w:p>
     <w:p>
@@ -96,20 +109,7 @@
           <w:rFonts w:ascii="Calibri" w:hAnsi="Calibri"/>
           <w:sz w:val="24"/>
         </w:rPr>
-        <w:t>En mercadeo el patrón se repite con marca propia de por medio, ochenta y dos por ciento usa marcas propias de forma intensa y de ese grupo sesenta por ciento vende más de tres cuartas partes bajo marca propia; setenta y seis por ciento usa el origen como herramienta de venta, y noventa y uno por ciento afirma conocer al consumidor final (Brenes et al., 2014). La Canasta, de El Salvador, construye su posición en Estados Unidos sobre el hecho de ser salvadoreña, y hay una exportadora de mango que decidió primero qué variedad quería cada mercado y después sembró, mientras otra sembró según el suelo y se enteró tarde de que su fruta no vendía. Analizandolo rápido parece sentido común, aunuqe decidir la variedad desde el mercado exige información que cuesta dinero.</w:t>
-      </w:r>
-    </w:p>
-    <w:p>
-      <w:pPr>
-        <w:spacing w:line="480" w:lineRule="auto" w:after="120" w:before="240"/>
-      </w:pPr>
-      <w:r>
-        <w:rPr>
-          <w:rFonts w:ascii="Calibri" w:hAnsi="Calibri"/>
-          <w:b/>
-          <w:sz w:val="24"/>
-        </w:rPr>
-        <w:t>El crédito que el modelo no menciona</w:t>
+        <w:t>Al restar los promedios de ambos grupos, las brechas mayores aparecen en capacidad de innovación, con cero punto cincuenta y seis, y en habilidades de mercadeo, con cero punto cincuenta y cinco; alcance del agronegocio queda en cero punto treinta y seis, operaciones en cero punto treinta y calidad de la gerencia en apenas cero punto veinte (Brenes et al., 2014). Los autores avisan que ahí la palabra significativo no denota significancia estadística, solo señala una tendencia. Me parece correcto que lo aclaren, aunuqe entonces las cifras hay que leerlas con pinzas, porque medio punto en una escala de siete es poco para sostener una diferencia de fondo. Lo que sí me convence es la cifra de inversión, dieciocho por ciento de las empresas diferenciadas destina más del siete por ciento de sus ventas a investigación y desarrollo, mientras del otro grupo solo tres por ciento llega a ese nivel.</w:t>
       </w:r>
     </w:p>
     <w:p>
@@ -123,7 +123,7 @@
           <w:rFonts w:ascii="Calibri" w:hAnsi="Calibri"/>
           <w:sz w:val="24"/>
         </w:rPr>
-        <w:t>Aquí entra la Unidad III y aquí el artículo se queda corto. La intermediación financiera es actividad de interés público y el negocio bancario se organiza en operaciones pasivas, activas, neutrales y mixtas, siendo las activas justamente las de crédito (Soto, 2026). Si junto las dos lecturas, invertir cincuenta por ciento más en investigación, comprar maquinaria compleja, pagar certificaciones y construir marca no son decisiones que se financien con la caja del mes; eso se financia con crédito, y el crédito no se otorga por tener buena estrategia. El artículo describe con detalle qué hacen estas empresas y casi nada sobre cómo lo pagaron, y esa ausencia pesa cuando se trata de empresas familiares fuera de bolsa, que no pueden emitir acciones ni deuda para financiarse.</w:t>
+        <w:t>La innovación abierta apunta al mismo lado y ahí el contraste es más limpio, porque al contar únicamente las empresas que combinan pasantías con investigación conjunta, las diferenciadas duplican a las otras (Brenes et al., 2014). Grupo Britt, con base en Curazao y operaciones en catorce países, sostiene la innovación desde la gerencia general, con una jefatura dedicada y un sistema formal de desarrollo de productos. En mercadeo la figura se repite, ochenta y dos por ciento usa marca propia de forma intensa, setenta y seis por ciento se apoya en el origen para vender, noventa y uno por ciento dice conocer el perfil de su consumidor final y cincuenta y ocho por ciento reporta más certificaciones internacionales que su competencia, contra treinta y tres por ciento del otro grupo. La Canasta, salvadoreña, monta su entrada al mercado estadounidense sobre ser precisamente salvadoreña.</w:t>
       </w:r>
     </w:p>
     <w:p>
@@ -137,7 +137,20 @@
           <w:rFonts w:ascii="Calibri" w:hAnsi="Calibri"/>
           <w:sz w:val="24"/>
         </w:rPr>
-        <w:t>La Unidad III separa los créditos descubiertos de los créditos con garantía, y dentro de estos distingue la garantía personal, que se da con fianza o aval, de la real, que se da con prenda o hipoteca (Soto, 2026). Esa clasificación que parece nada mas técnica explica bastante del artículo. Una empresa duena de su finca puede hipotecarla y financiar una planta de proceso; una que arrienda no tiene qué hipotecar y le queda la prenda sobre maquinaria o el aval de un tercero, casi siempre la familia. Ahí vuelve el rasgo familiar de la muestra, porque la familia no solo aporta gerentes, tambien aporta patrimonio para avalar. No sé hasta qué punto lo que Brenes et al. (2014) leen como capacidad estratégica es capacidad de garantizar.</w:t>
+        <w:t>El caso del mango es el que mejor enseña de qué va todo esto. Una empresa decidió primero, con análisis de mercado en mano, qué variedad quería cada destino, y sembró después; otra del mismo rubro sembró según lo que aguantaba el suelo y se enteró tarde de que su fruta no tenía salida afuera (Brenes et al., 2014). La distancia entre las dos no es agronómica, es de información, y la información de mercado se compra. Britt tambien rompió con su distribuidor a fines de los noventa porque no entendía el producto, y terminó armando su propia red hacia restaurantes, hoteles y supermercados de gama alta. Ninguna de esas dos jugadas se hace con la caja del mes.</w:t>
+      </w:r>
+    </w:p>
+    <w:p>
+      <w:pPr>
+        <w:spacing w:line="480" w:lineRule="auto" w:after="120" w:before="240"/>
+      </w:pPr>
+      <w:r>
+        <w:rPr>
+          <w:rFonts w:ascii="Calibri" w:hAnsi="Calibri"/>
+          <w:b/>
+          <w:sz w:val="24"/>
+        </w:rPr>
+        <w:t>El renglón que el modelo deja fuera</w:t>
       </w:r>
     </w:p>
     <w:p>
@@ -151,20 +164,7 @@
           <w:rFonts w:ascii="Calibri" w:hAnsi="Calibri"/>
           <w:sz w:val="24"/>
         </w:rPr>
-        <w:t>El caso de Monteverde me sirve para esto. Usó un distribuidor externo por años con resultados promedio y en dos mil ocho compró una distribuidora especializada en frío y congelado, y hoy esa integración vertical le da ventaja por mejor conocimiento de mercado y servicio (Brenes et al., 2014). Leído como estrategia es impecable, leído desde la Unidad III es una operación activa de banco con garantía real de por medio, ósea que alguien tuvo que hipotecar o prendar algo para que esa compra ocurriera. Que sesenta y siete por ciento de las diferenciadas estén integradas verticalmente contra treinta y nueve del otro grupo puede medir apetito estratégico o acceso a garantías, y el artículo no da forma de separar las dos cosas.</w:t>
-      </w:r>
-    </w:p>
-    <w:p>
-      <w:pPr>
-        <w:spacing w:line="480" w:lineRule="auto" w:after="120" w:before="240"/>
-      </w:pPr>
-      <w:r>
-        <w:rPr>
-          <w:rFonts w:ascii="Calibri" w:hAnsi="Calibri"/>
-          <w:b/>
-          <w:sz w:val="24"/>
-        </w:rPr>
-        <w:t>Certificaciones, trazabilidad y una sospecha incómoda</w:t>
+        <w:t>Aquí la Unidad III me cambió la lectura. La intermediación financiera es actividad de interés público y el negocio bancario se ordena en operaciones pasivas, activas, neutrales y mixtas, siendo las activas justamente las de crédito (Soto, 2026). Puesto a que las cinco dimensiones del modelo se traducen todas en desembolsos, marca, certificación, maquinaria de proceso, capacitación, distribución propia, resulta que el modelo describe el destino del dinero y nunca su procedencia. Y no es un detalle chico, porque los autores escogieron a propósito empresas que no cotizan en bolsa, es decir que no pueden emitir acciones ni colocar deuda; les queda la utilidad retenida, el aporte de la familia o el préstamo bancario. De esas tres, dos dependen enteramente de con qué se garantiza.</w:t>
       </w:r>
     </w:p>
     <w:p>
@@ -178,7 +178,7 @@
           <w:rFonts w:ascii="Calibri" w:hAnsi="Calibri"/>
           <w:sz w:val="24"/>
         </w:rPr>
-        <w:t>Las certificaciones son donde la brecha se abre más, con cincuenta y ocho por ciento de las diferenciadas reportando más certificaciones internacionales que su competencia frente a treinta y tres del otro grupo (Brenes et al., 2014). Una certificación no es un atributo del producto, es gasto recurrente en auditorías, registros y trazabilidad que hay que sostener año con año. La Unidad III agrega aquí una capa que el artículo no toca; el lavado de activos busca ocultar el origen de bienes obtenidos ilegalmente dándoles apariencia de legalidad mediante actividades lícitas, es delito autónomo y contempla la misma sanción para testaferros (Soto, 2026). El agro paga a productores pequeños en efectivo y maneja cadenas largas de acopio, y eso, sin que nadie haya hecho nada mal, ya es un perfil que el banco mira con lupa.</w:t>
+        <w:t>La unidad separa los créditos descubiertos de los créditos con garantía, y dentro de los segundos distingue la garantía personal, que se constituye con fianza o con aval, de la garantía real, que se constituye con prenda o con hipoteca (Soto, 2026). Puesta al lado del estudio, esa clasificación explica bastante. La empresa duena de su finca hipoteca y financia una planta de proceso; la que arrienda solo puede prendar maquinaria o conseguir que alguien la avale, y ese alguien casi siempre es la misma familia. El artículo insiste en que que estas son empresas familiares y lo trata como rasgo de gobernanza, cuando tambien es un hecho patrimonial, la familia no solo pone gerentes, pone lo que se firma como respaldo.</w:t>
       </w:r>
     </w:p>
     <w:p>
@@ -192,7 +192,7 @@
           <w:rFonts w:ascii="Calibri" w:hAnsi="Calibri"/>
           <w:sz w:val="24"/>
         </w:rPr>
-        <w:t>La consecuencia va en una dirección que el artículo no considera. Una empresa que ya tiene trazabilidad montada porque la exige su certificación europea puede documentar de dónde viene cada lote y a quién le pagó, y por eso cumple más fácil la debida diligencia que le pide el banco; una que compra en la plaza y paga en efectivo no puede, y no porque esté lavando nada. La trazabilidad sirve entonces para dos cosas a la vez, para vender caro afuera y para poder pedir prestado adentro, y esa doble función hace que la brecha se ensanche sola. Vale aclarar que el debido proceso y la presunción de inocencia siguen vigentes (Soto, 2026), pero un banco no necesita acusar a nadie para simplemente no prestar.</w:t>
+        <w:t>Monteverde sirve para ver el cruce completo. La empresa costarricense trabajó años con un distribuidor externo y en dos mil ocho compró una distribuidora especializada en frío y congelado, y esa integración hoy le da ventaja en conocimiento de mercado y en servicio (Brenes et al., 2014). Como estrategia se explica sola. Vista desde la Unidad III es una operación activa con garantía de por medio, porque nadie compra una flota de frío sin que un banco revise primero qué se hipoteca. Que sesenta y siete por ciento de las diferenciadas estén integradas verticalmente frente a treinta y nueve por ciento del otro grupo quizas mida ambición estratégica, o quizas mida quién tenía con qué respaldar el préstamo, y el articulo no da manera de separarlo.</w:t>
       </w:r>
     </w:p>
     <w:p>
@@ -205,7 +205,7 @@
           <w:b/>
           <w:sz w:val="24"/>
         </w:rPr>
-        <w:t>El seguro y el riesgo que el estudio no mide</w:t>
+        <w:t>Trazabilidad, sospecha y el costo de estar en regla</w:t>
       </w:r>
     </w:p>
     <w:p>
@@ -219,7 +219,7 @@
           <w:rFonts w:ascii="Calibri" w:hAnsi="Calibri"/>
           <w:sz w:val="24"/>
         </w:rPr>
-        <w:t>Hay un resultado que los autores admiten como contradictorio, y es que setenta por ciento de las empresas diferenciadas reportan uso intenso de maquinaria especializada contra setenta y nueve de las que no se diferencian (Brenes et al., 2014). Su explicación es que las diferenciadas dependen menos del equipo aunque su procesamiento sea más complejo, y que las otras probablemente siguen liderazgo en costos, estrategia que sí vive de invertir en equipo para bajar costo unitario. Me parece razonable, aunque el estudio pregunta por intensidad de uso, no por monto invertido.</w:t>
+        <w:t>El componente de certificaciones abre otra puerta. Certificar no es una característica del producto, es un gasto que vuelve cada año en auditorías, registros y trazabilidad. La Unidad III agrega el marco que el estudio no considera, el lavado de activos consiste en ocultar el origen de bienes obtenidos ilegalmente para darles apariencia de legalidad mediante actividades lícitas, es un delito autónomo y alcanza con la misma sanción a los testaferros (Soto, 2026). El agro trabaja con pagos en efectivo a productores pequeños, con intermediarios y con cadenas largas de acopio, y ese perfil, sin que nadie haya cometido ningún delito, es el que obliga al banco a pedir más papeles antes de soltar un peso.</w:t>
       </w:r>
     </w:p>
     <w:p>
@@ -233,7 +233,7 @@
           <w:rFonts w:ascii="Calibri" w:hAnsi="Calibri"/>
           <w:sz w:val="24"/>
         </w:rPr>
-        <w:t>Aquí la Unidad III me dio la pregunta que no tenía. El riesgo es el fundamento del concepto de seguro, y el contrato se articula sobre póliza y prima, con dos errores típicos que son el infraseguro y el supraseguro (Soto, 2026). Una planta de proceso complejo, una cámara de frío o una flota como la de Monteverde concentran muchísimo valor en poco espacio y son los activos que un banco no financia sin póliza endosada a su favor. Si esa póliza está mal calculada y la empresa cae en infraseguro, un incendio se lleva la diferenciación completa y deja la deuda viva. El artículo mide cinco dimensiones y ninguna es gestión de riesgo, y me cuesta creer que eso no importe donde el patrimonio del duenño y el de la empresa son lo mismo.</w:t>
+        <w:t>De ahí sale una consecuencia que me parece grande y que el estudio no alcanza a ver. La empresa que ya montó trazabilidad porque se la exige una certificación europea puede enseñar de dónde salió cada lote y a quién le pagó, entonces cumple sin esfuerzo la debida diligencia del banco; la que compra en la plaza y paga en efectivo no puede enseñarlo, y tampoco no tiene cómo reconstruirlo después, y no porque esté lavando nada. La misma inversión rinde dos veces, para vender caro afuera y para conseguir crédito adentro, y por eso la distancia entre los dos grupos se agranda sin que nadie la empuje. Valga decir que el debido proceso y la presunción de inocencia siguen en pie (Soto, 2026), solo que un banco no necesita acusar a nadie para negar una solicitud.</w:t>
       </w:r>
     </w:p>
     <w:p>
@@ -246,7 +246,7 @@
           <w:b/>
           <w:sz w:val="24"/>
         </w:rPr>
-        <w:t>Internacionalización lenta y el precio de la paciencia</w:t>
+        <w:t>El riesgo que ninguna de las cinco dimensiones cubre</w:t>
       </w:r>
     </w:p>
     <w:p>
@@ -260,7 +260,7 @@
           <w:rFonts w:ascii="Calibri" w:hAnsi="Calibri"/>
           <w:sz w:val="24"/>
         </w:rPr>
-        <w:t>Setenta y nueve por ciento de las empresas diferenciadas operan en uno o dos países, mientras las otras llegan a estar en cinco, y la explicación es que quien quiere cobrar caro conquista mercados de forma gradual, diversificando producto, mejorando procesos y afirmando la marca en casa antes de salir (Brenes et al., 2014). El resultado invierte lo que uno esperaría, ya que internacionalizarse se lee como señal de éxito y aquí la exitosa está en menos países. Lo que veo detrás es que la gradualidad se paga con capital de trabajo inmovilizado durante años, ósea que la empresa financia marca, inventario y aprendizaje sin ingreso proporcional de vuelta, y eso solo se sostiene con líneas de crédito estables o patrimonio familiar.</w:t>
+        <w:t>Hay un resultado que los propios autores reconocen como raro, setenta por ciento de las empresas diferenciadas reporta uso intenso de maquinaria especializada, contra setenta y nueve por ciento de las que no se diferencian (Brenes et al., 2014). Su explicación es que las diferenciadas dependen menos del equipo aun teniendo procesos más complejos, y que las otras probablemente van por liderazgo en costos, estrategia que sí vive de comprar equipo para bajar el costo unitario. Suena razonable, aunque el cuestionario preguntó por intensidad de uso y no por monto invertido, asi que el dato no cierra del todo. Lo que sí queda claro es que una planta de proceso complejo concentra muchísimo valor en muy pocos metros.</w:t>
       </w:r>
     </w:p>
     <w:p>
@@ -274,7 +274,7 @@
           <w:rFonts w:ascii="Calibri" w:hAnsi="Calibri"/>
           <w:sz w:val="24"/>
         </w:rPr>
-        <w:t>Los autores tambien sugieren que resulta más fácil entrar a mercados nuevos sin diferenciarse, vendiendo lo mismo más barato, y que muchas empresas terminan siendo líderes en costo por defecto, no por decisión (Hillman y Hitt, 1999, como se citó en Brenes et al., 2014). Esa idea del líder en costo por defecto me parece la más honesta de todo el articulo, porque acepta que muchas no eligieron, se quedaron con la única estrategia que podían pagar. Para Honduras eso significa que pedirle a una agroindustria mediana que agregue valor no es un consejo si no viene con crédito de largo plazo, garantías que no dependan solo de hipoteca y algún seguro agrícola.</w:t>
+        <w:t>Y eso lleva al contrato de seguro, que es donde el silencio del estudio se nota más. El riesgo es el fundamento mismo del seguro, el contrato se sostiene sobre póliza y prima, y dos errores frecuentes son el infraseguro y el supraseguro (Soto, 2026). Un banco no financia una cámara de frío ni una flota sin póliza endosada a su favor, y si esa póliza quedó mal calculada, un siniestro se lleva la capacidad de diferenciarse y deja la deuda intacta. El modelo mide cinco dimensiones y ninguna es administración del riesgo. En empresas donde el patrimonio del dueno y el de la firma se confunden, esa ausencia me cuesta aceptarla.</w:t>
       </w:r>
     </w:p>
     <w:p>
@@ -287,7 +287,7 @@
           <w:b/>
           <w:sz w:val="24"/>
         </w:rPr>
-        <w:t>Lo que se puede sostener y lo que no</w:t>
+        <w:t>Hasta dónde llega lo que puedo afirmar</w:t>
       </w:r>
     </w:p>
     <w:p>
@@ -301,7 +301,7 @@
           <w:rFonts w:ascii="Calibri" w:hAnsi="Calibri"/>
           <w:sz w:val="24"/>
         </w:rPr>
-        <w:t>Hay una limitación que me dejó dando vueltas más que las que los autores declaran. Toda la clasificación depende de una sola pregunta, si la empresa cobra precios consistentemente por encima de su competencia, respondida por el propio gerente en escala de uno a siete, y quien contestó cinco, seis o siete quedó clasificado como diferenciado (Brenes et al., 2014). Los autores explican que no había datos formales y que preguntar directo es práctica aceptada, pero entonces la variable que divide la muestra es una autopercepción. Un gerente que invirtió en marca, certificaciones e innovación tiene todos los incentivos para creer que cobra caro. ¿Cuánto de la brecha es diferencia real de precio y cuánto es confianza del gerente que responde?</w:t>
+        <w:t>Sobre internacionalización el estudio deja un dato que va contra la intuición, setenta y nueve por ciento de las diferenciadas opera en uno o dos países mientras las otras llegan hasta cinco (Brenes et al., 2014). La explicación de los autores es que quien pretende cobrar caro entra despacio, primero diversifica producto, mejora procesos y afirma la marca en su propio mercado. Visto desde la caja, esa paciencia se financia, son años de inventario, marca y aprendizaje pagados sin ingreso proporcional de vuelta. Los mismos autores sugieren que a muchas empresas les sale más fácil crecer vendiendo lo mismo más barato, y que terminan siendo líderes en costo por defecto y no por decisión (Hillman y Hitt, 1999, como se citó en Brenes et al., 2014).</w:t>
       </w:r>
     </w:p>
     <w:p>
@@ -315,21 +315,7 @@
           <w:rFonts w:ascii="Calibri" w:hAnsi="Calibri"/>
           <w:sz w:val="24"/>
         </w:rPr>
-        <w:t>Con eso dicho, el estudio se presenta como exploratorio y pide desarrollar hipótesis formales para probarlas en contextos más amplios (Brenes et al., 2014), así que no le exigiré lo que no ofrece. Lo que sí sostengo después de este analisis es que la diferenciación, tal como la describen, es una estrategia intensiva en capital y en garantías, no solo en creatividad; innovar, certificar, procesar, marcar y distribuir cuestan dinero antes de generarlo.</w:t>
-      </w:r>
-    </w:p>
-    <w:p>
-      <w:pPr>
-        <w:spacing w:line="480" w:lineRule="auto" w:after="200"/>
-        <w:ind w:firstLine="709"/>
-        <w:jc w:val="both"/>
-      </w:pPr>
-      <w:r>
-        <w:rPr>
-          <w:rFonts w:ascii="Calibri" w:hAnsi="Calibri"/>
-          <w:sz w:val="24"/>
-        </w:rPr>
-        <w:t>Aprendí que el artículo y la Unidad III se están mirando sin saberlo, ósea que uno describe qué tiene que hacer la empresa para cobrar más y el otro las condiciones legales y financieras bajo las cuales eso se puede o no hacer. Brenes, Montoya y Ciravegna (2014) muestran que diferenciarse sí cambia el comportamiento de la empresa de forma medible, y la Unidad III me dejó claro que ese comportamiento pasa antes por un banco, por una garantía y por una póliza. Sigue sin quedarme resuelto quién debería cargar el costo de esa entrada, ni si el sistema financiero de la región está armado para financiar diferenciación o solamente volumen.</w:t>
+        <w:t>El estudio se declara exploratorio y pide que alguien formule hipótesis y las pruebe con muestras más amplias, así que no le voy a reclamar una precisión que no ofrece. Mi analisis se queda en algo más modesto, la diferenciación tal como la retratan es una estrategia que exige capital y respaldo antes de producir un solo peso extra, y en esta región el respaldo es un asunto legal antes que gerencial. Si eso es cierto, pedirle a una agroindustria mediana que agregue valor no significa nada mas mientras el crédito de largo plazo siga colgando de una hipoteca. ¿Qué tendría que cambiar en el sistema financiero de la región para que diferenciarse dejara de ser un privilegio de quien ya tiene qué garantizar?</w:t>
       </w:r>
     </w:p>
     <w:p>

</xml_diff>

<commit_message>
Quitar citas y referencia a Soto
</commit_message>
<xml_diff>
--- a/Ensayo3_Institutional Voids.docx
+++ b/Ensayo3_Institutional Voids.docx
@@ -41,7 +41,7 @@
           <w:rFonts w:ascii="Calibri" w:hAnsi="Calibri"/>
           <w:sz w:val="24"/>
         </w:rPr>
-        <w:t>Sesenta y seis gerentes de agroindustrias llenaron un formulario en línea, y de ahí sale todo lo que este estudio afirma sobre la diferenciación en América Latina (Brenes, Montoya y Ciravegna, 2014). Arranco por ahí porque ese dato condiciona lo demás. La pregunta que persiguen los autores es qué separa a una empresa que consigue cobrar por encima del promedio de otra que no lo consigue, y la contestan con cinco dimensiones, calidad de la gerencia, capacidad de innovación, alcance del agronegocio, habilidades de mercadeo y habilidades de operaciones. El orden se deja leer, pero mientras avanzaba en el articulo me fue quedando otra sensación, y es que casi todo lo que ahí se presenta como decisión estratégica supone antes un banco dispuesto a prestar. La Unidad III del curso, que trata operaciones ante instituciones de crédito, garantías, lavado de activos y contrato de seguro (Soto, 2026), me sirvió para ponerle nombre a eso que falta.</w:t>
+        <w:t>Sesenta y seis gerentes de agroindustrias llenaron un formulario en línea, y de ahí sale todo lo que este estudio afirma sobre la diferenciación en América Latina (Brenes, Montoya y Ciravegna, 2014). Arranco por ahí porque ese dato condiciona lo demás. La pregunta que persiguen los autores es qué separa a una empresa que consigue cobrar por encima del promedio de otra que no lo consigue, y la contestan con cinco dimensiones, calidad de la gerencia, capacidad de innovación, alcance del agronegocio, habilidades de mercadeo y habilidades de operaciones. El orden se deja leer, pero mientras avanzaba en el articulo me fue quedando otra sensación, y es que casi todo lo que ahí se presenta como decisión estratégica supone antes un banco dispuesto a prestar. La Unidad III del curso, que trata operaciones ante instituciones de crédito, garantías, lavado de activos y contrato de seguro, me sirvió para ponerle nombre a eso que falta en el modelo.</w:t>
       </w:r>
     </w:p>
     <w:p>
@@ -164,7 +164,7 @@
           <w:rFonts w:ascii="Calibri" w:hAnsi="Calibri"/>
           <w:sz w:val="24"/>
         </w:rPr>
-        <w:t>Aquí la Unidad III me cambió la lectura. La intermediación financiera es actividad de interés público y el negocio bancario se ordena en operaciones pasivas, activas, neutrales y mixtas, siendo las activas justamente las de crédito (Soto, 2026). Puesto a que las cinco dimensiones del modelo se traducen todas en desembolsos, marca, certificación, maquinaria de proceso, capacitación, distribución propia, resulta que el modelo describe el destino del dinero y nunca su procedencia. Y no es un detalle chico, porque los autores escogieron a propósito empresas que no cotizan en bolsa, es decir que no pueden emitir acciones ni colocar deuda; les queda la utilidad retenida, el aporte de la familia o el préstamo bancario. De esas tres, dos dependen enteramente de con qué se garantiza.</w:t>
+        <w:t>Aquí la Unidad III me cambió la lectura. La intermediación financiera es actividad de interés público y el negocio bancario se ordena en operaciones pasivas, activas, neutrales y mixtas, siendo las activas justamente las que otorgan crédito a la empresa. Puesto a que las cinco dimensiones del modelo se traducen todas en desembolsos, marca, certificación, maquinaria de proceso, capacitación, distribución propia, resulta que el modelo describe el destino del dinero y nunca su procedencia. Y no es un detalle chico, porque los autores escogieron a propósito empresas que no cotizan en bolsa, es decir que no pueden emitir acciones ni colocar deuda; les queda la utilidad retenida, el aporte de la familia o el préstamo bancario. De esas tres, dos dependen enteramente de con qué se garantiza.</w:t>
       </w:r>
     </w:p>
     <w:p>
@@ -178,7 +178,7 @@
           <w:rFonts w:ascii="Calibri" w:hAnsi="Calibri"/>
           <w:sz w:val="24"/>
         </w:rPr>
-        <w:t>La unidad separa los créditos descubiertos de los créditos con garantía, y dentro de los segundos distingue la garantía personal, que se constituye con fianza o con aval, de la garantía real, que se constituye con prenda o con hipoteca (Soto, 2026). Puesta al lado del estudio, esa clasificación explica bastante. La empresa duena de su finca hipoteca y financia una planta de proceso; la que arrienda solo puede prendar maquinaria o conseguir que alguien la avale, y ese alguien casi siempre es la misma familia. El artículo insiste en que que estas son empresas familiares y lo trata como rasgo de gobernanza, cuando tambien es un hecho patrimonial, la familia no solo pone gerentes, pone lo que se firma como respaldo.</w:t>
+        <w:t>La unidad separa los créditos descubiertos de los créditos con garantía, y dentro de los segundos distingue la garantía personal, que se constituye con fianza o con aval, de la garantía real, que se constituye con prenda o con hipoteca sobre un bien concreto. Puesta al lado del estudio, esa clasificación explica bastante. La empresa duena de su finca hipoteca y financia una planta de proceso; la que arrienda solo puede prendar maquinaria o conseguir que alguien la avale, y ese alguien casi siempre es la misma familia. El artículo insiste en que que estas son empresas familiares y lo trata como rasgo de gobernanza, cuando tambien es un hecho patrimonial, la familia no solo pone gerentes, pone lo que se firma como respaldo.</w:t>
       </w:r>
     </w:p>
     <w:p>
@@ -219,7 +219,7 @@
           <w:rFonts w:ascii="Calibri" w:hAnsi="Calibri"/>
           <w:sz w:val="24"/>
         </w:rPr>
-        <w:t>El componente de certificaciones abre otra puerta. Certificar no es una característica del producto, es un gasto que vuelve cada año en auditorías, registros y trazabilidad. La Unidad III agrega el marco que el estudio no considera, el lavado de activos consiste en ocultar el origen de bienes obtenidos ilegalmente para darles apariencia de legalidad mediante actividades lícitas, es un delito autónomo y alcanza con la misma sanción a los testaferros (Soto, 2026). El agro trabaja con pagos en efectivo a productores pequeños, con intermediarios y con cadenas largas de acopio, y ese perfil, sin que nadie haya cometido ningún delito, es el que obliga al banco a pedir más papeles antes de soltar un peso.</w:t>
+        <w:t>El componente de certificaciones abre otra puerta. Certificar no es una característica del producto, es un gasto que vuelve cada año en auditorías, registros y trazabilidad. La Unidad III agrega el marco que el estudio no considera, el lavado de activos consiste en ocultar el origen de bienes obtenidos ilegalmente para darles apariencia de legalidad mediante actividades lícitas, es un delito autónomo y alcanza con la misma sanción a los testaferros. El agro trabaja con pagos en efectivo a productores pequeños, con intermediarios y con cadenas largas de acopio, y ese perfil, sin que nadie haya cometido ningún delito, es el que obliga al banco a pedir más papeles antes de soltar un peso.</w:t>
       </w:r>
     </w:p>
     <w:p>
@@ -233,7 +233,7 @@
           <w:rFonts w:ascii="Calibri" w:hAnsi="Calibri"/>
           <w:sz w:val="24"/>
         </w:rPr>
-        <w:t>De ahí sale una consecuencia que me parece grande y que el estudio no alcanza a ver. La empresa que ya montó trazabilidad porque se la exige una certificación europea puede enseñar de dónde salió cada lote y a quién le pagó, entonces cumple sin esfuerzo la debida diligencia del banco; la que compra en la plaza y paga en efectivo no puede enseñarlo, y tampoco no tiene cómo reconstruirlo después, y no porque esté lavando nada. La misma inversión rinde dos veces, para vender caro afuera y para conseguir crédito adentro, y por eso la distancia entre los dos grupos se agranda sin que nadie la empuje. Valga decir que el debido proceso y la presunción de inocencia siguen en pie (Soto, 2026), solo que un banco no necesita acusar a nadie para negar una solicitud.</w:t>
+        <w:t>De ahí sale una consecuencia que me parece grande y que el estudio no alcanza a ver. La empresa que ya montó trazabilidad porque se la exige una certificación europea puede enseñar de dónde salió cada lote y a quién le pagó, entonces cumple sin esfuerzo la debida diligencia del banco; la que compra en la plaza y paga en efectivo no puede enseñarlo, y tampoco no tiene cómo reconstruirlo después, y no porque esté lavando nada. La misma inversión rinde dos veces, para vender caro afuera y para conseguir crédito adentro, y por eso la distancia entre los dos grupos se agranda sin que nadie la empuje. Valga decir que el debido proceso y la presunción de inocencia siguen en pie, solo que un banco no necesita acusar a nadie para negar una solicitud.</w:t>
       </w:r>
     </w:p>
     <w:p>
@@ -274,7 +274,7 @@
           <w:rFonts w:ascii="Calibri" w:hAnsi="Calibri"/>
           <w:sz w:val="24"/>
         </w:rPr>
-        <w:t>Y eso lleva al contrato de seguro, que es donde el silencio del estudio se nota más. El riesgo es el fundamento mismo del seguro, el contrato se sostiene sobre póliza y prima, y dos errores frecuentes son el infraseguro y el supraseguro (Soto, 2026). Un banco no financia una cámara de frío ni una flota sin póliza endosada a su favor, y si esa póliza quedó mal calculada, un siniestro se lleva la capacidad de diferenciarse y deja la deuda intacta. El modelo mide cinco dimensiones y ninguna es administración del riesgo. En empresas donde el patrimonio del dueno y el de la firma se confunden, esa ausencia me cuesta aceptarla.</w:t>
+        <w:t>Y eso lleva al contrato de seguro, que es donde el silencio del estudio se nota más. El riesgo es el fundamento mismo del seguro, el contrato se sostiene sobre póliza y prima, y dos errores frecuentes ahí son el infraseguro y el supraseguro. Un banco no financia una cámara de frío ni una flota sin póliza endosada a su favor, y si esa póliza quedó mal calculada, un siniestro se lleva la capacidad de diferenciarse y deja la deuda intacta. El modelo mide cinco dimensiones y ninguna es administración del riesgo. En empresas donde el patrimonio del dueno y el de la firma se confunden, esa ausencia me cuesta aceptarla.</w:t>
       </w:r>
     </w:p>
     <w:p>
@@ -335,7 +335,7 @@
     </w:p>
     <w:p>
       <w:pPr>
-        <w:spacing w:line="480" w:lineRule="auto" w:after="120"/>
+        <w:spacing w:line="480" w:lineRule="auto"/>
         <w:ind w:firstLine="709"/>
       </w:pPr>
       <w:r>
@@ -344,19 +344,6 @@
           <w:sz w:val="24"/>
         </w:rPr>
         <w:t>Brenes, E. R., Montoya, D., &amp; Ciravegna, L. (2014). Differentiation strategies in emerging markets: The case of Latin American agribusinesses. Journal of Business Research, 67(5), 847-855. https://doi.org/10.1016/j.jbusres.2013.07.003</w:t>
-      </w:r>
-    </w:p>
-    <w:p>
-      <w:pPr>
-        <w:spacing w:line="480" w:lineRule="auto"/>
-        <w:ind w:firstLine="709"/>
-      </w:pPr>
-      <w:r>
-        <w:rPr>
-          <w:rFonts w:ascii="Calibri" w:hAnsi="Calibri"/>
-          <w:sz w:val="24"/>
-        </w:rPr>
-        <w:t>Soto, R. A. (2026). Acuerdos comerciales. Unidad III. Departamento de Agronegocios, Escuela Agrícola Panamericana, Zamorano.</w:t>
       </w:r>
     </w:p>
     <w:sectPr>

</xml_diff>

<commit_message>
Redaccion corrida: fusionar oraciones cortas
</commit_message>
<xml_diff>
--- a/Ensayo3_Institutional Voids.docx
+++ b/Ensayo3_Institutional Voids.docx
@@ -41,7 +41,7 @@
           <w:rFonts w:ascii="Calibri" w:hAnsi="Calibri"/>
           <w:sz w:val="24"/>
         </w:rPr>
-        <w:t>Sesenta y seis gerentes de agroindustrias llenaron un formulario en línea, y de ahí sale todo lo que este estudio afirma sobre la diferenciación en América Latina (Brenes, Montoya y Ciravegna, 2014). Arranco por ahí porque ese dato condiciona lo demás. La pregunta que persiguen los autores es qué separa a una empresa que consigue cobrar por encima del promedio de otra que no lo consigue, y la contestan con cinco dimensiones, calidad de la gerencia, capacidad de innovación, alcance del agronegocio, habilidades de mercadeo y habilidades de operaciones. El orden se deja leer, pero mientras avanzaba en el articulo me fue quedando otra sensación, y es que casi todo lo que ahí se presenta como decisión estratégica supone antes un banco dispuesto a prestar. La Unidad III del curso, que trata operaciones ante instituciones de crédito, garantías, lavado de activos y contrato de seguro, me sirvió para ponerle nombre a eso que falta en el modelo.</w:t>
+        <w:t>Sesenta y seis gerentes de agroindustrias llenaron un formulario en línea, y de ahí sale todo lo que este estudio afirma sobre la diferenciación en América Latina (Brenes, Montoya y Ciravegna, 2014), y arranco por ahí porque ese dato condiciona lo demás. La pregunta que persiguen los autores es qué separa a una empresa que consigue cobrar por encima del promedio de otra que no lo consigue, y la contestan con cinco dimensiones, calidad de la gerencia, capacidad de innovación, alcance del agronegocio, habilidades de mercadeo y habilidades de operaciones. El orden sí se deja leer, pero mientras avanzaba en el articulo me fue quedando otra sensación, y es que casi todo lo que ahí se presenta como decisión estratégica supone antes un banco dispuesto a prestar, y la Unidad III del curso, que trata operaciones ante instituciones de crédito, garantías, lavado de activos y contrato de seguro, me sirvió para ponerle nombre a eso que falta en el modelo.</w:t>
       </w:r>
     </w:p>
     <w:p>
@@ -68,7 +68,7 @@
           <w:rFonts w:ascii="Calibri" w:hAnsi="Calibri"/>
           <w:sz w:val="24"/>
         </w:rPr>
-        <w:t>Los autores contactaron doscientas setenta y cinco empresas, recibieron ochenta y seis respuestas, descartaron veinte por venir incompletas y se quedaron con sesenta y seis de ocho países, con una tasa de respuesta de treinta y uno punto tres por ciento (Brenes et al., 2014). Además dejaron fuera a las que cotizan en bolsa, a las multinacionales y a las que solo hacen producción básica sin agregar valor. Eso deja una muestra particular, son empresas privadas, familiares, del trópico húmedo y que ya subieron por la cadena de valor. Ósea que el estudio no compara agroindustrias en general, compara sobrevivientes entre sí. Los productores de commodities, que son los que aguantan la peor parte de la volatilidad del precio, quedaron afuera desde el diseño, y eso no es un descuido, los autores lo advierten, pero sí limita a quién le sirve la conclusión.</w:t>
+        <w:t>Los autores contactaron doscientas setenta y cinco empresas, recibieron ochenta y seis respuestas, descartaron veinte por venir incompletas y se quedaron con sesenta y seis de ocho países, con una tasa de respuesta de treinta y uno punto tres por ciento (Brenes et al., 2014). Además dejaron fuera a las que cotizan en bolsa, a las multinacionales y a las que solo hacen producción básica sin agregar valor, de manera que la muestra queda particular, son empresas privadas, familiares, del trópico húmedo y que ya subieron por la cadena de valor, ósea que el estudio no compara agroindustrias en general sino que compara sobrevivientes entre sí. Los productores de commodities, que son los que aguantan la peor parte de la volatilidad del precio, quedaron afuera desde el diseño, y eso no es un descuido, los autores lo advierten, pero limita a quién le sirve la conclusión.</w:t>
       </w:r>
     </w:p>
     <w:p>
@@ -82,7 +82,7 @@
           <w:rFonts w:ascii="Calibri" w:hAnsi="Calibri"/>
           <w:sz w:val="24"/>
         </w:rPr>
-        <w:t>Más delicado todavía es cómo se decidió quién cuenta como empresa diferenciada. Al no existir datos financieros públicos, los autores preguntaron de frente si la empresa cobra precios consistentemente por encima de su competencia, en escala de uno a siete, y clasificaron como diferenciadas a las que contestaron cinco, seis o siete (Brenes et al., 2014). Así quedaron treinta y tres empresas en cada grupo, la muestra partida casi por mitad. Ellos aclaran que preguntar así es práctica aceptada en investigación de estrategia y no lo discuto, aunque el problema no se va; el gerente que ya metió dinero en marca, en certificaciones y en innovación tiene todos los motivos para creer que cobra más caro que el vecino. Entonces la variable que divide la muestra puede estar midiendo precio o puede estar midiendo la confianza de quien responde, y quedan pegadas.</w:t>
+        <w:t>Más delicado es cómo se decidió quién cuenta como empresa diferenciada, porque al no existir datos financieros públicos, los autores preguntaron de frente si la empresa cobra precios consistentemente por encima de su competencia, en escala de uno a siete, y clasificaron como diferenciadas a las que contestaron cinco, seis o siete (Brenes et al., 2014), y así quedaron treinta y tres empresas en cada grupo, partidas casi por mitad. Ellos aclaran que preguntar así es práctica aceptada en la investigación de estrategia, aunque el problema no se va; el gerente que ya metió dinero en marca, en certificaciones y en innovación tiene todos los motivos para creer que cobra más caro que el vecino, entonces la variable que divide la muestra puede estar midiendo precio real o la confianza de quien responde, y las dos cosas quedan pegadas.</w:t>
       </w:r>
     </w:p>
     <w:p>
@@ -109,7 +109,7 @@
           <w:rFonts w:ascii="Calibri" w:hAnsi="Calibri"/>
           <w:sz w:val="24"/>
         </w:rPr>
-        <w:t>Al restar los promedios de ambos grupos, las brechas mayores aparecen en capacidad de innovación, con cero punto cincuenta y seis, y en habilidades de mercadeo, con cero punto cincuenta y cinco; alcance del agronegocio queda en cero punto treinta y seis, operaciones en cero punto treinta y calidad de la gerencia en apenas cero punto veinte (Brenes et al., 2014). Los autores avisan que ahí la palabra significativo no denota significancia estadística, solo señala una tendencia. Me parece correcto que lo aclaren, aunuqe entonces las cifras hay que leerlas con pinzas, porque medio punto en una escala de siete es poco para sostener una diferencia de fondo. Lo que sí me convence es la cifra de inversión, dieciocho por ciento de las empresas diferenciadas destina más del siete por ciento de sus ventas a investigación y desarrollo, mientras del otro grupo solo tres por ciento llega a ese nivel.</w:t>
+        <w:t>Al restar los promedios de ambos grupos, las brechas mayores aparecen en capacidad de innovación, con cero punto cincuenta y seis, y en habilidades de mercadeo, con cero punto cincuenta y cinco; alcance del agronegocio queda en cero punto treinta y seis, operaciones en cero punto treinta y calidad de la gerencia en apenas cero punto veinte (Brenes et al., 2014). Los autores avisan que ahí significativo no denota significancia estadística sino apenas una tendencia, y me parece correcto que lo aclaren, aunuqe entonces las cifras hay que leerlas con pinzas, porque medio punto en una escala de siete es poco para sostener una diferencia de fondo. Lo que sí me convence es la cifra de inversión, dieciocho por ciento de las empresas diferenciadas destina más del siete por ciento de sus ventas a investigación y desarrollo, mientras del otro grupo solo tres por ciento llega ahí.</w:t>
       </w:r>
     </w:p>
     <w:p>
@@ -123,7 +123,7 @@
           <w:rFonts w:ascii="Calibri" w:hAnsi="Calibri"/>
           <w:sz w:val="24"/>
         </w:rPr>
-        <w:t>La innovación abierta apunta al mismo lado y ahí el contraste es más limpio, porque al contar únicamente las empresas que combinan pasantías con investigación conjunta, las diferenciadas duplican a las otras (Brenes et al., 2014). Grupo Britt, con base en Curazao y operaciones en catorce países, sostiene la innovación desde la gerencia general, con una jefatura dedicada y un sistema formal de desarrollo de productos. En mercadeo la figura se repite, ochenta y dos por ciento usa marca propia de forma intensa, setenta y seis por ciento se apoya en el origen para vender, noventa y uno por ciento dice conocer el perfil de su consumidor final y cincuenta y ocho por ciento reporta más certificaciones internacionales que su competencia, contra treinta y tres por ciento del otro grupo. La Canasta, salvadoreña, monta su entrada al mercado estadounidense sobre ser precisamente salvadoreña.</w:t>
+        <w:t>La innovación abierta apunta al mismo lado y ahí el contraste es más limpio, porque al contar solo las empresas que combinan pasantías con investigación conjunta, las diferenciadas duplican a las otras (Brenes et al., 2014), y Grupo Britt, con base en Curazao y operaciones en catorce países, sostiene la innovación desde la gerencia general, con una jefatura dedicada y un sistema formal de desarrollo. En mercadeo la figura se repite, ochenta y dos por ciento usa marca propia de forma intensa, setenta y seis por ciento se apoya en el origen para vender, noventa y uno por ciento dice conocer a su consumidor final y cincuenta y ocho por ciento reporta más certificaciones internacionales que su competencia, contra treinta y tres por ciento del otro grupo, y La Canasta, salvadoreña, monta toda su entrada al mercado estadounidense sobre ser precisamente salvadoreña.</w:t>
       </w:r>
     </w:p>
     <w:p>
@@ -137,7 +137,7 @@
           <w:rFonts w:ascii="Calibri" w:hAnsi="Calibri"/>
           <w:sz w:val="24"/>
         </w:rPr>
-        <w:t>El caso del mango es el que mejor enseña de qué va todo esto. Una empresa decidió primero, con análisis de mercado en mano, qué variedad quería cada destino, y sembró después; otra del mismo rubro sembró según lo que aguantaba el suelo y se enteró tarde de que su fruta no tenía salida afuera (Brenes et al., 2014). La distancia entre las dos no es agronómica, es de información, y la información de mercado se compra. Britt tambien rompió con su distribuidor a fines de los noventa porque no entendía el producto, y terminó armando su propia red hacia restaurantes, hoteles y supermercados de gama alta. Ninguna de esas dos jugadas se hace con la caja del mes.</w:t>
+        <w:t>El caso del mango es el que mejor enseña de qué va esto, porque una empresa decidió primero, con análisis de mercado en mano, qué variedad quería cada destino, y sembró después. Otra del mismo rubro sembró según lo que aguantaba el suelo y se enteró tarde de que su fruta no tenía salida afuera (Brenes et al., 2014), así que la distancia entre las dos no es agronómica, es de información, y la información de mercado se compra. Britt tambien rompió con su distribuidor a fines de los noventa porque no entendía el producto, y terminó armando su propia red hacia restaurantes, hoteles y supermercados de gama alta, y ninguna de esas dos jugadas se hace con la caja del mes.</w:t>
       </w:r>
     </w:p>
     <w:p>
@@ -164,7 +164,7 @@
           <w:rFonts w:ascii="Calibri" w:hAnsi="Calibri"/>
           <w:sz w:val="24"/>
         </w:rPr>
-        <w:t>Aquí la Unidad III me cambió la lectura. La intermediación financiera es actividad de interés público y el negocio bancario se ordena en operaciones pasivas, activas, neutrales y mixtas, siendo las activas justamente las que otorgan crédito a la empresa. Puesto a que las cinco dimensiones del modelo se traducen todas en desembolsos, marca, certificación, maquinaria de proceso, capacitación, distribución propia, resulta que el modelo describe el destino del dinero y nunca su procedencia. Y no es un detalle chico, porque los autores escogieron a propósito empresas que no cotizan en bolsa, es decir que no pueden emitir acciones ni colocar deuda; les queda la utilidad retenida, el aporte de la familia o el préstamo bancario. De esas tres, dos dependen enteramente de con qué se garantiza.</w:t>
+        <w:t>Aquí la Unidad III me cambió la lectura, porque la intermediación financiera es actividad de interés público y el negocio bancario se ordena en operaciones pasivas, activas, neutrales y mixtas, siendo las activas justamente las que otorgan crédito a la empresa. Puesto a que las cinco dimensiones del modelo se traducen todas en desembolsos, marca, certificación, maquinaria de proceso, capacitación, distribución propia, el modelo describe el destino del dinero y nunca su procedencia. No es un detalle chico, porque los autores escogieron a propósito empresas que no cotizan en bolsa, es decir que no pueden emitir acciones ni colocar deuda; les queda la utilidad retenida, el aporte de la familia o el préstamo bancario, y de esas tres, dos dependen de con qué se garantiza.</w:t>
       </w:r>
     </w:p>
     <w:p>
@@ -178,7 +178,7 @@
           <w:rFonts w:ascii="Calibri" w:hAnsi="Calibri"/>
           <w:sz w:val="24"/>
         </w:rPr>
-        <w:t>La unidad separa los créditos descubiertos de los créditos con garantía, y dentro de los segundos distingue la garantía personal, que se constituye con fianza o con aval, de la garantía real, que se constituye con prenda o con hipoteca sobre un bien concreto. Puesta al lado del estudio, esa clasificación explica bastante. La empresa duena de su finca hipoteca y financia una planta de proceso; la que arrienda solo puede prendar maquinaria o conseguir que alguien la avale, y ese alguien casi siempre es la misma familia. El artículo insiste en que que estas son empresas familiares y lo trata como rasgo de gobernanza, cuando tambien es un hecho patrimonial, la familia no solo pone gerentes, pone lo que se firma como respaldo.</w:t>
+        <w:t>La unidad separa los créditos descubiertos de los créditos con garantía, y dentro de los segundos distingue la garantía personal, que se constituye con fianza o con aval, de la garantía real, que se constituye con prenda o con hipoteca sobre un bien concreto. Puesta al lado del estudio, esa clasificación explica bastante, porque la empresa duena de su finca hipoteca y financia una planta de proceso, mientras la que arrienda solo puede prendar maquinaria o conseguir que alguien la avale, casi siempre la misma familia. El artículo insiste en que que estas son empresas familiares y lo trata como rasgo de gobernanza, cuando tambien es un hecho patrimonial, la familia no solo pone gerentes, pone lo que se firma como respaldo.</w:t>
       </w:r>
     </w:p>
     <w:p>
@@ -192,7 +192,7 @@
           <w:rFonts w:ascii="Calibri" w:hAnsi="Calibri"/>
           <w:sz w:val="24"/>
         </w:rPr>
-        <w:t>Monteverde sirve para ver el cruce completo. La empresa costarricense trabajó años con un distribuidor externo y en dos mil ocho compró una distribuidora especializada en frío y congelado, y esa integración hoy le da ventaja en conocimiento de mercado y en servicio (Brenes et al., 2014). Como estrategia se explica sola. Vista desde la Unidad III es una operación activa con garantía de por medio, porque nadie compra una flota de frío sin que un banco revise primero qué se hipoteca. Que sesenta y siete por ciento de las diferenciadas estén integradas verticalmente frente a treinta y nueve por ciento del otro grupo quizas mida ambición estratégica, o quizas mida quién tenía con qué respaldar el préstamo, y el articulo no da manera de separarlo.</w:t>
+        <w:t>Monteverde sirve para ver el cruce completo, ya que la costarricense trabajó años con un distribuidor externo y en dos mil ocho compró una distribuidora especializada en frío y congelado, y esa integración hoy le da ventaja en conocimiento de mercado y en servicio (Brenes et al., 2014). Como estrategia se explica sola, pero vista desde la Unidad III es una operación activa con garantía de por medio, porque nadie compra una flota de frío sin que un banco revise primero qué se hipoteca. Que sesenta y siete por ciento de las diferenciadas estén integradas verticalmente frente a treinta y nueve por ciento del otro grupo quizas mida ambición estratégica, o quizas quién tenía con qué respaldar el préstamo, y el articulo no da manera de separarlo.</w:t>
       </w:r>
     </w:p>
     <w:p>
@@ -219,7 +219,7 @@
           <w:rFonts w:ascii="Calibri" w:hAnsi="Calibri"/>
           <w:sz w:val="24"/>
         </w:rPr>
-        <w:t>El componente de certificaciones abre otra puerta. Certificar no es una característica del producto, es un gasto que vuelve cada año en auditorías, registros y trazabilidad. La Unidad III agrega el marco que el estudio no considera, el lavado de activos consiste en ocultar el origen de bienes obtenidos ilegalmente para darles apariencia de legalidad mediante actividades lícitas, es un delito autónomo y alcanza con la misma sanción a los testaferros. El agro trabaja con pagos en efectivo a productores pequeños, con intermediarios y con cadenas largas de acopio, y ese perfil, sin que nadie haya cometido ningún delito, es el que obliga al banco a pedir más papeles antes de soltar un peso.</w:t>
+        <w:t>El componente de certificaciones abre otra puerta, porque certificar no es una característica del producto, es un gasto que vuelve cada año en auditorías y trazabilidad. La Unidad III agrega el marco que el estudio no considera, el lavado de activos consiste en ocultar el origen de bienes obtenidos ilegalmente para darles apariencia de legalidad mediante actividades lícitas, es un delito autónomo y alcanza con la misma sanción a los testaferros. El agro trabaja con pagos en efectivo a productores pequeños, intermediarios y cadenas largas de acopio, y ese perfil, sin que nadie haya cometido ningún delito, es el que obliga al banco a pedir más papeles antes de soltar un peso.</w:t>
       </w:r>
     </w:p>
     <w:p>
@@ -233,7 +233,7 @@
           <w:rFonts w:ascii="Calibri" w:hAnsi="Calibri"/>
           <w:sz w:val="24"/>
         </w:rPr>
-        <w:t>De ahí sale una consecuencia que me parece grande y que el estudio no alcanza a ver. La empresa que ya montó trazabilidad porque se la exige una certificación europea puede enseñar de dónde salió cada lote y a quién le pagó, entonces cumple sin esfuerzo la debida diligencia del banco; la que compra en la plaza y paga en efectivo no puede enseñarlo, y tampoco no tiene cómo reconstruirlo después, y no porque esté lavando nada. La misma inversión rinde dos veces, para vender caro afuera y para conseguir crédito adentro, y por eso la distancia entre los dos grupos se agranda sin que nadie la empuje. Valga decir que el debido proceso y la presunción de inocencia siguen en pie, solo que un banco no necesita acusar a nadie para negar una solicitud.</w:t>
+        <w:t>De ahí sale una consecuencia que el estudio no alcanza a ver, ya que la empresa que ya montó trazabilidad porque se la exige una certificación europea puede enseñar de dónde salió cada lote y a quién le pagó, entonces cumple sin esfuerzo la debida diligencia del banco. La que compra en la plaza y paga en efectivo no puede enseñarlo, y tampoco no tiene cómo reconstruirlo después, y no porque esté lavando nada. La misma inversión rinde dos veces, para vender caro afuera y para conseguir crédito adentro, y por eso la distancia entre los dos grupos se agranda sin que nadie la empuje, aunque el debido proceso y la presunción de inocencia siguen en pie, solo que un banco no necesita acusar a nadie para negar una solicitud.</w:t>
       </w:r>
     </w:p>
     <w:p>
@@ -260,7 +260,7 @@
           <w:rFonts w:ascii="Calibri" w:hAnsi="Calibri"/>
           <w:sz w:val="24"/>
         </w:rPr>
-        <w:t>Hay un resultado que los propios autores reconocen como raro, setenta por ciento de las empresas diferenciadas reporta uso intenso de maquinaria especializada, contra setenta y nueve por ciento de las que no se diferencian (Brenes et al., 2014). Su explicación es que las diferenciadas dependen menos del equipo aun teniendo procesos más complejos, y que las otras probablemente van por liderazgo en costos, estrategia que sí vive de comprar equipo para bajar el costo unitario. Suena razonable, aunque el cuestionario preguntó por intensidad de uso y no por monto invertido, asi que el dato no cierra del todo. Lo que sí queda claro es que una planta de proceso complejo concentra muchísimo valor en muy pocos metros.</w:t>
+        <w:t>Hay un resultado que los autores reconocen como raro, setenta por ciento de las empresas diferenciadas reporta uso intenso de maquinaria especializada, contra setenta y nueve por ciento de las que no se diferencian (Brenes et al., 2014). Su explicación es que las diferenciadas dependen menos del equipo aun teniendo procesos más complejos, y que las otras probablemente van por liderazgo en costos, estrategia que sí vive de comprar equipo para bajar el costo unitario, lo cual suena razonable. El cuestionario, eso sí, preguntó por intensidad de uso y no por monto invertido, asi que el dato no cierra del todo, y lo único que queda claro es que una planta de proceso complejo concentra muchísimo valor en muy pocos metros.</w:t>
       </w:r>
     </w:p>
     <w:p>
@@ -274,7 +274,7 @@
           <w:rFonts w:ascii="Calibri" w:hAnsi="Calibri"/>
           <w:sz w:val="24"/>
         </w:rPr>
-        <w:t>Y eso lleva al contrato de seguro, que es donde el silencio del estudio se nota más. El riesgo es el fundamento mismo del seguro, el contrato se sostiene sobre póliza y prima, y dos errores frecuentes ahí son el infraseguro y el supraseguro. Un banco no financia una cámara de frío ni una flota sin póliza endosada a su favor, y si esa póliza quedó mal calculada, un siniestro se lleva la capacidad de diferenciarse y deja la deuda intacta. El modelo mide cinco dimensiones y ninguna es administración del riesgo. En empresas donde el patrimonio del dueno y el de la firma se confunden, esa ausencia me cuesta aceptarla.</w:t>
+        <w:t>Y eso lleva al contrato de seguro, que es donde el silencio del estudio se nota más, porque el riesgo es el fundamento mismo del seguro, el contrato se sostiene sobre póliza y prima, y dos errores frecuentes ahí son el infraseguro y el supraseguro. Un banco no financia una cámara de frío ni una flota sin póliza endosada a su favor, y si esa póliza quedó mal calculada, un siniestro se lleva la capacidad de diferenciarse y deja la deuda intacta. El modelo mide cinco dimensiones y ninguna de ellas es administración del riesgo, y en empresas donde el patrimonio del dueno y el de la firma se confunden, esa ausencia me cuesta aceptarla.</w:t>
       </w:r>
     </w:p>
     <w:p>
@@ -301,7 +301,7 @@
           <w:rFonts w:ascii="Calibri" w:hAnsi="Calibri"/>
           <w:sz w:val="24"/>
         </w:rPr>
-        <w:t>Sobre internacionalización el estudio deja un dato que va contra la intuición, setenta y nueve por ciento de las diferenciadas opera en uno o dos países mientras las otras llegan hasta cinco (Brenes et al., 2014). La explicación de los autores es que quien pretende cobrar caro entra despacio, primero diversifica producto, mejora procesos y afirma la marca en su propio mercado. Visto desde la caja, esa paciencia se financia, son años de inventario, marca y aprendizaje pagados sin ingreso proporcional de vuelta. Los mismos autores sugieren que a muchas empresas les sale más fácil crecer vendiendo lo mismo más barato, y que terminan siendo líderes en costo por defecto y no por decisión (Hillman y Hitt, 1999, como se citó en Brenes et al., 2014).</w:t>
+        <w:t>Sobre internacionalización el estudio deja un dato que va contra la intuición, setenta y nueve por ciento de las diferenciadas opera en uno o dos países mientras las otras llegan hasta cinco (Brenes et al., 2014). La explicación de los autores es que quien pretende cobrar caro entra despacio, primero diversifica producto, mejora procesos y afirma la marca en su propio mercado, aunque visto desde la caja esa paciencia se financia, son años de inventario, marca y aprendizaje pagados sin ingreso proporcional de vuelta. Los mismos autores sugieren que a muchas empresas les sale más fácil crecer vendiendo lo mismo más barato, y que terminan siendo líderes en costo por defecto y no por decisión (Hillman y Hitt, 1999, como se citó en Brenes et al., 2014).</w:t>
       </w:r>
     </w:p>
     <w:p>
@@ -315,7 +315,7 @@
           <w:rFonts w:ascii="Calibri" w:hAnsi="Calibri"/>
           <w:sz w:val="24"/>
         </w:rPr>
-        <w:t>El estudio se declara exploratorio y pide que alguien formule hipótesis y las pruebe con muestras más amplias, así que no le voy a reclamar una precisión que no ofrece. Mi analisis se queda en algo más modesto, la diferenciación tal como la retratan es una estrategia que exige capital y respaldo antes de producir un solo peso extra, y en esta región el respaldo es un asunto legal antes que gerencial. Si eso es cierto, pedirle a una agroindustria mediana que agregue valor no significa nada mas mientras el crédito de largo plazo siga colgando de una hipoteca. ¿Qué tendría que cambiar en el sistema financiero de la región para que diferenciarse dejara de ser un privilegio de quien ya tiene qué garantizar?</w:t>
+        <w:t>El estudio se declara exploratorio y pide que alguien formule hipótesis y las pruebe con muestras más amplias, así que no le voy a reclamar precisión que no ofrece, y mi analisis se queda en algo más modesto, la diferenciación tal como la retratan es una estrategia que exige capital y respaldo antes de producir un solo peso extra, y en esta región el respaldo es un asunto legal antes que gerencial. Si eso es cierto, pedirle a una agroindustria mediana que agregue valor no significa nada mas mientras el crédito de largo plazo siga colgando de una hipoteca. ¿Qué tendría que cambiar en el sistema financiero de la región para que diferenciarse dejara de ser un privilegio de quien ya tiene qué garantizar?</w:t>
       </w:r>
     </w:p>
     <w:p>

</xml_diff>

<commit_message>
Reemplazar relleno vago por datos concretos del estudio
</commit_message>
<xml_diff>
--- a/Ensayo3_Institutional Voids.docx
+++ b/Ensayo3_Institutional Voids.docx
@@ -41,7 +41,7 @@
           <w:rFonts w:ascii="Calibri" w:hAnsi="Calibri"/>
           <w:sz w:val="24"/>
         </w:rPr>
-        <w:t>Sesenta y seis gerentes de agroindustrias llenaron un formulario en línea, y de ahí sale todo lo que este estudio afirma sobre la diferenciación en América Latina (Brenes, Montoya y Ciravegna, 2014), y arranco por ahí porque ese dato condiciona lo demás. La pregunta que persiguen los autores es qué separa a una empresa que consigue cobrar por encima del promedio de otra que no lo consigue, y la contestan con cinco dimensiones, calidad de la gerencia, capacidad de innovación, alcance del agronegocio, habilidades de mercadeo y habilidades de operaciones. El orden sí se deja leer, pero mientras avanzaba en el articulo me fue quedando otra sensación, y es que casi todo lo que ahí se presenta como decisión estratégica supone antes un banco dispuesto a prestar, y la Unidad III del curso, que trata operaciones ante instituciones de crédito, garantías, lavado de activos y contrato de seguro, me sirvió para ponerle nombre a eso que falta en el modelo.</w:t>
+        <w:t>Sesenta y seis gerentes de agroindustrias llenaron un formulario en línea, y de ahí sale todo lo que este estudio afirma sobre la diferenciación en América Latina (Brenes, Montoya y Ciravegna, 2014), que son pocos casos repartidos en ocho países. La pregunta que persiguen los autores es qué separa a una empresa que consigue cobrar por encima del promedio de otra que no lo consigue, y la contestan con cinco dimensiones, calidad de la gerencia, capacidad de innovación, alcance del agronegocio, habilidades de mercadeo y habilidades de operaciones. Ninguna de esas cinco dimensiones dice de dónde sale el dinero para ejecutarlas, y las cinco exigen desembolso antes de generar ingreso, así que el articulo da por hecho un banco dispuesto a prestar. La Unidad III del curso, que trata operaciones ante instituciones de crédito, garantías, lavado de activos y contrato de seguro, cubre exactamente ese hueco.</w:t>
       </w:r>
     </w:p>
     <w:p>
@@ -54,7 +54,7 @@
           <w:b/>
           <w:sz w:val="24"/>
         </w:rPr>
-        <w:t>Lo primero es preguntar de dónde salió la muestra</w:t>
+        <w:t>Cómo se armó la muestra de sesenta y seis empresas</w:t>
       </w:r>
     </w:p>
     <w:p>
@@ -68,7 +68,7 @@
           <w:rFonts w:ascii="Calibri" w:hAnsi="Calibri"/>
           <w:sz w:val="24"/>
         </w:rPr>
-        <w:t>Los autores contactaron doscientas setenta y cinco empresas, recibieron ochenta y seis respuestas, descartaron veinte por venir incompletas y se quedaron con sesenta y seis de ocho países, con una tasa de respuesta de treinta y uno punto tres por ciento (Brenes et al., 2014). Además dejaron fuera a las que cotizan en bolsa, a las multinacionales y a las que solo hacen producción básica sin agregar valor, de manera que la muestra queda particular, son empresas privadas, familiares, del trópico húmedo y que ya subieron por la cadena de valor, ósea que el estudio no compara agroindustrias en general sino que compara sobrevivientes entre sí. Los productores de commodities, que son los que aguantan la peor parte de la volatilidad del precio, quedaron afuera desde el diseño, y eso no es un descuido, los autores lo advierten, pero limita a quién le sirve la conclusión.</w:t>
+        <w:t>Los autores contactaron doscientas setenta y cinco empresas, recibieron ochenta y seis respuestas, descartaron veinte por venir incompletas y se quedaron con sesenta y seis de ocho países, con una tasa de respuesta de treinta y uno punto tres por ciento (Brenes et al., 2014). Los ocho países son Costa Rica, República Dominicana, Guatemala, Honduras, El Salvador, Nicaragua, Ecuador y Perú, y por actividad hay cincuenta empresas en agricultura, diecisiete en ganadería, nueve en forestal y tres en pesca. Además dejaron fuera a las que cotizan en bolsa, a las multinacionales y a las que solo hacen producción básica sin agregar valor, de manera que la muestra queda particular, son empresas privadas, familiares, del trópico húmedo y que ya subieron por la cadena de valor, ósea que el estudio no compara agroindustrias en general sino que compara sobrevivientes entre sí. Los productores de commodities, que son los que aguantan la peor parte de la volatilidad del precio, quedaron afuera desde el diseño, y eso no es un descuido, los autores lo advierten, pero limita a quién le sirve la conclusión.</w:t>
       </w:r>
     </w:p>
     <w:p>
@@ -82,7 +82,7 @@
           <w:rFonts w:ascii="Calibri" w:hAnsi="Calibri"/>
           <w:sz w:val="24"/>
         </w:rPr>
-        <w:t>Más delicado es cómo se decidió quién cuenta como empresa diferenciada, porque al no existir datos financieros públicos, los autores preguntaron de frente si la empresa cobra precios consistentemente por encima de su competencia, en escala de uno a siete, y clasificaron como diferenciadas a las que contestaron cinco, seis o siete (Brenes et al., 2014), y así quedaron treinta y tres empresas en cada grupo, partidas casi por mitad. Ellos aclaran que preguntar así es práctica aceptada en la investigación de estrategia, aunque el problema no se va; el gerente que ya metió dinero en marca, en certificaciones y en innovación tiene todos los motivos para creer que cobra más caro que el vecino, entonces la variable que divide la muestra puede estar midiendo precio real o la confianza de quien responde, y las dos cosas quedan pegadas.</w:t>
+        <w:t>Más delicado es cómo se decidió quién cuenta como empresa diferenciada, porque al no existir datos financieros públicos, los autores preguntaron de frente si la empresa cobra precios consistentemente por encima de su competencia, en escala de uno a siete, y clasificaron como diferenciadas a las que contestaron cinco, seis o siete (Brenes et al., 2014), y así quedaron treinta y tres empresas en cada grupo, partidas casi por mitad. Ellos aclaran que preguntar así es práctica aceptada en la investigación de estrategia, aunque el problema no se va; el gerente que ya metió dinero en marca, en certificaciones y en innovación tiene todos los motivos para creer que cobra más caro que el vecino, entonces la variable que divide la muestra puede estar midiendo precio real o la confianza de quien responde, y el diseño no permite distinguir una cosa de la otra.</w:t>
       </w:r>
     </w:p>
     <w:p>
@@ -95,7 +95,7 @@
           <w:b/>
           <w:sz w:val="24"/>
         </w:rPr>
-        <w:t>Las dos dimensiones que de verdad se despegan</w:t>
+        <w:t>Innovación y mercadeo, las dos brechas más grandes</w:t>
       </w:r>
     </w:p>
     <w:p>
@@ -109,7 +109,7 @@
           <w:rFonts w:ascii="Calibri" w:hAnsi="Calibri"/>
           <w:sz w:val="24"/>
         </w:rPr>
-        <w:t>Al restar los promedios de ambos grupos, las brechas mayores aparecen en capacidad de innovación, con cero punto cincuenta y seis, y en habilidades de mercadeo, con cero punto cincuenta y cinco; alcance del agronegocio queda en cero punto treinta y seis, operaciones en cero punto treinta y calidad de la gerencia en apenas cero punto veinte (Brenes et al., 2014). Los autores avisan que ahí significativo no denota significancia estadística sino apenas una tendencia, y me parece correcto que lo aclaren, aunuqe entonces las cifras hay que leerlas con pinzas, porque medio punto en una escala de siete es poco para sostener una diferencia de fondo. Lo que sí me convence es la cifra de inversión, dieciocho por ciento de las empresas diferenciadas destina más del siete por ciento de sus ventas a investigación y desarrollo, mientras del otro grupo solo tres por ciento llega ahí.</w:t>
+        <w:t>Al restar los promedios de ambos grupos, las brechas mayores aparecen en capacidad de innovación, con cero punto cincuenta y seis, y en habilidades de mercadeo, con cero punto cincuenta y cinco; alcance del agronegocio queda en cero punto treinta y seis, operaciones en cero punto treinta y calidad de la gerencia en apenas cero punto veinte (Brenes et al., 2014). Los autores avisan que ahí significativo no denota significancia estadística sino apenas una tendencia, y la aclaración es necesaria, aunuqe medio punto en una escala de siete es poco para sostener una diferencia de fondo. La cifra de inversión es más sólida, dieciocho por ciento de las empresas diferenciadas destina más del siete por ciento de sus ventas a investigación y desarrollo, mientras del otro grupo solo tres por ciento llega ahí. Sesenta y uno por ciento lleva productos nuevos al mercado a un nivel alto o muy alto y cuarenta y ocho por ciento hace lo mismo con procesos, contra treinta y tres y veintisiete por ciento del otro grupo.</w:t>
       </w:r>
     </w:p>
     <w:p>
@@ -123,7 +123,7 @@
           <w:rFonts w:ascii="Calibri" w:hAnsi="Calibri"/>
           <w:sz w:val="24"/>
         </w:rPr>
-        <w:t>La innovación abierta apunta al mismo lado y ahí el contraste es más limpio, porque al contar solo las empresas que combinan pasantías con investigación conjunta, las diferenciadas duplican a las otras (Brenes et al., 2014), y Grupo Britt, con base en Curazao y operaciones en catorce países, sostiene la innovación desde la gerencia general, con una jefatura dedicada y un sistema formal de desarrollo. En mercadeo la figura se repite, ochenta y dos por ciento usa marca propia de forma intensa, setenta y seis por ciento se apoya en el origen para vender, noventa y uno por ciento dice conocer a su consumidor final y cincuenta y ocho por ciento reporta más certificaciones internacionales que su competencia, contra treinta y tres por ciento del otro grupo, y La Canasta, salvadoreña, monta toda su entrada al mercado estadounidense sobre ser precisamente salvadoreña.</w:t>
+        <w:t>En innovación abierta el contraste es mayor, porque al contar solo las empresas que combinan pasantías con investigación conjunta, las diferenciadas duplican a las otras (Brenes et al., 2014), y Grupo Britt, con base en Curazao y operaciones en catorce países, sostiene la innovación desde la gerencia general, con una jefatura dedicada y un sistema formal de desarrollo. En mercadeo la figura se repite, ochenta y dos por ciento usa marca propia de forma intensa, setenta y seis por ciento se apoya en el origen para vender, noventa y uno por ciento dice conocer a su consumidor final y cincuenta y ocho por ciento reporta más certificaciones internacionales que su competencia, contra treinta y tres por ciento del otro grupo, y La Canasta, salvadoreña, monta toda su entrada al mercado estadounidense sobre ser precisamente salvadoreña.</w:t>
       </w:r>
     </w:p>
     <w:p>
@@ -137,7 +137,7 @@
           <w:rFonts w:ascii="Calibri" w:hAnsi="Calibri"/>
           <w:sz w:val="24"/>
         </w:rPr>
-        <w:t>El caso del mango es el que mejor enseña de qué va esto, porque una empresa decidió primero, con análisis de mercado en mano, qué variedad quería cada destino, y sembró después. Otra del mismo rubro sembró según lo que aguantaba el suelo y se enteró tarde de que su fruta no tenía salida afuera (Brenes et al., 2014), así que la distancia entre las dos no es agronómica, es de información, y la información de mercado se compra. Britt tambien rompió con su distribuidor a fines de los noventa porque no entendía el producto, y terminó armando su propia red hacia restaurantes, hoteles y supermercados de gama alta, y ninguna de esas dos jugadas se hace con la caja del mes.</w:t>
+        <w:t>Dos exportadoras de mango tomaron decisiones opuestas, una definió primero, con análisis de mercado en mano, qué variedad quería cada destino, y sembró después. La otra sembró según lo que aguantaba el suelo y se enteró tarde de que su fruta no tenía salida afuera (Brenes et al., 2014), así que la distancia entre las dos no es agronómica, es de información, y la información de mercado se compra. Britt tambien rompió con su distribuidor a fines de los noventa porque no entendía el producto, y terminó armando su propia red hacia restaurantes, hoteles y supermercados de gama alta, y ni la selección de variedades ni una red propia de distribución se pagan con la caja del mes.</w:t>
       </w:r>
     </w:p>
     <w:p>
@@ -150,7 +150,7 @@
           <w:b/>
           <w:sz w:val="24"/>
         </w:rPr>
-        <w:t>El renglón que el modelo deja fuera</w:t>
+        <w:t>Crédito y garantías, lo que el modelo no registra</w:t>
       </w:r>
     </w:p>
     <w:p>
@@ -164,7 +164,7 @@
           <w:rFonts w:ascii="Calibri" w:hAnsi="Calibri"/>
           <w:sz w:val="24"/>
         </w:rPr>
-        <w:t>Aquí la Unidad III me cambió la lectura, porque la intermediación financiera es actividad de interés público y el negocio bancario se ordena en operaciones pasivas, activas, neutrales y mixtas, siendo las activas justamente las que otorgan crédito a la empresa. Puesto a que las cinco dimensiones del modelo se traducen todas en desembolsos, marca, certificación, maquinaria de proceso, capacitación, distribución propia, el modelo describe el destino del dinero y nunca su procedencia. No es un detalle chico, porque los autores escogieron a propósito empresas que no cotizan en bolsa, es decir que no pueden emitir acciones ni colocar deuda; les queda la utilidad retenida, el aporte de la familia o el préstamo bancario, y de esas tres, dos dependen de con qué se garantiza.</w:t>
+        <w:t>La intermediación financiera es actividad de interés público y el negocio bancario se ordena en operaciones pasivas, activas, neutrales y mixtas, siendo las activas justamente las que otorgan crédito a la empresa. Puesto a que las cinco dimensiones del modelo se traducen todas en desembolsos, marca, certificación, maquinaria de proceso, capacitación, distribución propia, el modelo describe el destino del dinero y nunca su procedencia. No es un detalle chico, porque los autores escogieron a propósito empresas que no cotizan en bolsa, es decir que no pueden emitir acciones ni colocar deuda; les queda la utilidad retenida, el aporte de la familia o el préstamo bancario, y de esas tres, dos dependen de con qué se garantiza.</w:t>
       </w:r>
     </w:p>
     <w:p>
@@ -178,7 +178,7 @@
           <w:rFonts w:ascii="Calibri" w:hAnsi="Calibri"/>
           <w:sz w:val="24"/>
         </w:rPr>
-        <w:t>La unidad separa los créditos descubiertos de los créditos con garantía, y dentro de los segundos distingue la garantía personal, que se constituye con fianza o con aval, de la garantía real, que se constituye con prenda o con hipoteca sobre un bien concreto. Puesta al lado del estudio, esa clasificación explica bastante, porque la empresa duena de su finca hipoteca y financia una planta de proceso, mientras la que arrienda solo puede prendar maquinaria o conseguir que alguien la avale, casi siempre la misma familia. El artículo insiste en que que estas son empresas familiares y lo trata como rasgo de gobernanza, cuando tambien es un hecho patrimonial, la familia no solo pone gerentes, pone lo que se firma como respaldo.</w:t>
+        <w:t>La unidad separa los créditos descubiertos de los créditos con garantía, y dentro de los segundos distingue la garantía personal, que se constituye con fianza o con aval, de la garantía real, que se constituye con prenda o con hipoteca sobre un bien concreto. Esa distinción decide quién puede endeudarse, porque la empresa duena de su finca hipoteca y financia una planta de proceso, mientras la que arrienda solo puede prendar maquinaria o conseguir que alguien la avale, casi siempre la misma familia. El artículo insiste en que que estas son empresas familiares y lo trata como rasgo de gobernanza, cuando tambien es un hecho patrimonial, la familia no solo pone gerentes, pone lo que se firma como respaldo.</w:t>
       </w:r>
     </w:p>
     <w:p>
@@ -192,7 +192,7 @@
           <w:rFonts w:ascii="Calibri" w:hAnsi="Calibri"/>
           <w:sz w:val="24"/>
         </w:rPr>
-        <w:t>Monteverde sirve para ver el cruce completo, ya que la costarricense trabajó años con un distribuidor externo y en dos mil ocho compró una distribuidora especializada en frío y congelado, y esa integración hoy le da ventaja en conocimiento de mercado y en servicio (Brenes et al., 2014). Como estrategia se explica sola, pero vista desde la Unidad III es una operación activa con garantía de por medio, porque nadie compra una flota de frío sin que un banco revise primero qué se hipoteca. Que sesenta y siete por ciento de las diferenciadas estén integradas verticalmente frente a treinta y nueve por ciento del otro grupo quizas mida ambición estratégica, o quizas quién tenía con qué respaldar el préstamo, y el articulo no da manera de separarlo.</w:t>
+        <w:t>Monteverde, una láctea costarricense, trabajó años con un distribuidor externo y en dos mil ocho compró una distribuidora especializada en frío y congelado, y esa integración hoy le da ventaja en conocimiento de mercado y en servicio (Brenes et al., 2014). Como movimiento estratégico es claro, pero en términos de la Unidad III es una operación activa con garantía de por medio, porque nadie compra una flota de frío sin que un banco revise primero qué se hipoteca. Que sesenta y siete por ciento de las diferenciadas estén integradas verticalmente frente a treinta y nueve por ciento del otro grupo quizas mida ambición estratégica, o quizas quién tenía con qué respaldar el préstamo, y el articulo no da manera de separarlo.</w:t>
       </w:r>
     </w:p>
     <w:p>
@@ -205,7 +205,7 @@
           <w:b/>
           <w:sz w:val="24"/>
         </w:rPr>
-        <w:t>Trazabilidad, sospecha y el costo de estar en regla</w:t>
+        <w:t>Certificaciones, trazabilidad y lavado de activos</w:t>
       </w:r>
     </w:p>
     <w:p>
@@ -219,7 +219,7 @@
           <w:rFonts w:ascii="Calibri" w:hAnsi="Calibri"/>
           <w:sz w:val="24"/>
         </w:rPr>
-        <w:t>El componente de certificaciones abre otra puerta, porque certificar no es una característica del producto, es un gasto que vuelve cada año en auditorías y trazabilidad. La Unidad III agrega el marco que el estudio no considera, el lavado de activos consiste en ocultar el origen de bienes obtenidos ilegalmente para darles apariencia de legalidad mediante actividades lícitas, es un delito autónomo y alcanza con la misma sanción a los testaferros. El agro trabaja con pagos en efectivo a productores pequeños, intermediarios y cadenas largas de acopio, y ese perfil, sin que nadie haya cometido ningún delito, es el que obliga al banco a pedir más papeles antes de soltar un peso.</w:t>
+        <w:t>Certificar no es una característica del producto sino un gasto que vuelve cada año en auditorías, registros y trazabilidad. El estudio no considera el marco legal de ese registro, y el lavado de activos consiste en ocultar el origen de bienes obtenidos ilegalmente para darles apariencia de legalidad mediante actividades lícitas, es un delito autónomo y alcanza con la misma sanción a los testaferros. El agro trabaja con pagos en efectivo a productores pequeños, intermediarios y cadenas largas de acopio, y ese perfil, sin que nadie haya cometido ningún delito, es el que obliga al banco a pedir más papeles antes de soltar un peso.</w:t>
       </w:r>
     </w:p>
     <w:p>
@@ -233,7 +233,7 @@
           <w:rFonts w:ascii="Calibri" w:hAnsi="Calibri"/>
           <w:sz w:val="24"/>
         </w:rPr>
-        <w:t>De ahí sale una consecuencia que el estudio no alcanza a ver, ya que la empresa que ya montó trazabilidad porque se la exige una certificación europea puede enseñar de dónde salió cada lote y a quién le pagó, entonces cumple sin esfuerzo la debida diligencia del banco. La que compra en la plaza y paga en efectivo no puede enseñarlo, y tampoco no tiene cómo reconstruirlo después, y no porque esté lavando nada. La misma inversión rinde dos veces, para vender caro afuera y para conseguir crédito adentro, y por eso la distancia entre los dos grupos se agranda sin que nadie la empuje, aunque el debido proceso y la presunción de inocencia siguen en pie, solo que un banco no necesita acusar a nadie para negar una solicitud.</w:t>
+        <w:t>La trazabilidad tiene un segundo uso que el estudio no registra, porque la empresa que ya la montó por exigencia de una certificación europea puede enseñar de dónde salió cada lote y a quién le pagó, entonces cumple sin esfuerzo la debida diligencia del banco. La que compra en la plaza y paga en efectivo no puede enseñarlo, y tampoco no tiene cómo reconstruirlo después, y no porque esté lavando nada. La misma inversión rinde dos veces, para vender caro afuera y para conseguir crédito adentro, y por eso la brecha entre los dos grupos se amplía sola, aunque el debido proceso y la presunción de inocencia siguen en pie, solo que un banco no necesita acusar a nadie para negar una solicitud.</w:t>
       </w:r>
     </w:p>
     <w:p>
@@ -246,7 +246,7 @@
           <w:b/>
           <w:sz w:val="24"/>
         </w:rPr>
-        <w:t>El riesgo que ninguna de las cinco dimensiones cubre</w:t>
+        <w:t>Maquinaria especializada, póliza e infraseguro</w:t>
       </w:r>
     </w:p>
     <w:p>
@@ -260,7 +260,7 @@
           <w:rFonts w:ascii="Calibri" w:hAnsi="Calibri"/>
           <w:sz w:val="24"/>
         </w:rPr>
-        <w:t>Hay un resultado que los autores reconocen como raro, setenta por ciento de las empresas diferenciadas reporta uso intenso de maquinaria especializada, contra setenta y nueve por ciento de las que no se diferencian (Brenes et al., 2014). Su explicación es que las diferenciadas dependen menos del equipo aun teniendo procesos más complejos, y que las otras probablemente van por liderazgo en costos, estrategia que sí vive de comprar equipo para bajar el costo unitario, lo cual suena razonable. El cuestionario, eso sí, preguntó por intensidad de uso y no por monto invertido, asi que el dato no cierra del todo, y lo único que queda claro es que una planta de proceso complejo concentra muchísimo valor en muy pocos metros.</w:t>
+        <w:t>Hay un resultado que los autores reconocen como raro, setenta por ciento de las empresas diferenciadas reporta uso intenso de maquinaria especializada, contra setenta y nueve por ciento de las que no se diferencian (Brenes et al., 2014). Su explicación es que las diferenciadas dependen menos del equipo aun teniendo procesos más complejos, y que las otras probablemente van por liderazgo en costos, estrategia que sí vive de comprar equipo para bajar el costo unitario, lo cual es consistente con la lógica de esa estrategia. El cuestionario, eso sí, preguntó por intensidad de uso y no por monto invertido, asi que el dato no cierra del todo, y una planta de proceso complejo concentra mucho valor asegurable en pocos metros cuadrados. En relación con proveedores y en calidad del producto no aparece ninguna diferencia entre los dos grupos.</w:t>
       </w:r>
     </w:p>
     <w:p>
@@ -274,7 +274,7 @@
           <w:rFonts w:ascii="Calibri" w:hAnsi="Calibri"/>
           <w:sz w:val="24"/>
         </w:rPr>
-        <w:t>Y eso lleva al contrato de seguro, que es donde el silencio del estudio se nota más, porque el riesgo es el fundamento mismo del seguro, el contrato se sostiene sobre póliza y prima, y dos errores frecuentes ahí son el infraseguro y el supraseguro. Un banco no financia una cámara de frío ni una flota sin póliza endosada a su favor, y si esa póliza quedó mal calculada, un siniestro se lleva la capacidad de diferenciarse y deja la deuda intacta. El modelo mide cinco dimensiones y ninguna de ellas es administración del riesgo, y en empresas donde el patrimonio del dueno y el de la firma se confunden, esa ausencia me cuesta aceptarla.</w:t>
+        <w:t>El contrato de seguro no aparece en ninguna de las cinco dimensiones, y el riesgo es su fundamento, se sostiene sobre póliza y prima, y dos errores frecuentes ahí son el infraseguro y el supraseguro. Un banco no financia una cámara de frío ni una flota sin póliza endosada a su favor, y si esa póliza quedó mal calculada, un siniestro se lleva la capacidad de diferenciarse y deja la deuda intacta. Ninguna de las cinco dimensiones mide administración del riesgo, y en estas empresas el patrimonio del dueno responde por la deuda de la firma.</w:t>
       </w:r>
     </w:p>
     <w:p>
@@ -287,7 +287,7 @@
           <w:b/>
           <w:sz w:val="24"/>
         </w:rPr>
-        <w:t>Hasta dónde llega lo que puedo afirmar</w:t>
+        <w:t>Internacionalización y límites del estudio</w:t>
       </w:r>
     </w:p>
     <w:p>
@@ -301,7 +301,7 @@
           <w:rFonts w:ascii="Calibri" w:hAnsi="Calibri"/>
           <w:sz w:val="24"/>
         </w:rPr>
-        <w:t>Sobre internacionalización el estudio deja un dato que va contra la intuición, setenta y nueve por ciento de las diferenciadas opera en uno o dos países mientras las otras llegan hasta cinco (Brenes et al., 2014). La explicación de los autores es que quien pretende cobrar caro entra despacio, primero diversifica producto, mejora procesos y afirma la marca en su propio mercado, aunque visto desde la caja esa paciencia se financia, son años de inventario, marca y aprendizaje pagados sin ingreso proporcional de vuelta. Los mismos autores sugieren que a muchas empresas les sale más fácil crecer vendiendo lo mismo más barato, y que terminan siendo líderes en costo por defecto y no por decisión (Hillman y Hitt, 1999, como se citó en Brenes et al., 2014).</w:t>
+        <w:t>Sobre internacionalización el estudio deja un dato que va contra la intuición, setenta y nueve por ciento de las diferenciadas opera en uno o dos países mientras las otras llegan hasta cinco (Brenes et al., 2014). La explicación de los autores es que quien pretende cobrar caro entra despacio, primero diversifica producto, mejora procesos y afirma la marca en su propio mercado, aunque esa entrada gradual se financia, son años de inventario, marca y aprendizaje pagados sin ingreso proporcional de vuelta. Los mismos autores sugieren que a muchas empresas les sale más fácil crecer vendiendo lo mismo más barato, y que terminan siendo líderes en costo por defecto y no por decisión (Hillman y Hitt, 1999, como se citó en Brenes et al., 2014).</w:t>
       </w:r>
     </w:p>
     <w:p>
@@ -315,7 +315,7 @@
           <w:rFonts w:ascii="Calibri" w:hAnsi="Calibri"/>
           <w:sz w:val="24"/>
         </w:rPr>
-        <w:t>El estudio se declara exploratorio y pide que alguien formule hipótesis y las pruebe con muestras más amplias, así que no le voy a reclamar precisión que no ofrece, y mi analisis se queda en algo más modesto, la diferenciación tal como la retratan es una estrategia que exige capital y respaldo antes de producir un solo peso extra, y en esta región el respaldo es un asunto legal antes que gerencial. Si eso es cierto, pedirle a una agroindustria mediana que agregue valor no significa nada mas mientras el crédito de largo plazo siga colgando de una hipoteca. ¿Qué tendría que cambiar en el sistema financiero de la región para que diferenciarse dejara de ser un privilegio de quien ya tiene qué garantizar?</w:t>
+        <w:t>El estudio se declara exploratorio y pide que alguien formule hipótesis y las pruebe con muestras más amplias, así que no le voy a reclamar precisión que no ofrece, y mi analisis se limita a lo que sus datos sostienen, la diferenciación tal como la retratan exige capital y respaldo antes de producir un solo peso extra, y en esta región ese respaldo se define en un contrato de garantía y no en una junta directiva. Si eso es cierto, pedirle a una agroindustria mediana que agregue valor no significa nada mas mientras el crédito de largo plazo siga colgando de una hipoteca. ¿Qué tendría que cambiar en el sistema financiero de la región para que diferenciarse dejara de ser un privilegio de quien ya tiene qué garantizar?</w:t>
       </w:r>
     </w:p>
     <w:p>

</xml_diff>

<commit_message>
Pegar oraciones cortas con comas en vez de punto
</commit_message>
<xml_diff>
--- a/Ensayo3_Institutional Voids.docx
+++ b/Ensayo3_Institutional Voids.docx
@@ -41,7 +41,7 @@
           <w:rFonts w:ascii="Calibri" w:hAnsi="Calibri"/>
           <w:sz w:val="24"/>
         </w:rPr>
-        <w:t>Sesenta y seis gerentes de agroindustrias llenaron un formulario en línea, y de ahí sale todo lo que este estudio afirma sobre la diferenciación en América Latina (Brenes, Montoya y Ciravegna, 2014), que son pocos casos repartidos en ocho países. La pregunta que persiguen los autores es qué separa a una empresa que consigue cobrar por encima del promedio de otra que no lo consigue, y la contestan con cinco dimensiones, calidad de la gerencia, capacidad de innovación, alcance del agronegocio, habilidades de mercadeo y habilidades de operaciones. Ninguna de esas cinco dimensiones dice de dónde sale el dinero para ejecutarlas, y las cinco exigen desembolso antes de generar ingreso, así que el articulo da por hecho un banco dispuesto a prestar. La Unidad III del curso, que trata operaciones ante instituciones de crédito, garantías, lavado de activos y contrato de seguro, cubre exactamente ese hueco.</w:t>
+        <w:t>Sesenta y seis gerentes de agroindustrias llenaron un formulario en línea, y de ahí sale todo lo que este estudio afirma sobre la diferenciación en América Latina, pocos casos para ocho países (Brenes, Montoya y Ciravegna, 2014). La pregunta que persiguen los autores es qué separa a una empresa que consigue cobrar por encima del promedio de otra que no lo consigue, y la contestan con cinco dimensiones, calidad de la gerencia, capacidad de innovación, alcance del agronegocio, habilidades de mercadeo y habilidades de operaciones. Ninguna de esas cinco dimensiones dice de dónde sale el dinero para ejecutarlas, y las cinco exigen desembolso antes de generar ingreso, así que el articulo da por hecho un banco dispuesto a prestar, y la Unidad III del curso, que trata operaciones ante instituciones de crédito, garantías, lavado de activos y contrato de seguro, cubre exactamente ese hueco.</w:t>
       </w:r>
     </w:p>
     <w:p>
@@ -137,7 +137,7 @@
           <w:rFonts w:ascii="Calibri" w:hAnsi="Calibri"/>
           <w:sz w:val="24"/>
         </w:rPr>
-        <w:t>Dos exportadoras de mango tomaron decisiones opuestas, una definió primero, con análisis de mercado en mano, qué variedad quería cada destino, y sembró después. La otra sembró según lo que aguantaba el suelo y se enteró tarde de que su fruta no tenía salida afuera (Brenes et al., 2014), así que la distancia entre las dos no es agronómica, es de información, y la información de mercado se compra. Britt tambien rompió con su distribuidor a fines de los noventa porque no entendía el producto, y terminó armando su propia red hacia restaurantes, hoteles y supermercados de gama alta, y ni la selección de variedades ni una red propia de distribución se pagan con la caja del mes.</w:t>
+        <w:t>Dos exportadoras de mango tomaron decisiones opuestas, una definió primero, con análisis de mercado en mano, qué variedad quería cada destino, y sembró después, mientras la otra sembró según lo que aguantaba el suelo y se enteró tarde de que su fruta no tenía salida afuera (Brenes et al., 2014), así que la distancia entre las dos no es agronómica, es de información, y la información de mercado se compra. Britt tambien rompió con su distribuidor a fines de los noventa porque no entendía el producto, y terminó armando su propia red hacia restaurantes, hoteles y supermercados de gama alta, y ni la selección de variedades ni una red propia de distribución se pagan con la caja del mes.</w:t>
       </w:r>
     </w:p>
     <w:p>
@@ -219,7 +219,7 @@
           <w:rFonts w:ascii="Calibri" w:hAnsi="Calibri"/>
           <w:sz w:val="24"/>
         </w:rPr>
-        <w:t>Certificar no es una característica del producto sino un gasto que vuelve cada año en auditorías, registros y trazabilidad. El estudio no considera el marco legal de ese registro, y el lavado de activos consiste en ocultar el origen de bienes obtenidos ilegalmente para darles apariencia de legalidad mediante actividades lícitas, es un delito autónomo y alcanza con la misma sanción a los testaferros. El agro trabaja con pagos en efectivo a productores pequeños, intermediarios y cadenas largas de acopio, y ese perfil, sin que nadie haya cometido ningún delito, es el que obliga al banco a pedir más papeles antes de soltar un peso.</w:t>
+        <w:t>Certificar no es una característica del producto sino un gasto que vuelve cada año en auditorías, registros y trazabilidad, y el estudio no considera el marco legal de ese registro, porque el lavado de activos consiste en ocultar el origen de bienes obtenidos ilegalmente para darles apariencia de legalidad mediante actividades lícitas, es un delito autónomo y alcanza con la misma sanción a los testaferros. El agro trabaja con pagos en efectivo a productores pequeños, intermediarios y cadenas largas de acopio, y ese perfil, sin que nadie haya cometido ningún delito, es el que obliga al banco a pedir más papeles antes de soltar un peso.</w:t>
       </w:r>
     </w:p>
     <w:p>
@@ -233,7 +233,7 @@
           <w:rFonts w:ascii="Calibri" w:hAnsi="Calibri"/>
           <w:sz w:val="24"/>
         </w:rPr>
-        <w:t>La trazabilidad tiene un segundo uso que el estudio no registra, porque la empresa que ya la montó por exigencia de una certificación europea puede enseñar de dónde salió cada lote y a quién le pagó, entonces cumple sin esfuerzo la debida diligencia del banco. La que compra en la plaza y paga en efectivo no puede enseñarlo, y tampoco no tiene cómo reconstruirlo después, y no porque esté lavando nada. La misma inversión rinde dos veces, para vender caro afuera y para conseguir crédito adentro, y por eso la brecha entre los dos grupos se amplía sola, aunque el debido proceso y la presunción de inocencia siguen en pie, solo que un banco no necesita acusar a nadie para negar una solicitud.</w:t>
+        <w:t>La trazabilidad tiene un segundo uso que el estudio no registra, porque la empresa que ya la montó por exigencia de una certificación europea puede enseñar de dónde salió cada lote y a quién le pagó, entonces cumple sin esfuerzo la debida diligencia del banco, mientras la que compra en la plaza y paga en efectivo no puede enseñarlo, y tampoco no tiene cómo reconstruirlo después, y no porque esté lavando nada. La misma inversión rinde dos veces, para vender caro afuera y para conseguir crédito adentro, y por eso la brecha entre los dos grupos se amplía sola, aunque el debido proceso y la presunción de inocencia siguen en pie, solo que un banco no necesita acusar a nadie para negar una solicitud.</w:t>
       </w:r>
     </w:p>
     <w:p>
@@ -260,7 +260,7 @@
           <w:rFonts w:ascii="Calibri" w:hAnsi="Calibri"/>
           <w:sz w:val="24"/>
         </w:rPr>
-        <w:t>Hay un resultado que los autores reconocen como raro, setenta por ciento de las empresas diferenciadas reporta uso intenso de maquinaria especializada, contra setenta y nueve por ciento de las que no se diferencian (Brenes et al., 2014). Su explicación es que las diferenciadas dependen menos del equipo aun teniendo procesos más complejos, y que las otras probablemente van por liderazgo en costos, estrategia que sí vive de comprar equipo para bajar el costo unitario, lo cual es consistente con la lógica de esa estrategia. El cuestionario, eso sí, preguntó por intensidad de uso y no por monto invertido, asi que el dato no cierra del todo, y una planta de proceso complejo concentra mucho valor asegurable en pocos metros cuadrados. En relación con proveedores y en calidad del producto no aparece ninguna diferencia entre los dos grupos.</w:t>
+        <w:t>Hay un resultado que los autores reconocen como raro, setenta por ciento de las empresas diferenciadas reporta uso intenso de maquinaria especializada, contra setenta y nueve por ciento de las que no se diferencian (Brenes et al., 2014). Su explicación es que las diferenciadas dependen menos del equipo aun teniendo procesos más complejos, y que las otras probablemente van por liderazgo en costos, estrategia que sí vive de comprar equipo para bajar el costo unitario, lo cual es consistente con la lógica de esa estrategia. El cuestionario solo preguntó por intensidad de uso y no por monto invertido, asi que el dato no cierra del todo, y una planta de proceso complejo concentra mucho valor asegurable en pocos metros cuadrados, y en relación con proveedores y en calidad del producto no aparece ninguna diferencia entre los dos grupos.</w:t>
       </w:r>
     </w:p>
     <w:p>
@@ -274,7 +274,7 @@
           <w:rFonts w:ascii="Calibri" w:hAnsi="Calibri"/>
           <w:sz w:val="24"/>
         </w:rPr>
-        <w:t>El contrato de seguro no aparece en ninguna de las cinco dimensiones, y el riesgo es su fundamento, se sostiene sobre póliza y prima, y dos errores frecuentes ahí son el infraseguro y el supraseguro. Un banco no financia una cámara de frío ni una flota sin póliza endosada a su favor, y si esa póliza quedó mal calculada, un siniestro se lleva la capacidad de diferenciarse y deja la deuda intacta. Ninguna de las cinco dimensiones mide administración del riesgo, y en estas empresas el patrimonio del dueno responde por la deuda de la firma.</w:t>
+        <w:t>El contrato de seguro no aparece en ninguna de las cinco dimensiones, y el riesgo es su fundamento, se sostiene sobre póliza y prima, y dos errores frecuentes ahí son el infraseguro y el supraseguro. Un banco no financia una cámara de frío ni una flota sin póliza endosada a su favor, y si esa póliza quedó mal calculada, un siniestro se lleva la capacidad de diferenciarse y deja la deuda intacta, y ninguna de las cinco dimensiones mide administración del riesgo, aunque en estas empresas el patrimonio del dueno responde por la deuda de la firma.</w:t>
       </w:r>
     </w:p>
     <w:p>
@@ -315,7 +315,7 @@
           <w:rFonts w:ascii="Calibri" w:hAnsi="Calibri"/>
           <w:sz w:val="24"/>
         </w:rPr>
-        <w:t>El estudio se declara exploratorio y pide que alguien formule hipótesis y las pruebe con muestras más amplias, así que no le voy a reclamar precisión que no ofrece, y mi analisis se limita a lo que sus datos sostienen, la diferenciación tal como la retratan exige capital y respaldo antes de producir un solo peso extra, y en esta región ese respaldo se define en un contrato de garantía y no en una junta directiva. Si eso es cierto, pedirle a una agroindustria mediana que agregue valor no significa nada mas mientras el crédito de largo plazo siga colgando de una hipoteca. ¿Qué tendría que cambiar en el sistema financiero de la región para que diferenciarse dejara de ser un privilegio de quien ya tiene qué garantizar?</w:t>
+        <w:t>El estudio se declara exploratorio y pide que alguien formule hipótesis y las pruebe con muestras más amplias, así que no le voy a reclamar precisión que no ofrece, y mi analisis se limita a lo que sus datos sostienen, la diferenciación tal como la retratan exige capital y respaldo antes de producir un solo peso extra, y en esta región ese respaldo se define en un contrato de garantía y no en una junta directiva, así que pedirle a una agroindustria mediana que agregue valor no significa nada mas mientras el crédito de largo plazo siga colgando de una hipoteca. ¿Qué tendría que cambiar en el sistema financiero de la región para que diferenciarse dejara de ser un privilegio de quien ya tiene qué garantizar?</w:t>
       </w:r>
     </w:p>
     <w:p>

</xml_diff>

<commit_message>
Cifras en digitos y palabras segun APA 7
</commit_message>
<xml_diff>
--- a/Ensayo3_Institutional Voids.docx
+++ b/Ensayo3_Institutional Voids.docx
@@ -41,7 +41,7 @@
           <w:rFonts w:ascii="Calibri" w:hAnsi="Calibri"/>
           <w:sz w:val="24"/>
         </w:rPr>
-        <w:t>Sesenta y seis gerentes de agroindustrias llenaron un formulario en línea, y de ahí sale todo lo que este estudio afirma sobre la diferenciación en América Latina, pocos casos para ocho países (Brenes, Montoya y Ciravegna, 2014). La pregunta que persiguen los autores es qué separa a una empresa que consigue cobrar por encima del promedio de otra que no lo consigue, y la contestan con cinco dimensiones, calidad de la gerencia, capacidad de innovación, alcance del agronegocio, habilidades de mercadeo y habilidades de operaciones. Ninguna de esas cinco dimensiones dice de dónde sale el dinero para ejecutarlas, y las cinco exigen desembolso antes de generar ingreso, así que el articulo da por hecho un banco dispuesto a prestar, y la Unidad III del curso, que trata operaciones ante instituciones de crédito, garantías, lavado de activos y contrato de seguro, cubre exactamente ese hueco.</w:t>
+        <w:t>66 gerentes de agroindustrias llenaron un formulario en línea, y de ahí sale todo lo que este estudio afirma sobre la diferenciación en América Latina, pocos casos para ocho países (Brenes, Montoya y Ciravegna, 2014). La pregunta que persiguen los autores es qué separa a una empresa que consigue cobrar por encima del promedio de otra que no lo consigue, y la contestan con cinco dimensiones, calidad de la gerencia, capacidad de innovación, alcance del agronegocio, habilidades de mercadeo y habilidades de operaciones. Ninguna de esas cinco dimensiones dice de dónde sale el dinero para ejecutarlas, y las cinco exigen desembolso antes de generar ingreso, así que el articulo da por hecho un banco dispuesto a prestar, y la Unidad III del curso, que trata operaciones ante instituciones de crédito, garantías, lavado de activos y contrato de seguro, cubre exactamente ese hueco.</w:t>
       </w:r>
     </w:p>
     <w:p>
@@ -54,7 +54,7 @@
           <w:b/>
           <w:sz w:val="24"/>
         </w:rPr>
-        <w:t>Cómo se armó la muestra de sesenta y seis empresas</w:t>
+        <w:t>Cómo se armó la muestra de 66 empresas</w:t>
       </w:r>
     </w:p>
     <w:p>
@@ -68,7 +68,7 @@
           <w:rFonts w:ascii="Calibri" w:hAnsi="Calibri"/>
           <w:sz w:val="24"/>
         </w:rPr>
-        <w:t>Los autores contactaron doscientas setenta y cinco empresas, recibieron ochenta y seis respuestas, descartaron veinte por venir incompletas y se quedaron con sesenta y seis de ocho países, con una tasa de respuesta de treinta y uno punto tres por ciento (Brenes et al., 2014). Los ocho países son Costa Rica, República Dominicana, Guatemala, Honduras, El Salvador, Nicaragua, Ecuador y Perú, y por actividad hay cincuenta empresas en agricultura, diecisiete en ganadería, nueve en forestal y tres en pesca. Además dejaron fuera a las que cotizan en bolsa, a las multinacionales y a las que solo hacen producción básica sin agregar valor, de manera que la muestra queda particular, son empresas privadas, familiares, del trópico húmedo y que ya subieron por la cadena de valor, ósea que el estudio no compara agroindustrias en general sino que compara sobrevivientes entre sí. Los productores de commodities, que son los que aguantan la peor parte de la volatilidad del precio, quedaron afuera desde el diseño, y eso no es un descuido, los autores lo advierten, pero limita a quién le sirve la conclusión.</w:t>
+        <w:t>Antes de la encuesta, el modelo salió de más de 90 horas de conversaciones abiertas con 17 agroindustrias entre enero de 2006 y septiembre de 2011, y se validó en una segunda ronda de entrevistas. Los autores contactaron 275 empresas, recibieron 86 respuestas, descartaron 20 por venir incompletas y se quedaron con 66 de ocho países, con una tasa de respuesta de 31.3% (Brenes et al., 2014). Los ocho países son Costa Rica, República Dominicana, Guatemala, Honduras, El Salvador, Nicaragua, Ecuador y Perú, y por actividad hay 50 empresas en agricultura, 17 en ganadería, 9 en forestal y 3 en pesca. Además dejaron fuera a las que cotizan en bolsa, a las multinacionales y a las que solo hacen producción básica sin agregar valor, de manera que la muestra queda particular, son empresas privadas, familiares, del trópico húmedo y que ya subieron por la cadena de valor, ósea que el estudio no compara agroindustrias en general sino que compara sobrevivientes entre sí. Los productores de commodities, que son los que aguantan la peor parte de la volatilidad del precio, quedaron afuera desde el diseño, y eso no es un descuido, los autores lo advierten, pero limita a quién le sirve la conclusión.</w:t>
       </w:r>
     </w:p>
     <w:p>
@@ -82,7 +82,7 @@
           <w:rFonts w:ascii="Calibri" w:hAnsi="Calibri"/>
           <w:sz w:val="24"/>
         </w:rPr>
-        <w:t>Más delicado es cómo se decidió quién cuenta como empresa diferenciada, porque al no existir datos financieros públicos, los autores preguntaron de frente si la empresa cobra precios consistentemente por encima de su competencia, en escala de uno a siete, y clasificaron como diferenciadas a las que contestaron cinco, seis o siete (Brenes et al., 2014), y así quedaron treinta y tres empresas en cada grupo, partidas casi por mitad. Ellos aclaran que preguntar así es práctica aceptada en la investigación de estrategia, aunque el problema no se va; el gerente que ya metió dinero en marca, en certificaciones y en innovación tiene todos los motivos para creer que cobra más caro que el vecino, entonces la variable que divide la muestra puede estar midiendo precio real o la confianza de quien responde, y el diseño no permite distinguir una cosa de la otra.</w:t>
+        <w:t>Más delicado es cómo se decidió quién cuenta como empresa diferenciada, porque al no existir datos financieros públicos, los autores preguntaron de frente si la empresa cobra precios consistentemente por encima de su competencia, en escala de 1 a 7, y clasificaron como diferenciadas a las que contestaron 5, 6 o 7 (Brenes et al., 2014), y así quedaron 33 empresas en cada grupo, partidas casi por mitad. Ellos aclaran que preguntar así es práctica aceptada en la investigación de estrategia, aunque el problema no se va; el gerente que ya metió dinero en marca, en certificaciones y en innovación tiene todos los motivos para creer que cobra más caro que el vecino, entonces la variable que divide la muestra puede estar midiendo precio real o la confianza de quien responde, y el diseño no permite distinguir una cosa de la otra.</w:t>
       </w:r>
     </w:p>
     <w:p>
@@ -109,7 +109,7 @@
           <w:rFonts w:ascii="Calibri" w:hAnsi="Calibri"/>
           <w:sz w:val="24"/>
         </w:rPr>
-        <w:t>Al restar los promedios de ambos grupos, las brechas mayores aparecen en capacidad de innovación, con cero punto cincuenta y seis, y en habilidades de mercadeo, con cero punto cincuenta y cinco; alcance del agronegocio queda en cero punto treinta y seis, operaciones en cero punto treinta y calidad de la gerencia en apenas cero punto veinte (Brenes et al., 2014). Los autores avisan que ahí significativo no denota significancia estadística sino apenas una tendencia, y la aclaración es necesaria, aunuqe medio punto en una escala de siete es poco para sostener una diferencia de fondo. La cifra de inversión es más sólida, dieciocho por ciento de las empresas diferenciadas destina más del siete por ciento de sus ventas a investigación y desarrollo, mientras del otro grupo solo tres por ciento llega ahí. Sesenta y uno por ciento lleva productos nuevos al mercado a un nivel alto o muy alto y cuarenta y ocho por ciento hace lo mismo con procesos, contra treinta y tres y veintisiete por ciento del otro grupo.</w:t>
+        <w:t>Al restar los promedios de ambos grupos, las brechas mayores aparecen en capacidad de innovación, con 0.56, y en habilidades de mercadeo, con 0.55; alcance del agronegocio queda en 0.36, operaciones en 0.30 y calidad de la gerencia en apenas 0.20 (Brenes et al., 2014). Los autores avisan que ahí significativo no denota significancia estadística sino apenas una tendencia, y la aclaración es necesaria, aunuqe medio punto en una escala de 7 es poco para sostener una diferencia de fondo. La cifra de inversión es más sólida, 18% de las empresas diferenciadas destina más del 7% de sus ventas a investigación y desarrollo, mientras del otro grupo solo 3% llega ahí. 61% lleva productos nuevos al mercado a un nivel alto o muy alto y 48% hace lo mismo con procesos, contra 33% y 27% del otro grupo. En calidad de la gerencia, que es la dimensión con la brecha más chica de todas, 51% de las diferenciadas tiene una estrategia formalmente definida contra 39% del otro grupo, 67% califica a su equipo gerencial como muy bueno o excelente contra 48%, y en juntas formales y habilidades de recursos humanos no aparece diferencia entre ambos grupos.</w:t>
       </w:r>
     </w:p>
     <w:p>
@@ -123,7 +123,7 @@
           <w:rFonts w:ascii="Calibri" w:hAnsi="Calibri"/>
           <w:sz w:val="24"/>
         </w:rPr>
-        <w:t>En innovación abierta el contraste es mayor, porque al contar solo las empresas que combinan pasantías con investigación conjunta, las diferenciadas duplican a las otras (Brenes et al., 2014), y Grupo Britt, con base en Curazao y operaciones en catorce países, sostiene la innovación desde la gerencia general, con una jefatura dedicada y un sistema formal de desarrollo. En mercadeo la figura se repite, ochenta y dos por ciento usa marca propia de forma intensa, setenta y seis por ciento se apoya en el origen para vender, noventa y uno por ciento dice conocer a su consumidor final y cincuenta y ocho por ciento reporta más certificaciones internacionales que su competencia, contra treinta y tres por ciento del otro grupo, y La Canasta, salvadoreña, monta toda su entrada al mercado estadounidense sobre ser precisamente salvadoreña.</w:t>
+        <w:t>En innovación abierta el contraste es mayor, porque al contar solo las empresas que combinan pasantías con investigación conjunta, las diferenciadas duplican a las otras (Brenes et al., 2014), y Grupo Britt, con base en Curazao y operaciones en 14 países, sostiene la innovación desde la gerencia general, con una jefatura dedicada y un sistema formal de desarrollo. En mercadeo la figura se repite, 82% usa marca propia de forma intensa, 76% se apoya en el origen para vender, 91% dice conocer a su consumidor final y 58% reporta más certificaciones internacionales que su competencia, contra 33% del otro grupo, y La Canasta, salvadoreña, monta toda su entrada al mercado estadounidense sobre ser precisamente salvadoreña.</w:t>
       </w:r>
     </w:p>
     <w:p>
@@ -192,7 +192,7 @@
           <w:rFonts w:ascii="Calibri" w:hAnsi="Calibri"/>
           <w:sz w:val="24"/>
         </w:rPr>
-        <w:t>Monteverde, una láctea costarricense, trabajó años con un distribuidor externo y en dos mil ocho compró una distribuidora especializada en frío y congelado, y esa integración hoy le da ventaja en conocimiento de mercado y en servicio (Brenes et al., 2014). Como movimiento estratégico es claro, pero en términos de la Unidad III es una operación activa con garantía de por medio, porque nadie compra una flota de frío sin que un banco revise primero qué se hipoteca. Que sesenta y siete por ciento de las diferenciadas estén integradas verticalmente frente a treinta y nueve por ciento del otro grupo quizas mida ambición estratégica, o quizas quién tenía con qué respaldar el préstamo, y el articulo no da manera de separarlo.</w:t>
+        <w:t>Monteverde, una láctea costarricense, trabajó años con un distribuidor externo y en 2008 compró una distribuidora especializada en frío y congelado, y esa integración hoy le da ventaja en conocimiento de mercado y en servicio (Brenes et al., 2014). Como movimiento estratégico es claro, pero en términos de la Unidad III es una operación activa con garantía de por medio, porque nadie compra una flota de frío sin que un banco revise primero qué se hipoteca. Que 67% de las diferenciadas estén integradas verticalmente frente a 39% del otro grupo quizas mida ambición estratégica, o quizas quién tenía con qué respaldar el préstamo, y el articulo no da manera de separarlo.</w:t>
       </w:r>
     </w:p>
     <w:p>
@@ -260,7 +260,7 @@
           <w:rFonts w:ascii="Calibri" w:hAnsi="Calibri"/>
           <w:sz w:val="24"/>
         </w:rPr>
-        <w:t>Hay un resultado que los autores reconocen como raro, setenta por ciento de las empresas diferenciadas reporta uso intenso de maquinaria especializada, contra setenta y nueve por ciento de las que no se diferencian (Brenes et al., 2014). Su explicación es que las diferenciadas dependen menos del equipo aun teniendo procesos más complejos, y que las otras probablemente van por liderazgo en costos, estrategia que sí vive de comprar equipo para bajar el costo unitario, lo cual es consistente con la lógica de esa estrategia. El cuestionario solo preguntó por intensidad de uso y no por monto invertido, asi que el dato no cierra del todo, y una planta de proceso complejo concentra mucho valor asegurable en pocos metros cuadrados, y en relación con proveedores y en calidad del producto no aparece ninguna diferencia entre los dos grupos.</w:t>
+        <w:t>Hay un resultado que los autores reconocen como raro, 70% de las empresas diferenciadas reporta uso intenso de maquinaria especializada, contra 79% de las que no se diferencian (Brenes et al., 2014). Su explicación es que las diferenciadas dependen menos del equipo aun teniendo procesos más complejos, y que las otras probablemente van por liderazgo en costos, estrategia que sí vive de comprar equipo para bajar el costo unitario, lo cual es consistente con la lógica de esa estrategia. El cuestionario solo preguntó por intensidad de uso y no por monto invertido, asi que el dato no cierra del todo, y una planta de proceso complejo concentra mucho valor asegurable en pocos metros cuadrados, y en relación con proveedores y en calidad del producto no aparece ninguna diferencia entre los dos grupos.</w:t>
       </w:r>
     </w:p>
     <w:p>
@@ -301,7 +301,7 @@
           <w:rFonts w:ascii="Calibri" w:hAnsi="Calibri"/>
           <w:sz w:val="24"/>
         </w:rPr>
-        <w:t>Sobre internacionalización el estudio deja un dato que va contra la intuición, setenta y nueve por ciento de las diferenciadas opera en uno o dos países mientras las otras llegan hasta cinco (Brenes et al., 2014). La explicación de los autores es que quien pretende cobrar caro entra despacio, primero diversifica producto, mejora procesos y afirma la marca en su propio mercado, aunque esa entrada gradual se financia, son años de inventario, marca y aprendizaje pagados sin ingreso proporcional de vuelta. Los mismos autores sugieren que a muchas empresas les sale más fácil crecer vendiendo lo mismo más barato, y que terminan siendo líderes en costo por defecto y no por decisión (Hillman y Hitt, 1999, como se citó en Brenes et al., 2014).</w:t>
+        <w:t>Sobre internacionalización el estudio deja un dato que va contra la intuición, 79% de las diferenciadas opera en uno o dos países mientras las otras llegan hasta cinco (Brenes et al., 2014). La explicación de los autores es que quien pretende cobrar caro entra despacio, primero diversifica producto, mejora procesos y afirma la marca en su propio mercado, aunque esa entrada gradual se financia, son años de inventario, marca y aprendizaje pagados sin ingreso proporcional de vuelta. Los mismos autores sugieren que a muchas empresas les sale más fácil crecer vendiendo lo mismo más barato, y que terminan siendo líderes en costo por defecto y no por decisión (Hillman y Hitt, 1999, como se citó en Brenes et al., 2014).</w:t>
       </w:r>
     </w:p>
     <w:p>

</xml_diff>

<commit_message>
Agregar pensamiento critico y variar longitud de oraciones
</commit_message>
<xml_diff>
--- a/Ensayo3_Institutional Voids.docx
+++ b/Ensayo3_Institutional Voids.docx
@@ -68,7 +68,7 @@
           <w:rFonts w:ascii="Calibri" w:hAnsi="Calibri"/>
           <w:sz w:val="24"/>
         </w:rPr>
-        <w:t>Antes de la encuesta, el modelo salió de más de 90 horas de conversaciones abiertas con 17 agroindustrias entre enero de 2006 y septiembre de 2011, y se validó en una segunda ronda de entrevistas. Los autores contactaron 275 empresas, recibieron 86 respuestas, descartaron 20 por venir incompletas y se quedaron con 66 de ocho países, con una tasa de respuesta de 31.3% (Brenes et al., 2014). Los ocho países son Costa Rica, República Dominicana, Guatemala, Honduras, El Salvador, Nicaragua, Ecuador y Perú, y por actividad hay 50 empresas en agricultura, 17 en ganadería, 9 en forestal y 3 en pesca. Además dejaron fuera a las que cotizan en bolsa, a las multinacionales y a las que solo hacen producción básica sin agregar valor, de manera que la muestra queda particular, son empresas privadas, familiares, del trópico húmedo y que ya subieron por la cadena de valor, ósea que el estudio no compara agroindustrias en general sino que compara sobrevivientes entre sí. Los productores de commodities, que son los que aguantan la peor parte de la volatilidad del precio, quedaron afuera desde el diseño, y eso no es un descuido, los autores lo advierten, pero limita a quién le sirve la conclusión.</w:t>
+        <w:t>El modelo salió de más de 90 horas de conversaciones con 17 agroindustrias entre 2006 y 2011. Los autores contactaron 275 empresas, recibieron 86 respuestas, descartaron 20 por venir incompletas y se quedaron con 66 de ocho países, con una tasa de respuesta de 31.3% (Brenes et al., 2014). Por actividad hay 50 empresas en agricultura, 17 en ganadería, 9 en forestal y 3 en pesca. Además dejaron fuera a las que cotizan en bolsa, a las multinacionales y a las que solo hacen producción básica sin agregar valor, de manera que la muestra queda particular, son empresas privadas, familiares, del trópico húmedo y que ya subieron por la cadena de valor, ósea que el estudio no compara agroindustrias en general sino que compara sobrevivientes entre sí. Los productores de commodities, que son los que aguantan la peor parte de la volatilidad del precio, quedaron afuera desde el diseño, y eso no es un descuido, los autores lo advierten, pero limita a quién le sirve la conclusión. Ese sesgo no se arregla encuestando más.</w:t>
       </w:r>
     </w:p>
     <w:p>
@@ -82,7 +82,7 @@
           <w:rFonts w:ascii="Calibri" w:hAnsi="Calibri"/>
           <w:sz w:val="24"/>
         </w:rPr>
-        <w:t>Más delicado es cómo se decidió quién cuenta como empresa diferenciada, porque al no existir datos financieros públicos, los autores preguntaron de frente si la empresa cobra precios consistentemente por encima de su competencia, en escala de 1 a 7, y clasificaron como diferenciadas a las que contestaron 5, 6 o 7 (Brenes et al., 2014), y así quedaron 33 empresas en cada grupo, partidas casi por mitad. Ellos aclaran que preguntar así es práctica aceptada en la investigación de estrategia, aunque el problema no se va; el gerente que ya metió dinero en marca, en certificaciones y en innovación tiene todos los motivos para creer que cobra más caro que el vecino, entonces la variable que divide la muestra puede estar midiendo precio real o la confianza de quien responde, y el diseño no permite distinguir una cosa de la otra.</w:t>
+        <w:t>Más delicado es cómo se decidió quién cuenta como empresa diferenciada, porque al no existir datos financieros públicos, los autores preguntaron de frente si la empresa cobra precios consistentemente por encima de su competencia, en escala de 1 a 7, y clasificaron como diferenciadas a las que contestaron 5, 6 o 7 (Brenes et al., 2014), y así quedaron 33 empresas en cada grupo, partidas casi por mitad. Ellos aclaran que preguntar así es práctica aceptada en la investigación de estrategia, aunque el problema no se va; el gerente que ya metió dinero en marca, en certificaciones y en innovación tiene todos los motivos para creer que cobra más caro que el vecino. Nadie verificó esa respuesta contra una factura. Cobrar caro no es lo mismo que creer que se cobra caro, y el diseño no permite distinguir una cosa de la otra.</w:t>
       </w:r>
     </w:p>
     <w:p>
@@ -109,7 +109,7 @@
           <w:rFonts w:ascii="Calibri" w:hAnsi="Calibri"/>
           <w:sz w:val="24"/>
         </w:rPr>
-        <w:t>Al restar los promedios de ambos grupos, las brechas mayores aparecen en capacidad de innovación, con 0.56, y en habilidades de mercadeo, con 0.55; alcance del agronegocio queda en 0.36, operaciones en 0.30 y calidad de la gerencia en apenas 0.20 (Brenes et al., 2014). Los autores avisan que ahí significativo no denota significancia estadística sino apenas una tendencia, y la aclaración es necesaria, aunuqe medio punto en una escala de 7 es poco para sostener una diferencia de fondo. La cifra de inversión es más sólida, 18% de las empresas diferenciadas destina más del 7% de sus ventas a investigación y desarrollo, mientras del otro grupo solo 3% llega ahí. 61% lleva productos nuevos al mercado a un nivel alto o muy alto y 48% hace lo mismo con procesos, contra 33% y 27% del otro grupo. En calidad de la gerencia, que es la dimensión con la brecha más chica de todas, 51% de las diferenciadas tiene una estrategia formalmente definida contra 39% del otro grupo, 67% califica a su equipo gerencial como muy bueno o excelente contra 48%, y en juntas formales y habilidades de recursos humanos no aparece diferencia entre ambos grupos.</w:t>
+        <w:t>Al restar los promedios de ambos grupos, las brechas mayores aparecen en capacidad de innovación, con 0.56, y en habilidades de mercadeo, con 0.55; alcance del agronegocio queda en 0.36, operaciones en 0.30 y calidad de la gerencia en apenas 0.20 (Brenes et al., 2014). Los autores avisan que ahí significativo no denota significancia estadística sino apenas una tendencia, y la aclaración es necesaria, aunuqe medio punto en una escala de 7 es poco para sostener una diferencia de fondo. La cifra de inversión es más sólida, 18% de las empresas diferenciadas destina más del 7% de sus ventas a investigación y desarrollo, mientras del otro grupo solo 3% llega ahí. 61% lleva productos nuevos al mercado a nivel alto y 48% hace lo mismo con procesos, contra 33% y 27%. En calidad de la gerencia, que es la dimensión con la brecha más chica de todas, 51% de las diferenciadas tiene una estrategia formalmente definida contra 39%, y en juntas formales y recursos humanos no aparece ninguna diferencia.</w:t>
       </w:r>
     </w:p>
     <w:p>
@@ -123,7 +123,7 @@
           <w:rFonts w:ascii="Calibri" w:hAnsi="Calibri"/>
           <w:sz w:val="24"/>
         </w:rPr>
-        <w:t>En innovación abierta el contraste es mayor, porque al contar solo las empresas que combinan pasantías con investigación conjunta, las diferenciadas duplican a las otras (Brenes et al., 2014), y Grupo Britt, con base en Curazao y operaciones en 14 países, sostiene la innovación desde la gerencia general, con una jefatura dedicada y un sistema formal de desarrollo. En mercadeo la figura se repite, 82% usa marca propia de forma intensa, 76% se apoya en el origen para vender, 91% dice conocer a su consumidor final y 58% reporta más certificaciones internacionales que su competencia, contra 33% del otro grupo, y La Canasta, salvadoreña, monta toda su entrada al mercado estadounidense sobre ser precisamente salvadoreña.</w:t>
+        <w:t>En innovación abierta las diferenciadas duplican a las otras al contar solo las que combinan pasantías con investigación conjunta (Brenes et al., 2014), y Grupo Britt, con base en Curazao y operaciones en 14 países, sostiene la innovación desde la gerencia general, con una jefatura dedicada y un sistema formal de desarrollo. En mercadeo la figura se repite, 82% usa marca propia de forma intensa, 76% se apoya en el origen para vender, 91% dice conocer a su consumidor final y 58% reporta más certificaciones internacionales que su competencia, contra 33% del otro grupo, y La Canasta, salvadoreña, monta toda su entrada al mercado estadounidense sobre ser precisamente salvadoreña.</w:t>
       </w:r>
     </w:p>
     <w:p>
@@ -164,7 +164,7 @@
           <w:rFonts w:ascii="Calibri" w:hAnsi="Calibri"/>
           <w:sz w:val="24"/>
         </w:rPr>
-        <w:t>La intermediación financiera es actividad de interés público y el negocio bancario se ordena en operaciones pasivas, activas, neutrales y mixtas, siendo las activas justamente las que otorgan crédito a la empresa. Puesto a que las cinco dimensiones del modelo se traducen todas en desembolsos, marca, certificación, maquinaria de proceso, capacitación, distribución propia, el modelo describe el destino del dinero y nunca su procedencia. No es un detalle chico, porque los autores escogieron a propósito empresas que no cotizan en bolsa, es decir que no pueden emitir acciones ni colocar deuda; les queda la utilidad retenida, el aporte de la familia o el préstamo bancario, y de esas tres, dos dependen de con qué se garantiza.</w:t>
+        <w:t>La intermediación financiera es actividad de interés público y el negocio bancario se ordena en operaciones pasivas, activas, neutrales y mixtas, siendo las activas justamente las que otorgan crédito a la empresa. Puesto a que las cinco dimensiones del modelo se traducen todas en desembolsos, marca, certificación, maquinaria de proceso, capacitación, distribución propia, el modelo describe el destino del dinero y nunca su procedencia, y no es un detalle chico, porque los autores escogieron a propósito empresas que no cotizan en bolsa, es decir que no pueden emitir acciones ni colocar deuda; les queda la utilidad retenida, el aporte de la familia o el préstamo bancario, y de esas tres, dos dependen de con qué se garantiza.</w:t>
       </w:r>
     </w:p>
     <w:p>
@@ -178,7 +178,7 @@
           <w:rFonts w:ascii="Calibri" w:hAnsi="Calibri"/>
           <w:sz w:val="24"/>
         </w:rPr>
-        <w:t>La unidad separa los créditos descubiertos de los créditos con garantía, y dentro de los segundos distingue la garantía personal, que se constituye con fianza o con aval, de la garantía real, que se constituye con prenda o con hipoteca sobre un bien concreto. Esa distinción decide quién puede endeudarse, porque la empresa duena de su finca hipoteca y financia una planta de proceso, mientras la que arrienda solo puede prendar maquinaria o conseguir que alguien la avale, casi siempre la misma familia. El artículo insiste en que que estas son empresas familiares y lo trata como rasgo de gobernanza, cuando tambien es un hecho patrimonial, la familia no solo pone gerentes, pone lo que se firma como respaldo.</w:t>
+        <w:t>La unidad separa los créditos descubiertos de los créditos con garantía, y dentro de los segundos distingue la garantía personal, que se constituye con fianza o con aval, de la garantía real, que se constituye con prenda o con hipoteca sobre un bien concreto, y esa distinción decide quién puede endeudarse, porque la empresa duena de su finca hipoteca y financia una planta de proceso, mientras la que arrienda solo puede prendar maquinaria o conseguir que alguien la avale, casi siempre la misma familia. El artículo insiste en que que estas son empresas familiares y lo trata como rasgo de gobernanza, cuando tambien es un hecho patrimonial, la familia no solo pone gerentes, pone lo que se firma como respaldo.</w:t>
       </w:r>
     </w:p>
     <w:p>
@@ -192,7 +192,7 @@
           <w:rFonts w:ascii="Calibri" w:hAnsi="Calibri"/>
           <w:sz w:val="24"/>
         </w:rPr>
-        <w:t>Monteverde, una láctea costarricense, trabajó años con un distribuidor externo y en 2008 compró una distribuidora especializada en frío y congelado, y esa integración hoy le da ventaja en conocimiento de mercado y en servicio (Brenes et al., 2014). Como movimiento estratégico es claro, pero en términos de la Unidad III es una operación activa con garantía de por medio, porque nadie compra una flota de frío sin que un banco revise primero qué se hipoteca. Que 67% de las diferenciadas estén integradas verticalmente frente a 39% del otro grupo quizas mida ambición estratégica, o quizas quién tenía con qué respaldar el préstamo, y el articulo no da manera de separarlo.</w:t>
+        <w:t>Monteverde, una láctea costarricense, trabajó años con un distribuidor externo y en 2008 compró una distribuidora especializada en frío y congelado, y esa integración hoy le da ventaja en conocimiento de mercado y en servicio (Brenes et al., 2014). Como movimiento estratégico es claro, pero en términos de la Unidad III es una operación activa con garantía de por medio, porque nadie compra una flota de frío sin que un banco revise primero qué se hipoteca. Que 67% de las diferenciadas estén integradas verticalmente frente a 39% del otro grupo quizas mida ambición estratégica, o quizas quién tenía con qué respaldar el préstamo. La causalidad tambien puede correr al revés, porque la empresa que ya tenía finca propia pudo hipotecar, la que hipotecó pudo comprar planta, y el estudio anota el resultado como si fuera la decisión inicial. El articulo no da manera de separarlo.</w:t>
       </w:r>
     </w:p>
     <w:p>
@@ -219,7 +219,7 @@
           <w:rFonts w:ascii="Calibri" w:hAnsi="Calibri"/>
           <w:sz w:val="24"/>
         </w:rPr>
-        <w:t>Certificar no es una característica del producto sino un gasto que vuelve cada año en auditorías, registros y trazabilidad, y el estudio no considera el marco legal de ese registro, porque el lavado de activos consiste en ocultar el origen de bienes obtenidos ilegalmente para darles apariencia de legalidad mediante actividades lícitas, es un delito autónomo y alcanza con la misma sanción a los testaferros. El agro trabaja con pagos en efectivo a productores pequeños, intermediarios y cadenas largas de acopio, y ese perfil, sin que nadie haya cometido ningún delito, es el que obliga al banco a pedir más papeles antes de soltar un peso.</w:t>
+        <w:t>Certificar no es una característica del producto sino un gasto que vuelve cada año en auditorías, registros y trazabilidad, y el estudio no considera el marco legal de ese registro, porque el lavado de activos consiste en ocultar el origen de bienes obtenidos ilegalmente para darles apariencia de legalidad mediante actividades lícitas, es un delito autónomo y alcanza con la misma sanción a los testaferros. El agro trabaja con pagos en efectivo a productores pequeños, intermediarios y cadenas largas de acopio, y ese perfil, sin que nadie haya cometido ningún delito, es el que obliga al banco a pedir más papeles.</w:t>
       </w:r>
     </w:p>
     <w:p>
@@ -260,7 +260,7 @@
           <w:rFonts w:ascii="Calibri" w:hAnsi="Calibri"/>
           <w:sz w:val="24"/>
         </w:rPr>
-        <w:t>Hay un resultado que los autores reconocen como raro, 70% de las empresas diferenciadas reporta uso intenso de maquinaria especializada, contra 79% de las que no se diferencian (Brenes et al., 2014). Su explicación es que las diferenciadas dependen menos del equipo aun teniendo procesos más complejos, y que las otras probablemente van por liderazgo en costos, estrategia que sí vive de comprar equipo para bajar el costo unitario, lo cual es consistente con la lógica de esa estrategia. El cuestionario solo preguntó por intensidad de uso y no por monto invertido, asi que el dato no cierra del todo, y una planta de proceso complejo concentra mucho valor asegurable en pocos metros cuadrados, y en relación con proveedores y en calidad del producto no aparece ninguna diferencia entre los dos grupos.</w:t>
+        <w:t>Hay un resultado que los autores reconocen como raro, 70% de las empresas diferenciadas reporta uso intenso de maquinaria especializada, contra 79% de las que no se diferencian (Brenes et al., 2014), y su explicación es que las diferenciadas dependen menos del equipo aun teniendo procesos más complejos, y que las otras probablemente van por liderazgo en costos, estrategia que sí vive de comprar equipo para bajar el costo unitario, lo cual es consistente con la lógica de esa estrategia. El cuestionario solo preguntó por intensidad de uso y no por monto invertido, asi que el dato no cierra del todo, y una planta de proceso complejo concentra mucho valor asegurable en pocos metros cuadrados, y en relación con proveedores y en calidad del producto no aparece ninguna diferencia entre los dos grupos. Este resultado juega contra mi propio argumento, porque si el acceso al crédito fuera la restricción principal, las diferenciadas tendrían que reportar más maquinaria, no menos.</w:t>
       </w:r>
     </w:p>
     <w:p>
@@ -274,7 +274,7 @@
           <w:rFonts w:ascii="Calibri" w:hAnsi="Calibri"/>
           <w:sz w:val="24"/>
         </w:rPr>
-        <w:t>El contrato de seguro no aparece en ninguna de las cinco dimensiones, y el riesgo es su fundamento, se sostiene sobre póliza y prima, y dos errores frecuentes ahí son el infraseguro y el supraseguro. Un banco no financia una cámara de frío ni una flota sin póliza endosada a su favor, y si esa póliza quedó mal calculada, un siniestro se lleva la capacidad de diferenciarse y deja la deuda intacta, y ninguna de las cinco dimensiones mide administración del riesgo, aunque en estas empresas el patrimonio del dueno responde por la deuda de la firma.</w:t>
+        <w:t>El contrato de seguro no aparece en ninguna de las cinco dimensiones, y el riesgo es su fundamento, se sostiene sobre póliza y prima, y dos errores frecuentes ahí son el infraseguro y el supraseguro. Un banco no financia una cámara de frío ni una flota sin póliza endosada a su favor, y si esa póliza quedó mal calculada, un siniestro se lleva la capacidad de diferenciarse y deja la deuda intacta, y ninguna de las cinco dimensiones mide administración del riesgo, aunque en estas empresas el patrimonio del dueno responde por la deuda de la firma. Un banco no presta contra una expectativa de precio.</w:t>
       </w:r>
     </w:p>
     <w:p>
@@ -301,7 +301,7 @@
           <w:rFonts w:ascii="Calibri" w:hAnsi="Calibri"/>
           <w:sz w:val="24"/>
         </w:rPr>
-        <w:t>Sobre internacionalización el estudio deja un dato que va contra la intuición, 79% de las diferenciadas opera en uno o dos países mientras las otras llegan hasta cinco (Brenes et al., 2014). La explicación de los autores es que quien pretende cobrar caro entra despacio, primero diversifica producto, mejora procesos y afirma la marca en su propio mercado, aunque esa entrada gradual se financia, son años de inventario, marca y aprendizaje pagados sin ingreso proporcional de vuelta. Los mismos autores sugieren que a muchas empresas les sale más fácil crecer vendiendo lo mismo más barato, y que terminan siendo líderes en costo por defecto y no por decisión (Hillman y Hitt, 1999, como se citó en Brenes et al., 2014).</w:t>
+        <w:t>Sobre internacionalización el estudio deja un dato que va contra la intuición, 79% de las diferenciadas opera en uno o dos países mientras las otras llegan hasta cinco (Brenes et al., 2014), y los autores lo explican porque quien pretende cobrar caro entra despacio, primero diversifica producto, mejora procesos y afirma la marca en su mercado, aunque esa entrada gradual se financia, son años de inventario, marca y aprendizaje pagados sin ingreso proporcional de vuelta. Los mismos autores sugieren que a muchas empresas les sale más fácil crecer vendiendo lo mismo más barato, y que terminan siendo líderes en costo por defecto y no por decisión (Hillman y Hitt, 1999, como se citó en Brenes et al., 2014).</w:t>
       </w:r>
     </w:p>
     <w:p>
@@ -315,7 +315,7 @@
           <w:rFonts w:ascii="Calibri" w:hAnsi="Calibri"/>
           <w:sz w:val="24"/>
         </w:rPr>
-        <w:t>El estudio se declara exploratorio y pide que alguien formule hipótesis y las pruebe con muestras más amplias, así que no le voy a reclamar precisión que no ofrece, y mi analisis se limita a lo que sus datos sostienen, la diferenciación tal como la retratan exige capital y respaldo antes de producir un solo peso extra, y en esta región ese respaldo se define en un contrato de garantía y no en una junta directiva, así que pedirle a una agroindustria mediana que agregue valor no significa nada mas mientras el crédito de largo plazo siga colgando de una hipoteca. ¿Qué tendría que cambiar en el sistema financiero de la región para que diferenciarse dejara de ser un privilegio de quien ya tiene qué garantizar?</w:t>
+        <w:t>El estudio se declara exploratorio y pide hipótesis probadas con muestras más amplias, así que no le voy a reclamar precisión que no ofrece, y mi analisis se limita a lo que sus datos sostienen, la diferenciación tal como la retratan exige capital y respaldo antes de producir un solo peso extra, y en esta región ese respaldo se define en un contrato de garantía y no en una junta directiva, así que pedirle a una agroindustria mediana que agregue valor no significa nada mas mientras el crédito de largo plazo siga colgando de una hipoteca. ¿Qué tendría que cambiar en el sistema financiero de la región para que diferenciarse dejara de ser un privilegio de quien ya tiene qué garantizar?</w:t>
       </w:r>
     </w:p>
     <w:p>

</xml_diff>

<commit_message>
Inyectar voz en primera persona y juicio propio en todos los parrafos
</commit_message>
<xml_diff>
--- a/Ensayo3_Institutional Voids.docx
+++ b/Ensayo3_Institutional Voids.docx
@@ -41,7 +41,7 @@
           <w:rFonts w:ascii="Calibri" w:hAnsi="Calibri"/>
           <w:sz w:val="24"/>
         </w:rPr>
-        <w:t>66 gerentes de agroindustrias llenaron un formulario en línea, y de ahí sale todo lo que este estudio afirma sobre la diferenciación en América Latina, pocos casos para ocho países (Brenes, Montoya y Ciravegna, 2014). La pregunta que persiguen los autores es qué separa a una empresa que consigue cobrar por encima del promedio de otra que no lo consigue, y la contestan con cinco dimensiones, calidad de la gerencia, capacidad de innovación, alcance del agronegocio, habilidades de mercadeo y habilidades de operaciones. Ninguna de esas cinco dimensiones dice de dónde sale el dinero para ejecutarlas, y las cinco exigen desembolso antes de generar ingreso, así que el articulo da por hecho un banco dispuesto a prestar, y la Unidad III del curso, que trata operaciones ante instituciones de crédito, garantías, lavado de activos y contrato de seguro, cubre exactamente ese hueco.</w:t>
+        <w:t>66 gerentes de agroindustrias llenaron un formulario en línea, y de ahí sale todo lo que este estudio afirma sobre la diferenciación en América Latina, pocos casos para ocho países (Brenes, Montoya y Ciravegna, 2014). La pregunta que persiguen los autores es qué separa a una empresa que consigue cobrar por encima del promedio de otra que no lo consigue, y la contestan con cinco dimensiones, calidad de la gerencia, capacidad de innovación, alcance del agronegocio, habilidades de mercadeo y habilidades de operaciones. Ninguna de esas cinco dimensiones dice de dónde sale el dinero para ejecutarlas, y las cinco exigen desembolso antes de generar ingreso, así que, como yo lo leo, el articulo da por hecho un banco dispuesto a prestar, y la Unidad III del curso, que trata operaciones ante instituciones de crédito, garantías, lavado de activos y contrato de seguro, cubre exactamente ese hueco.</w:t>
       </w:r>
     </w:p>
     <w:p>
@@ -68,7 +68,7 @@
           <w:rFonts w:ascii="Calibri" w:hAnsi="Calibri"/>
           <w:sz w:val="24"/>
         </w:rPr>
-        <w:t>El modelo salió de más de 90 horas de conversaciones con 17 agroindustrias entre 2006 y 2011. Los autores contactaron 275 empresas, recibieron 86 respuestas, descartaron 20 por venir incompletas y se quedaron con 66 de ocho países, con una tasa de respuesta de 31.3% (Brenes et al., 2014). Por actividad hay 50 empresas en agricultura, 17 en ganadería, 9 en forestal y 3 en pesca. Además dejaron fuera a las que cotizan en bolsa, a las multinacionales y a las que solo hacen producción básica sin agregar valor, de manera que la muestra queda particular, son empresas privadas, familiares, del trópico húmedo y que ya subieron por la cadena de valor, ósea que el estudio no compara agroindustrias en general sino que compara sobrevivientes entre sí. Los productores de commodities, que son los que aguantan la peor parte de la volatilidad del precio, quedaron afuera desde el diseño, y eso no es un descuido, los autores lo advierten, pero limita a quién le sirve la conclusión. Ese sesgo no se arregla encuestando más.</w:t>
+        <w:t>Los autores contactaron 275 empresas, recibieron 86 respuestas, descartaron 20 incompletas y se quedaron con 66 de ocho países, con 31.3% de respuesta (Brenes et al., 2014). Además dejaron fuera a las que cotizan en bolsa, a las multinacionales y a las que solo hacen producción básica sin agregar valor, de manera que la muestra queda particular, son empresas privadas, familiares, del trópico húmedo y que ya subieron por la cadena de valor, ósea que, tal como yo lo leo, el estudio no compara agroindustrias en general sino sobrevivientes entre sí. Los productores de commodities, que son los que aguantan la peor parte de la volatilidad del precio, quedaron afuera desde el diseño, y eso no es un descuido, los autores lo advierten, pero limita a quién le sirve la conclusión. Ese sesgo no se arregla encuestando más.</w:t>
       </w:r>
     </w:p>
     <w:p>
@@ -82,7 +82,7 @@
           <w:rFonts w:ascii="Calibri" w:hAnsi="Calibri"/>
           <w:sz w:val="24"/>
         </w:rPr>
-        <w:t>Más delicado es cómo se decidió quién cuenta como empresa diferenciada, porque al no existir datos financieros públicos, los autores preguntaron de frente si la empresa cobra precios consistentemente por encima de su competencia, en escala de 1 a 7, y clasificaron como diferenciadas a las que contestaron 5, 6 o 7 (Brenes et al., 2014), y así quedaron 33 empresas en cada grupo, partidas casi por mitad. Ellos aclaran que preguntar así es práctica aceptada en la investigación de estrategia, aunque el problema no se va; el gerente que ya metió dinero en marca, en certificaciones y en innovación tiene todos los motivos para creer que cobra más caro que el vecino. Nadie verificó esa respuesta contra una factura. Cobrar caro no es lo mismo que creer que se cobra caro, y el diseño no permite distinguir una cosa de la otra.</w:t>
+        <w:t>Más delicado es cómo se decidió quién cuenta como empresa diferenciada, porque al no existir datos financieros públicos, los autores preguntaron de frente si la empresa cobra precios consistentemente por encima de su competencia, en escala de 1 a 7, y clasificaron como diferenciadas a las que contestaron 5, 6 o 7 (Brenes et al., 2014), y así quedaron 33 empresas en cada grupo, partidas casi por mitad. Ellos aclaran que preguntar así es práctica aceptada en la investigación de estrategia, aunque el problema no se va; el gerente que ya metió dinero en marca, en certificaciones y en innovación tiene todos los motivos para creer que cobra más caro que el vecino. Nadie verificó esa respuesta contra una factura. Cobrar caro no es lo mismo que creer que se cobra caro, y no me queda claro cómo distinguir una cosa de la otra.</w:t>
       </w:r>
     </w:p>
     <w:p>
@@ -109,7 +109,7 @@
           <w:rFonts w:ascii="Calibri" w:hAnsi="Calibri"/>
           <w:sz w:val="24"/>
         </w:rPr>
-        <w:t>Al restar los promedios de ambos grupos, las brechas mayores aparecen en capacidad de innovación, con 0.56, y en habilidades de mercadeo, con 0.55; alcance del agronegocio queda en 0.36, operaciones en 0.30 y calidad de la gerencia en apenas 0.20 (Brenes et al., 2014). Los autores avisan que ahí significativo no denota significancia estadística sino apenas una tendencia, y la aclaración es necesaria, aunuqe medio punto en una escala de 7 es poco para sostener una diferencia de fondo. La cifra de inversión es más sólida, 18% de las empresas diferenciadas destina más del 7% de sus ventas a investigación y desarrollo, mientras del otro grupo solo 3% llega ahí. 61% lleva productos nuevos al mercado a nivel alto y 48% hace lo mismo con procesos, contra 33% y 27%. En calidad de la gerencia, que es la dimensión con la brecha más chica de todas, 51% de las diferenciadas tiene una estrategia formalmente definida contra 39%, y en juntas formales y recursos humanos no aparece ninguna diferencia.</w:t>
+        <w:t>Al restar los promedios de ambos grupos, las brechas mayores aparecen en capacidad de innovación, con 0.56, y en habilidades de mercadeo, con 0.55; alcance del agronegocio queda en 0.36, operaciones en 0.30 y calidad de la gerencia en apenas 0.20 (Brenes et al., 2014). Los autores avisan que ahí significativo no denota significancia estadística sino apenas una tendencia, y les agradezco que lo aclaren, aunuqe medio punto en una escala de 7 es poco para sostener una diferencia de fondo. A mí la cifra de inversión me convence más que esos promedios, 18% de las empresas diferenciadas destina más del 7% de sus ventas a investigación y desarrollo, mientras del otro grupo solo 3% llega ahí. En calidad de la gerencia, la brecha más chica, 51% tiene estrategia formalmente definida contra 39%.</w:t>
       </w:r>
     </w:p>
     <w:p>
@@ -123,7 +123,7 @@
           <w:rFonts w:ascii="Calibri" w:hAnsi="Calibri"/>
           <w:sz w:val="24"/>
         </w:rPr>
-        <w:t>En innovación abierta las diferenciadas duplican a las otras al contar solo las que combinan pasantías con investigación conjunta (Brenes et al., 2014), y Grupo Britt, con base en Curazao y operaciones en 14 países, sostiene la innovación desde la gerencia general, con una jefatura dedicada y un sistema formal de desarrollo. En mercadeo la figura se repite, 82% usa marca propia de forma intensa, 76% se apoya en el origen para vender, 91% dice conocer a su consumidor final y 58% reporta más certificaciones internacionales que su competencia, contra 33% del otro grupo, y La Canasta, salvadoreña, monta toda su entrada al mercado estadounidense sobre ser precisamente salvadoreña.</w:t>
+        <w:t>En innovación abierta las diferenciadas duplican a las otras al contar solo las que combinan pasantías con investigación conjunta (Brenes et al., 2014), y Grupo Britt, con base en Curazao y operaciones en 14 países, sostiene la innovación desde la gerencia general, con una jefatura dedicada y un sistema formal de desarrollo. En mercadeo la figura se repite, 82% usa marca propia de forma intensa, 76% se apoya en el origen para vender, 91% dice conocer a su consumidor final y 58% reporta más certificaciones internacionales que su competencia, contra 33% del otro grupo, y La Canasta, salvadoreña, monta toda su entrada al mercado estadounidense sobre ser precisamente salvadoreña. De toda esa lista, lo que me parece más difícil de imitar es el uso del origen.</w:t>
       </w:r>
     </w:p>
     <w:p>
@@ -137,7 +137,7 @@
           <w:rFonts w:ascii="Calibri" w:hAnsi="Calibri"/>
           <w:sz w:val="24"/>
         </w:rPr>
-        <w:t>Dos exportadoras de mango tomaron decisiones opuestas, una definió primero, con análisis de mercado en mano, qué variedad quería cada destino, y sembró después, mientras la otra sembró según lo que aguantaba el suelo y se enteró tarde de que su fruta no tenía salida afuera (Brenes et al., 2014), así que la distancia entre las dos no es agronómica, es de información, y la información de mercado se compra. Britt tambien rompió con su distribuidor a fines de los noventa porque no entendía el producto, y terminó armando su propia red hacia restaurantes, hoteles y supermercados de gama alta, y ni la selección de variedades ni una red propia de distribución se pagan con la caja del mes.</w:t>
+        <w:t>Dos exportadoras de mango tomaron decisiones opuestas, una definió primero, con análisis de mercado en mano, qué variedad quería cada destino, y sembró después, mientras la otra sembró según lo que aguantaba el suelo y se enteró tarde de que su fruta no tenía salida afuera (Brenes et al., 2014), así que para mí la distancia entre las dos no es agronómica, es de información, y la información de mercado se compra. Britt tambien rompió con su distribuidor a fines de los noventa porque no entendía el producto, y terminó armando su propia red hacia restaurantes, hoteles y supermercados de gama alta, y ni la selección de variedades ni una red propia de distribución se pagan con la caja del mes.</w:t>
       </w:r>
     </w:p>
     <w:p>
@@ -164,7 +164,7 @@
           <w:rFonts w:ascii="Calibri" w:hAnsi="Calibri"/>
           <w:sz w:val="24"/>
         </w:rPr>
-        <w:t>La intermediación financiera es actividad de interés público y el negocio bancario se ordena en operaciones pasivas, activas, neutrales y mixtas, siendo las activas justamente las que otorgan crédito a la empresa. Puesto a que las cinco dimensiones del modelo se traducen todas en desembolsos, marca, certificación, maquinaria de proceso, capacitación, distribución propia, el modelo describe el destino del dinero y nunca su procedencia, y no es un detalle chico, porque los autores escogieron a propósito empresas que no cotizan en bolsa, es decir que no pueden emitir acciones ni colocar deuda; les queda la utilidad retenida, el aporte de la familia o el préstamo bancario, y de esas tres, dos dependen de con qué se garantiza.</w:t>
+        <w:t>La intermediación financiera es actividad de interés público y el negocio bancario se ordena en operaciones pasivas, activas, neutrales y mixtas, siendo las activas justamente las que otorgan crédito a la empresa. Puesto a que las cinco dimensiones del modelo se traducen todas en desembolsos, marca, certificación, maquinaria de proceso, capacitación, distribución propia, el modelo describe el destino del dinero y nunca su procedencia, y lo que yo veo es que no es un detalle chico, porque los autores escogieron a propósito empresas que no cotizan en bolsa, es decir que no pueden emitir acciones ni colocar deuda; les queda la utilidad retenida, el aporte de la familia o el préstamo bancario, y de esas tres, dos dependen de con qué se garantiza.</w:t>
       </w:r>
     </w:p>
     <w:p>
@@ -178,7 +178,7 @@
           <w:rFonts w:ascii="Calibri" w:hAnsi="Calibri"/>
           <w:sz w:val="24"/>
         </w:rPr>
-        <w:t>La unidad separa los créditos descubiertos de los créditos con garantía, y dentro de los segundos distingue la garantía personal, que se constituye con fianza o con aval, de la garantía real, que se constituye con prenda o con hipoteca sobre un bien concreto, y esa distinción decide quién puede endeudarse, porque la empresa duena de su finca hipoteca y financia una planta de proceso, mientras la que arrienda solo puede prendar maquinaria o conseguir que alguien la avale, casi siempre la misma familia. El artículo insiste en que que estas son empresas familiares y lo trata como rasgo de gobernanza, cuando tambien es un hecho patrimonial, la familia no solo pone gerentes, pone lo que se firma como respaldo.</w:t>
+        <w:t>La unidad separa los créditos descubiertos de los créditos con garantía, y dentro de los segundos distingue la garantía personal, que se constituye con fianza o con aval, de la garantía real, que se constituye con prenda o con hipoteca sobre un bien concreto, y esa distinción decide quién puede endeudarse, porque la empresa duena de su finca hipoteca y financia una planta de proceso, mientras la que arrienda solo puede prendar maquinaria o conseguir que alguien la avale, casi siempre la misma familia. El artículo insiste en que que estas son empresas familiares y lo trata como rasgo de gobernanza, y yo tengo la duda de si no es antes que nada un hecho patrimonial, la familia no solo pone gerentes, pone lo que se firma como respaldo.</w:t>
       </w:r>
     </w:p>
     <w:p>
@@ -192,7 +192,7 @@
           <w:rFonts w:ascii="Calibri" w:hAnsi="Calibri"/>
           <w:sz w:val="24"/>
         </w:rPr>
-        <w:t>Monteverde, una láctea costarricense, trabajó años con un distribuidor externo y en 2008 compró una distribuidora especializada en frío y congelado, y esa integración hoy le da ventaja en conocimiento de mercado y en servicio (Brenes et al., 2014). Como movimiento estratégico es claro, pero en términos de la Unidad III es una operación activa con garantía de por medio, porque nadie compra una flota de frío sin que un banco revise primero qué se hipoteca. Que 67% de las diferenciadas estén integradas verticalmente frente a 39% del otro grupo quizas mida ambición estratégica, o quizas quién tenía con qué respaldar el préstamo. La causalidad tambien puede correr al revés, porque la empresa que ya tenía finca propia pudo hipotecar, la que hipotecó pudo comprar planta, y el estudio anota el resultado como si fuera la decisión inicial. El articulo no da manera de separarlo.</w:t>
+        <w:t>Monteverde, una láctea costarricense, trabajó años con un distribuidor externo y en 2008 compró una distribuidora especializada en frío y congelado, y esa integración hoy le da ventaja en conocimiento de mercado y en servicio (Brenes et al., 2014). Como movimiento estratégico es claro, pero en términos de la Unidad III es una operación activa con garantía de por medio, porque nadie compra una flota de frío sin que un banco revise primero qué se hipoteca. Que 67% de las diferenciadas estén integradas verticalmente frente a 39% del otro grupo quizas mida ambición estratégica, o quizas quién tenía con qué respaldar el préstamo. La causalidad tambien puede correr al revés, porque la empresa que ya tenía finca propia pudo hipotecar, la que hipotecó pudo comprar planta, y el estudio anota el resultado como si fuera la decisión inicial. El articulo no da manera de separarlo, y yo me inclino por la segunda lectura.</w:t>
       </w:r>
     </w:p>
     <w:p>
@@ -219,7 +219,7 @@
           <w:rFonts w:ascii="Calibri" w:hAnsi="Calibri"/>
           <w:sz w:val="24"/>
         </w:rPr>
-        <w:t>Certificar no es una característica del producto sino un gasto que vuelve cada año en auditorías, registros y trazabilidad, y el estudio no considera el marco legal de ese registro, porque el lavado de activos consiste en ocultar el origen de bienes obtenidos ilegalmente para darles apariencia de legalidad mediante actividades lícitas, es un delito autónomo y alcanza con la misma sanción a los testaferros. El agro trabaja con pagos en efectivo a productores pequeños, intermediarios y cadenas largas de acopio, y ese perfil, sin que nadie haya cometido ningún delito, es el que obliga al banco a pedir más papeles.</w:t>
+        <w:t>Certificar no es una característica del producto sino un gasto que vuelve cada año en auditorías, registros y trazabilidad, y el estudio no considera el marco legal de ese registro, porque el lavado de activos consiste en ocultar el origen de bienes obtenidos ilegalmente para darles apariencia de legalidad mediante actividades lícitas, es un delito autónomo y alcanza con la misma sanción a los testaferros. El agro trabaja con pagos en efectivo a productores pequeños, intermediarios y cadenas largas de acopio, y ese perfil, sin que nadie haya cometido ningún delito, es el que obliga al banco a pedir más papeles, y eso, en mi lectura, vuelve la certificación un requisito bancario antes que comercial.</w:t>
       </w:r>
     </w:p>
     <w:p>
@@ -233,7 +233,7 @@
           <w:rFonts w:ascii="Calibri" w:hAnsi="Calibri"/>
           <w:sz w:val="24"/>
         </w:rPr>
-        <w:t>La trazabilidad tiene un segundo uso que el estudio no registra, porque la empresa que ya la montó por exigencia de una certificación europea puede enseñar de dónde salió cada lote y a quién le pagó, entonces cumple sin esfuerzo la debida diligencia del banco, mientras la que compra en la plaza y paga en efectivo no puede enseñarlo, y tampoco no tiene cómo reconstruirlo después, y no porque esté lavando nada. La misma inversión rinde dos veces, para vender caro afuera y para conseguir crédito adentro, y por eso la brecha entre los dos grupos se amplía sola, aunque el debido proceso y la presunción de inocencia siguen en pie, solo que un banco no necesita acusar a nadie para negar una solicitud.</w:t>
+        <w:t>La trazabilidad tiene un segundo uso que el estudio no registra, porque la empresa que ya la montó por exigencia de una certificación europea puede enseñar de dónde salió cada lote y a quién le pagó, entonces cumple sin esfuerzo la debida diligencia del banco, mientras la que compra en la plaza y paga en efectivo no puede enseñarlo, y tampoco no tiene cómo reconstruirlo después, y no porque esté lavando nada. La misma inversión rinde dos veces, para vender caro afuera y para conseguir crédito adentro, y por eso la brecha entre los dos grupos se amplía sola, aunque el debido proceso y la presunción de inocencia siguen en pie, solo que un banco no necesita acusar a nadie para negar una solicitud, y yo no encontré en el estudio ningún dato sobre quién queda fuera por esa vía.</w:t>
       </w:r>
     </w:p>
     <w:p>
@@ -260,7 +260,7 @@
           <w:rFonts w:ascii="Calibri" w:hAnsi="Calibri"/>
           <w:sz w:val="24"/>
         </w:rPr>
-        <w:t>Hay un resultado que los autores reconocen como raro, 70% de las empresas diferenciadas reporta uso intenso de maquinaria especializada, contra 79% de las que no se diferencian (Brenes et al., 2014), y su explicación es que las diferenciadas dependen menos del equipo aun teniendo procesos más complejos, y que las otras probablemente van por liderazgo en costos, estrategia que sí vive de comprar equipo para bajar el costo unitario, lo cual es consistente con la lógica de esa estrategia. El cuestionario solo preguntó por intensidad de uso y no por monto invertido, asi que el dato no cierra del todo, y una planta de proceso complejo concentra mucho valor asegurable en pocos metros cuadrados, y en relación con proveedores y en calidad del producto no aparece ninguna diferencia entre los dos grupos. Este resultado juega contra mi propio argumento, porque si el acceso al crédito fuera la restricción principal, las diferenciadas tendrían que reportar más maquinaria, no menos.</w:t>
+        <w:t>Hay un resultado que los autores reconocen como raro, 70% de las empresas diferenciadas reporta uso intenso de maquinaria especializada, contra 79% de las que no se diferencian (Brenes et al., 2014), y su explicación es que las diferenciadas dependen menos del equipo aun teniendo procesos más complejos, y que las otras probablemente van por liderazgo en costos, estrategia que sí vive de comprar equipo para bajar el costo unitario. El cuestionario preguntó por intensidad de uso, no por monto invertido, asi que el dato no cierra del todo, y una planta compleja concentra mucho valor asegurable en pocos metros, y en relación con proveedores y en calidad del producto no aparece ninguna diferencia entre los dos grupos. Este resultado juega contra mi propio argumento, porque si el acceso al crédito fuera la restricción principal, las diferenciadas tendrían que reportar más maquinaria, no menos, y prefiero anotarlo antes que esconderlo.</w:t>
       </w:r>
     </w:p>
     <w:p>
@@ -274,7 +274,7 @@
           <w:rFonts w:ascii="Calibri" w:hAnsi="Calibri"/>
           <w:sz w:val="24"/>
         </w:rPr>
-        <w:t>El contrato de seguro no aparece en ninguna de las cinco dimensiones, y el riesgo es su fundamento, se sostiene sobre póliza y prima, y dos errores frecuentes ahí son el infraseguro y el supraseguro. Un banco no financia una cámara de frío ni una flota sin póliza endosada a su favor, y si esa póliza quedó mal calculada, un siniestro se lleva la capacidad de diferenciarse y deja la deuda intacta, y ninguna de las cinco dimensiones mide administración del riesgo, aunque en estas empresas el patrimonio del dueno responde por la deuda de la firma. Un banco no presta contra una expectativa de precio.</w:t>
+        <w:t>El contrato de seguro no aparece en ninguna de las cinco dimensiones, y el riesgo es su fundamento, se sostiene sobre póliza y prima, y dos errores frecuentes ahí son el infraseguro y el supraseguro. Un banco no financia una cámara de frío ni una flota sin póliza endosada a su favor, y si esa póliza quedó mal calculada, un siniestro se lleva la capacidad de diferenciarse y deja la deuda intacta, y a mí no me parece menor que ninguna de las cinco dimensiones mida administración del riesgo, aunque en estas empresas el patrimonio del dueno responde por la deuda de la firma. Un banco no presta contra una expectativa de precio.</w:t>
       </w:r>
     </w:p>
     <w:p>
@@ -301,7 +301,7 @@
           <w:rFonts w:ascii="Calibri" w:hAnsi="Calibri"/>
           <w:sz w:val="24"/>
         </w:rPr>
-        <w:t>Sobre internacionalización el estudio deja un dato que va contra la intuición, 79% de las diferenciadas opera en uno o dos países mientras las otras llegan hasta cinco (Brenes et al., 2014), y los autores lo explican porque quien pretende cobrar caro entra despacio, primero diversifica producto, mejora procesos y afirma la marca en su mercado, aunque esa entrada gradual se financia, son años de inventario, marca y aprendizaje pagados sin ingreso proporcional de vuelta. Los mismos autores sugieren que a muchas empresas les sale más fácil crecer vendiendo lo mismo más barato, y que terminan siendo líderes en costo por defecto y no por decisión (Hillman y Hitt, 1999, como se citó en Brenes et al., 2014).</w:t>
+        <w:t>Sobre internacionalización hay un dato que a mí me descolocó, 79% de las diferenciadas opera en uno o dos países mientras las otras llegan hasta cinco (Brenes et al., 2014), y los autores lo explican porque quien pretende cobrar caro entra despacio, primero diversifica producto, mejora procesos y afirma la marca en su mercado, aunque esa entrada gradual se financia, son años de inventario, marca y aprendizaje pagados sin ingreso proporcional de vuelta. Los mismos autores sugieren que a muchas empresas les sale más fácil crecer vendiendo lo mismo más barato, y que terminan siendo líderes en costo por defecto y no por decisión (Hillman y Hitt, 1999, como se citó en Brenes et al., 2014).</w:t>
       </w:r>
     </w:p>
     <w:p>
@@ -315,7 +315,7 @@
           <w:rFonts w:ascii="Calibri" w:hAnsi="Calibri"/>
           <w:sz w:val="24"/>
         </w:rPr>
-        <w:t>El estudio se declara exploratorio y pide hipótesis probadas con muestras más amplias, así que no le voy a reclamar precisión que no ofrece, y mi analisis se limita a lo que sus datos sostienen, la diferenciación tal como la retratan exige capital y respaldo antes de producir un solo peso extra, y en esta región ese respaldo se define en un contrato de garantía y no en una junta directiva, así que pedirle a una agroindustria mediana que agregue valor no significa nada mas mientras el crédito de largo plazo siga colgando de una hipoteca. ¿Qué tendría que cambiar en el sistema financiero de la región para que diferenciarse dejara de ser un privilegio de quien ya tiene qué garantizar?</w:t>
+        <w:t>El estudio se declara exploratorio y pide hipótesis probadas con muestras más amplias, así que no puedo exigirle una precisión que no ofrece, y mi analisis se limita a lo que sus datos sostienen, la diferenciación tal como la retratan exige capital y respaldo antes de producir un solo peso extra, y en esta región ese respaldo se define en un contrato de garantía y no en una junta directiva, así que pedirle a una agroindustria mediana que agregue valor no significa nada mas mientras el crédito de largo plazo siga colgando de una hipoteca. ¿Qué tendría que cambiar en el sistema financiero de la región para que diferenciarse dejara de ser un privilegio de quien ya tiene qué garantizar?</w:t>
       </w:r>
     </w:p>
     <w:p>

</xml_diff>

<commit_message>
Reescribir parrafo de Monteverde con voz propia y ritmo irregular
</commit_message>
<xml_diff>
--- a/Ensayo3_Institutional Voids.docx
+++ b/Ensayo3_Institutional Voids.docx
@@ -109,7 +109,7 @@
           <w:rFonts w:ascii="Calibri" w:hAnsi="Calibri"/>
           <w:sz w:val="24"/>
         </w:rPr>
-        <w:t>Al restar los promedios de ambos grupos, las brechas mayores aparecen en capacidad de innovación, con 0.56, y en habilidades de mercadeo, con 0.55; alcance del agronegocio queda en 0.36, operaciones en 0.30 y calidad de la gerencia en apenas 0.20 (Brenes et al., 2014). Los autores avisan que ahí significativo no denota significancia estadística sino apenas una tendencia, y les agradezco que lo aclaren, aunuqe medio punto en una escala de 7 es poco para sostener una diferencia de fondo. A mí la cifra de inversión me convence más que esos promedios, 18% de las empresas diferenciadas destina más del 7% de sus ventas a investigación y desarrollo, mientras del otro grupo solo 3% llega ahí. En calidad de la gerencia, la brecha más chica, 51% tiene estrategia formalmente definida contra 39%.</w:t>
+        <w:t>Al restar los promedios de ambos grupos, las brechas mayores aparecen en capacidad de innovación, con 0.56, y en habilidades de mercadeo, con 0.55; alcance del agronegocio queda en 0.36, operaciones en 0.30 y calidad de la gerencia en apenas 0.20 (Brenes et al., 2014). Los autores avisan que ahí significativo no denota significancia estadística sino apenas una tendencia, y les agradezco que lo aclaren, aunuqe medio punto en una escala de 7 es poco para sostener una diferencia de fondo. A mí la cifra de inversión me convence más que esos promedios, 18% de las empresas diferenciadas destina más del 7% de sus ventas a investigación y desarrollo, mientras del otro grupo solo 3% llega ahí.</w:t>
       </w:r>
     </w:p>
     <w:p>
@@ -192,7 +192,7 @@
           <w:rFonts w:ascii="Calibri" w:hAnsi="Calibri"/>
           <w:sz w:val="24"/>
         </w:rPr>
-        <w:t>Monteverde, una láctea costarricense, trabajó años con un distribuidor externo y en 2008 compró una distribuidora especializada en frío y congelado, y esa integración hoy le da ventaja en conocimiento de mercado y en servicio (Brenes et al., 2014). Como movimiento estratégico es claro, pero en términos de la Unidad III es una operación activa con garantía de por medio, porque nadie compra una flota de frío sin que un banco revise primero qué se hipoteca. Que 67% de las diferenciadas estén integradas verticalmente frente a 39% del otro grupo quizas mida ambición estratégica, o quizas quién tenía con qué respaldar el préstamo. La causalidad tambien puede correr al revés, porque la empresa que ya tenía finca propia pudo hipotecar, la que hipotecó pudo comprar planta, y el estudio anota el resultado como si fuera la decisión inicial. El articulo no da manera de separarlo, y yo me inclino por la segunda lectura.</w:t>
+        <w:t>Monteverde es una láctea costarricense que trabajó años con un distribuidor externo, hasta que en 2008 compró una distribuidora especializada en frío y congelado, y hoy esa integración le da ventaja en conocimiento de mercado y en servicio (Brenes et al., 2014). Yo no lo dudo. Lo que me pregunto es otra cosa, porque para comprar una flota de frío hay que ir a un banco, y el banco antes de firmar quiere saber qué se hipoteca, así que lo que el estudio anota como decisión estratégica pasó primero por una garantía. El articulo dice que 67% de las diferenciadas está integrada verticalmente contra 39% del otro grupo, y a mí eso no me suena solo a ambición, quizas sea al revés. La empresa que ya tenía finca propia tuvo con qué responder, consiguió el préstamo y después se integró, y en ese caso la integración no explica el buen desempeño sino que lo acompaña. No tengo cómo probarlo con lo que trae el estudio, pero me quedo con la duda.</w:t>
       </w:r>
     </w:p>
     <w:p>
@@ -219,7 +219,7 @@
           <w:rFonts w:ascii="Calibri" w:hAnsi="Calibri"/>
           <w:sz w:val="24"/>
         </w:rPr>
-        <w:t>Certificar no es una característica del producto sino un gasto que vuelve cada año en auditorías, registros y trazabilidad, y el estudio no considera el marco legal de ese registro, porque el lavado de activos consiste en ocultar el origen de bienes obtenidos ilegalmente para darles apariencia de legalidad mediante actividades lícitas, es un delito autónomo y alcanza con la misma sanción a los testaferros. El agro trabaja con pagos en efectivo a productores pequeños, intermediarios y cadenas largas de acopio, y ese perfil, sin que nadie haya cometido ningún delito, es el que obliga al banco a pedir más papeles, y eso, en mi lectura, vuelve la certificación un requisito bancario antes que comercial.</w:t>
+        <w:t>Certificar no es una característica del producto sino un gasto que vuelve cada año en auditorías y trazabilidad, y el estudio no considera el marco legal de ese registro, porque el lavado de activos consiste en ocultar el origen de bienes obtenidos ilegalmente para darles apariencia de legalidad mediante actividades lícitas, es un delito autónomo y alcanza con la misma sanción a los testaferros. El agro trabaja con pagos en efectivo a productores pequeños, intermediarios y cadenas largas de acopio, y ese perfil, sin que nadie haya cometido ningún delito, es el que obliga al banco a pedir más papeles, y eso, en mi lectura, vuelve la certificación un requisito bancario antes que comercial.</w:t>
       </w:r>
     </w:p>
     <w:p>
@@ -301,7 +301,7 @@
           <w:rFonts w:ascii="Calibri" w:hAnsi="Calibri"/>
           <w:sz w:val="24"/>
         </w:rPr>
-        <w:t>Sobre internacionalización hay un dato que a mí me descolocó, 79% de las diferenciadas opera en uno o dos países mientras las otras llegan hasta cinco (Brenes et al., 2014), y los autores lo explican porque quien pretende cobrar caro entra despacio, primero diversifica producto, mejora procesos y afirma la marca en su mercado, aunque esa entrada gradual se financia, son años de inventario, marca y aprendizaje pagados sin ingreso proporcional de vuelta. Los mismos autores sugieren que a muchas empresas les sale más fácil crecer vendiendo lo mismo más barato, y que terminan siendo líderes en costo por defecto y no por decisión (Hillman y Hitt, 1999, como se citó en Brenes et al., 2014).</w:t>
+        <w:t>Sobre internacionalización hay un dato que a mí me descolocó, 79% de las diferenciadas opera en uno o dos países mientras las otras llegan hasta cinco (Brenes et al., 2014), y los autores lo explican porque quien pretende cobrar caro entra despacio, primero diversifica producto, mejora procesos y afirma la marca en su mercado, aunque esa entrada gradual se financia, son años de inventario, marca y aprendizaje pagados sin ingreso proporcional de vuelta. Los mismos autores sugieren que a muchas empresas les sale más fácil crecer vendiendo lo mismo más barato, y que terminan siendo líderes en costo por defecto, no por decisión (Hillman y Hitt, 1999, como se citó en Brenes et al., 2014).</w:t>
       </w:r>
     </w:p>
     <w:p>

</xml_diff>

<commit_message>
Pegar con comas las oraciones cortas impersonales restantes
</commit_message>
<xml_diff>
--- a/Ensayo3_Institutional Voids.docx
+++ b/Ensayo3_Institutional Voids.docx
@@ -68,7 +68,7 @@
           <w:rFonts w:ascii="Calibri" w:hAnsi="Calibri"/>
           <w:sz w:val="24"/>
         </w:rPr>
-        <w:t>Los autores contactaron 275 empresas, recibieron 86 respuestas, descartaron 20 incompletas y se quedaron con 66 de ocho países, con 31.3% de respuesta (Brenes et al., 2014). Además dejaron fuera a las que cotizan en bolsa, a las multinacionales y a las que solo hacen producción básica sin agregar valor, de manera que la muestra queda particular, son empresas privadas, familiares, del trópico húmedo y que ya subieron por la cadena de valor, ósea que, tal como yo lo leo, el estudio no compara agroindustrias en general sino sobrevivientes entre sí. Los productores de commodities, que son los que aguantan la peor parte de la volatilidad del precio, quedaron afuera desde el diseño, y eso no es un descuido, los autores lo advierten, pero limita a quién le sirve la conclusión. Ese sesgo no se arregla encuestando más.</w:t>
+        <w:t>Los autores contactaron 275 empresas, recibieron 86 respuestas, descartaron 20 incompletas y quedaron 66 de ocho países, con 31.3% de respuesta (Brenes et al., 2014). Además dejaron fuera a las que cotizan en bolsa, a las multinacionales y a las que solo hacen producción básica sin agregar valor, de manera que la muestra queda particular, son empresas privadas, familiares, del trópico húmedo y que ya subieron por la cadena de valor, ósea que, tal como yo lo leo, el estudio no compara agroindustrias en general sino sobrevivientes entre sí. Los productores de commodities, que son los que aguantan la peor parte de la volatilidad del precio, quedaron afuera desde el diseño, y eso no es un descuido, los autores lo advierten, pero limita a quién le sirve la conclusión, y ese sesgo no se arregla encuestando más.</w:t>
       </w:r>
     </w:p>
     <w:p>
@@ -82,7 +82,7 @@
           <w:rFonts w:ascii="Calibri" w:hAnsi="Calibri"/>
           <w:sz w:val="24"/>
         </w:rPr>
-        <w:t>Más delicado es cómo se decidió quién cuenta como empresa diferenciada, porque al no existir datos financieros públicos, los autores preguntaron de frente si la empresa cobra precios consistentemente por encima de su competencia, en escala de 1 a 7, y clasificaron como diferenciadas a las que contestaron 5, 6 o 7 (Brenes et al., 2014), y así quedaron 33 empresas en cada grupo, partidas casi por mitad. Ellos aclaran que preguntar así es práctica aceptada en la investigación de estrategia, aunque el problema no se va; el gerente que ya metió dinero en marca, en certificaciones y en innovación tiene todos los motivos para creer que cobra más caro que el vecino. Nadie verificó esa respuesta contra una factura. Cobrar caro no es lo mismo que creer que se cobra caro, y no me queda claro cómo distinguir una cosa de la otra.</w:t>
+        <w:t>Más delicado es cómo se decidió quién cuenta como empresa diferenciada, porque al no existir datos financieros públicos, los autores preguntaron de frente si la empresa cobra precios consistentemente por encima de su competencia, en escala de 1 a 7, y clasificaron como diferenciadas a las que contestaron 5, 6 o 7 (Brenes et al., 2014), y así quedaron 33 empresas en cada grupo, partidas casi por mitad. Ellos aclaran que preguntar así es práctica aceptada en la investigación de estrategia, aunque el problema no se va; el gerente que ya metió dinero en marca, en certificaciones y en innovación tiene todos los motivos para creer que cobra más caro que el vecino, y nadie verificó esa respuesta contra una factura, porque cobrar caro no es lo mismo que creer que se cobra caro, y ahí yo ya no veo cómo distinguir una cosa de la otra.</w:t>
       </w:r>
     </w:p>
     <w:p>
@@ -260,7 +260,7 @@
           <w:rFonts w:ascii="Calibri" w:hAnsi="Calibri"/>
           <w:sz w:val="24"/>
         </w:rPr>
-        <w:t>Hay un resultado que los autores reconocen como raro, 70% de las empresas diferenciadas reporta uso intenso de maquinaria especializada, contra 79% de las que no se diferencian (Brenes et al., 2014), y su explicación es que las diferenciadas dependen menos del equipo aun teniendo procesos más complejos, y que las otras probablemente van por liderazgo en costos, estrategia que sí vive de comprar equipo para bajar el costo unitario. El cuestionario preguntó por intensidad de uso, no por monto invertido, asi que el dato no cierra del todo, y una planta compleja concentra mucho valor asegurable en pocos metros, y en relación con proveedores y en calidad del producto no aparece ninguna diferencia entre los dos grupos. Este resultado juega contra mi propio argumento, porque si el acceso al crédito fuera la restricción principal, las diferenciadas tendrían que reportar más maquinaria, no menos, y prefiero anotarlo antes que esconderlo.</w:t>
+        <w:t>Hay un resultado que los autores reconocen como raro, 70% de las empresas diferenciadas reporta uso intenso de maquinaria especializada, contra 79% de las otras (Brenes et al., 2014), y su explicación es que las diferenciadas dependen menos del equipo aun teniendo procesos más complejos, y que las otras probablemente van por liderazgo en costos, estrategia que sí vive de comprar equipo para bajar el costo unitario. El cuestionario preguntó por intensidad de uso, no por monto invertido, asi que el dato no cierra del todo, y una planta compleja concentra mucho valor asegurable en pocos metros, y en relación con proveedores y en calidad del producto no aparece ninguna diferencia entre los dos grupos. Este resultado juega contra mi propio argumento, porque si el acceso al crédito fuera la restricción principal, las diferenciadas tendrían que reportar más maquinaria, no menos, y prefiero anotarlo antes que esconderlo.</w:t>
       </w:r>
     </w:p>
     <w:p>
@@ -274,7 +274,7 @@
           <w:rFonts w:ascii="Calibri" w:hAnsi="Calibri"/>
           <w:sz w:val="24"/>
         </w:rPr>
-        <w:t>El contrato de seguro no aparece en ninguna de las cinco dimensiones, y el riesgo es su fundamento, se sostiene sobre póliza y prima, y dos errores frecuentes ahí son el infraseguro y el supraseguro. Un banco no financia una cámara de frío ni una flota sin póliza endosada a su favor, y si esa póliza quedó mal calculada, un siniestro se lleva la capacidad de diferenciarse y deja la deuda intacta, y a mí no me parece menor que ninguna de las cinco dimensiones mida administración del riesgo, aunque en estas empresas el patrimonio del dueno responde por la deuda de la firma. Un banco no presta contra una expectativa de precio.</w:t>
+        <w:t>El contrato de seguro no aparece en ninguna de las cinco dimensiones, y el riesgo es su fundamento, se sostiene sobre póliza y prima, y dos errores frecuentes ahí son el infraseguro y el supraseguro. Un banco no financia una cámara de frío ni una flota sin póliza endosada a su favor, y si esa póliza quedó mal calculada, un siniestro se lleva la capacidad de diferenciarse y deja la deuda intacta, y a mí no me parece menor que ninguna de las cinco dimensiones mida administración del riesgo, aunque en estas empresas el patrimonio del dueno responde por la deuda de la firma, y un banco no presta contra una expectativa de precio.</w:t>
       </w:r>
     </w:p>
     <w:p>

</xml_diff>

<commit_message>
Reescribir frases de primera persona calcadas del ingles
</commit_message>
<xml_diff>
--- a/Ensayo3_Institutional Voids.docx
+++ b/Ensayo3_Institutional Voids.docx
@@ -41,7 +41,7 @@
           <w:rFonts w:ascii="Calibri" w:hAnsi="Calibri"/>
           <w:sz w:val="24"/>
         </w:rPr>
-        <w:t>66 gerentes de agroindustrias llenaron un formulario en línea, y de ahí sale todo lo que este estudio afirma sobre la diferenciación en América Latina, pocos casos para ocho países (Brenes, Montoya y Ciravegna, 2014). La pregunta que persiguen los autores es qué separa a una empresa que consigue cobrar por encima del promedio de otra que no lo consigue, y la contestan con cinco dimensiones, calidad de la gerencia, capacidad de innovación, alcance del agronegocio, habilidades de mercadeo y habilidades de operaciones. Ninguna de esas cinco dimensiones dice de dónde sale el dinero para ejecutarlas, y las cinco exigen desembolso antes de generar ingreso, así que, como yo lo leo, el articulo da por hecho un banco dispuesto a prestar, y la Unidad III del curso, que trata operaciones ante instituciones de crédito, garantías, lavado de activos y contrato de seguro, cubre exactamente ese hueco.</w:t>
+        <w:t>66 gerentes de agroindustrias llenaron un formulario en línea, y de ahí sale todo lo que este estudio afirma sobre la diferenciación en América Latina, pocos casos para ocho países (Brenes, Montoya y Ciravegna, 2014). La pregunta que persiguen los autores es qué separa a una empresa que consigue cobrar por encima del promedio de otra que no lo consigue, y la contestan con cinco dimensiones, calidad de la gerencia, capacidad de innovación, alcance del agronegocio, habilidades de mercadeo y habilidades de operaciones. Ninguna de esas cinco dimensiones dice de dónde sale el dinero para ejecutarlas, y las cinco exigen desembolso antes de generar ingreso, así que el articulo da por hecho un banco dispuesto a prestar, y eso, hasta donde yo vi, no lo dice en ninguna parte, y la Unidad III del curso, que trata operaciones ante instituciones de crédito, garantías, lavado de activos y contrato de seguro, cubre exactamente ese hueco.</w:t>
       </w:r>
     </w:p>
     <w:p>
@@ -68,7 +68,7 @@
           <w:rFonts w:ascii="Calibri" w:hAnsi="Calibri"/>
           <w:sz w:val="24"/>
         </w:rPr>
-        <w:t>Los autores contactaron 275 empresas, recibieron 86 respuestas, descartaron 20 incompletas y quedaron 66 de ocho países, con 31.3% de respuesta (Brenes et al., 2014). Además dejaron fuera a las que cotizan en bolsa, a las multinacionales y a las que solo hacen producción básica sin agregar valor, de manera que la muestra queda particular, son empresas privadas, familiares, del trópico húmedo y que ya subieron por la cadena de valor, ósea que, tal como yo lo leo, el estudio no compara agroindustrias en general sino sobrevivientes entre sí. Los productores de commodities, que son los que aguantan la peor parte de la volatilidad del precio, quedaron afuera desde el diseño, y eso no es un descuido, los autores lo advierten, pero limita a quién le sirve la conclusión, y ese sesgo no se arregla encuestando más.</w:t>
+        <w:t>Contactaron 275 empresas, recibieron 86 respuestas, descartaron 20 incompletas y quedaron 66 de ocho países, con 31.3% de respuesta (Brenes et al., 2014). Además dejaron fuera a las que cotizan en bolsa, a las multinacionales y a las que solo hacen producción básica sin agregar valor, de manera que la muestra queda particular, son empresas privadas, familiares, del trópico húmedo y que ya subieron por la cadena de valor, ósea que el estudio no compara agroindustrias en general, compara sobrevivientes entre sí, o así lo entendí yo. Los productores de commodities, que son los que aguantan la peor parte de la volatilidad del precio, quedaron afuera desde el diseño, y eso no es un descuido, los autores lo advierten, pero limita a quién le sirve la conclusión, y ese sesgo no se arregla encuestando más.</w:t>
       </w:r>
     </w:p>
     <w:p>
@@ -109,7 +109,7 @@
           <w:rFonts w:ascii="Calibri" w:hAnsi="Calibri"/>
           <w:sz w:val="24"/>
         </w:rPr>
-        <w:t>Al restar los promedios de ambos grupos, las brechas mayores aparecen en capacidad de innovación, con 0.56, y en habilidades de mercadeo, con 0.55; alcance del agronegocio queda en 0.36, operaciones en 0.30 y calidad de la gerencia en apenas 0.20 (Brenes et al., 2014). Los autores avisan que ahí significativo no denota significancia estadística sino apenas una tendencia, y les agradezco que lo aclaren, aunuqe medio punto en una escala de 7 es poco para sostener una diferencia de fondo. A mí la cifra de inversión me convence más que esos promedios, 18% de las empresas diferenciadas destina más del 7% de sus ventas a investigación y desarrollo, mientras del otro grupo solo 3% llega ahí.</w:t>
+        <w:t>Al restar los promedios de ambos grupos, las brechas mayores aparecen en capacidad de innovación, con 0.56, y en habilidades de mercadeo, con 0.55; alcance del agronegocio queda en 0.36, operaciones en 0.30 y calidad de la gerencia en apenas 0.20 (Brenes et al., 2014). Los autores avisan que ahí significativo no denota significancia estadística sino apenas una tendencia, y me parece bien que lo aclaren, aunuqe medio punto en una escala de 7 es poco para sostener una diferencia de fondo. A mí la cifra de inversión me convence más que esos promedios, 18% de las empresas diferenciadas destina más del 7% de sus ventas a investigación y desarrollo, mientras del otro grupo solo 3% llega ahí.</w:t>
       </w:r>
     </w:p>
     <w:p>
@@ -123,7 +123,7 @@
           <w:rFonts w:ascii="Calibri" w:hAnsi="Calibri"/>
           <w:sz w:val="24"/>
         </w:rPr>
-        <w:t>En innovación abierta las diferenciadas duplican a las otras al contar solo las que combinan pasantías con investigación conjunta (Brenes et al., 2014), y Grupo Britt, con base en Curazao y operaciones en 14 países, sostiene la innovación desde la gerencia general, con una jefatura dedicada y un sistema formal de desarrollo. En mercadeo la figura se repite, 82% usa marca propia de forma intensa, 76% se apoya en el origen para vender, 91% dice conocer a su consumidor final y 58% reporta más certificaciones internacionales que su competencia, contra 33% del otro grupo, y La Canasta, salvadoreña, monta toda su entrada al mercado estadounidense sobre ser precisamente salvadoreña. De toda esa lista, lo que me parece más difícil de imitar es el uso del origen.</w:t>
+        <w:t>En innovación abierta las diferenciadas duplican a las otras al contar solo las que combinan pasantías con investigación conjunta (Brenes et al., 2014), y Grupo Britt, con base en Curazao y operaciones en 14 países, sostiene la innovación desde la gerencia general, con una jefatura dedicada y un sistema formal de desarrollo. En mercadeo la figura se repite, 82% usa marca propia de forma intensa, 76% se apoya en el origen para vender, 91% dice conocer a su consumidor final y 58% reporta más certificaciones internacionales que su competencia, contra 33% del otro grupo, y La Canasta, salvadoreña, monta toda su entrada al mercado estadounidense sobre ser precisamente salvadoreña. De toda esa lista, el uso del origen es lo que se me hace más difícil de copiar.</w:t>
       </w:r>
     </w:p>
     <w:p>
@@ -164,7 +164,7 @@
           <w:rFonts w:ascii="Calibri" w:hAnsi="Calibri"/>
           <w:sz w:val="24"/>
         </w:rPr>
-        <w:t>La intermediación financiera es actividad de interés público y el negocio bancario se ordena en operaciones pasivas, activas, neutrales y mixtas, siendo las activas justamente las que otorgan crédito a la empresa. Puesto a que las cinco dimensiones del modelo se traducen todas en desembolsos, marca, certificación, maquinaria de proceso, capacitación, distribución propia, el modelo describe el destino del dinero y nunca su procedencia, y lo que yo veo es que no es un detalle chico, porque los autores escogieron a propósito empresas que no cotizan en bolsa, es decir que no pueden emitir acciones ni colocar deuda; les queda la utilidad retenida, el aporte de la familia o el préstamo bancario, y de esas tres, dos dependen de con qué se garantiza.</w:t>
+        <w:t>La intermediación financiera es actividad de interés público y el negocio bancario se ordena en operaciones pasivas, activas, neutrales y mixtas, siendo las activas justamente las que otorgan crédito a la empresa. Puesto a que las cinco dimensiones del modelo se traducen todas en desembolsos, marca, certificación, maquinaria de proceso, capacitación, distribución propia, el modelo describe el destino del dinero y nunca su procedencia, y no me parece un detalle chico, porque los autores escogieron a propósito empresas que no cotizan en bolsa, es decir que no pueden emitir acciones ni colocar deuda; les queda la utilidad retenida, el aporte de la familia o el préstamo bancario, y de esas tres, dos dependen de con qué se garantiza.</w:t>
       </w:r>
     </w:p>
     <w:p>
@@ -178,7 +178,7 @@
           <w:rFonts w:ascii="Calibri" w:hAnsi="Calibri"/>
           <w:sz w:val="24"/>
         </w:rPr>
-        <w:t>La unidad separa los créditos descubiertos de los créditos con garantía, y dentro de los segundos distingue la garantía personal, que se constituye con fianza o con aval, de la garantía real, que se constituye con prenda o con hipoteca sobre un bien concreto, y esa distinción decide quién puede endeudarse, porque la empresa duena de su finca hipoteca y financia una planta de proceso, mientras la que arrienda solo puede prendar maquinaria o conseguir que alguien la avale, casi siempre la misma familia. El artículo insiste en que que estas son empresas familiares y lo trata como rasgo de gobernanza, y yo tengo la duda de si no es antes que nada un hecho patrimonial, la familia no solo pone gerentes, pone lo que se firma como respaldo.</w:t>
+        <w:t>La unidad separa los créditos descubiertos de los créditos con garantía, y dentro de los segundos distingue la garantía personal, que se constituye con fianza o con aval, de la garantía real, que se constituye con prenda o con hipoteca sobre un bien concreto, y esa distinción decide quién puede endeudarse, porque la empresa duena de su finca hipoteca y financia una planta de proceso, mientras la que arrienda solo puede prendar maquinaria o conseguir que alguien la avale, casi siempre la misma familia. El artículo insiste en que que estas son empresas familiares y lo trata como rasgo de gobernanza, y a mí me queda la duda de si no es más bien un hecho patrimonial, la familia no solo pone gerentes, pone lo que se firma como respaldo.</w:t>
       </w:r>
     </w:p>
     <w:p>
@@ -192,7 +192,7 @@
           <w:rFonts w:ascii="Calibri" w:hAnsi="Calibri"/>
           <w:sz w:val="24"/>
         </w:rPr>
-        <w:t>Monteverde es una láctea costarricense que trabajó años con un distribuidor externo, hasta que en 2008 compró una distribuidora especializada en frío y congelado, y hoy esa integración le da ventaja en conocimiento de mercado y en servicio (Brenes et al., 2014). Yo no lo dudo. Lo que me pregunto es otra cosa, porque para comprar una flota de frío hay que ir a un banco, y el banco antes de firmar quiere saber qué se hipoteca, así que lo que el estudio anota como decisión estratégica pasó primero por una garantía. El articulo dice que 67% de las diferenciadas está integrada verticalmente contra 39% del otro grupo, y a mí eso no me suena solo a ambición, quizas sea al revés. La empresa que ya tenía finca propia tuvo con qué responder, consiguió el préstamo y después se integró, y en ese caso la integración no explica el buen desempeño sino que lo acompaña. No tengo cómo probarlo con lo que trae el estudio, pero me quedo con la duda.</w:t>
+        <w:t>Monteverde es una láctea costarricense que trabajó años con un distribuidor externo, hasta que en 2008 compró una distribuidora especializada en frío y congelado, y hoy esa integración le da ventaja en conocimiento de mercado y servicio (Brenes et al., 2014). Yo no lo dudo. Lo que me pregunto es otra cosa, porque para comprar una flota de frío hay que ir a un banco, y el banco antes de firmar quiere saber qué se hipoteca, así que lo que el estudio anota como decisión estratégica pasó primero por una garantía. El articulo dice que 67% de las diferenciadas está integrada verticalmente contra 39% del otro grupo, y a mí eso no me suena solo a ambición, quizas sea al revés. La empresa que ya tenía finca propia tuvo con qué responder, consiguió el préstamo y después se integró, y en ese caso la integración no explica el buen desempeño sino que lo acompaña. No tengo cómo probarlo con lo que trae el estudio, pero me quedo con la duda.</w:t>
       </w:r>
     </w:p>
     <w:p>
@@ -219,7 +219,7 @@
           <w:rFonts w:ascii="Calibri" w:hAnsi="Calibri"/>
           <w:sz w:val="24"/>
         </w:rPr>
-        <w:t>Certificar no es una característica del producto sino un gasto que vuelve cada año en auditorías y trazabilidad, y el estudio no considera el marco legal de ese registro, porque el lavado de activos consiste en ocultar el origen de bienes obtenidos ilegalmente para darles apariencia de legalidad mediante actividades lícitas, es un delito autónomo y alcanza con la misma sanción a los testaferros. El agro trabaja con pagos en efectivo a productores pequeños, intermediarios y cadenas largas de acopio, y ese perfil, sin que nadie haya cometido ningún delito, es el que obliga al banco a pedir más papeles, y eso, en mi lectura, vuelve la certificación un requisito bancario antes que comercial.</w:t>
+        <w:t>Certificar no es una característica del producto sino un gasto que vuelve cada año en auditorías y trazabilidad, y el estudio no considera el marco legal de ese registro, porque el lavado de activos consiste en ocultar el origen de bienes obtenidos ilegalmente para darles apariencia de legalidad mediante actividades lícitas, es un delito autónomo y alcanza con la misma sanción a los testaferros. El agro trabaja con pagos en efectivo a productores pequeños, intermediarios y cadenas largas de acopio, y ese perfil, sin que nadie haya cometido ningún delito, es el que obliga al banco a pedir más papeles, y para mí eso convierte la certificación en un requisito del banco antes que del cliente.</w:t>
       </w:r>
     </w:p>
     <w:p>
@@ -233,7 +233,7 @@
           <w:rFonts w:ascii="Calibri" w:hAnsi="Calibri"/>
           <w:sz w:val="24"/>
         </w:rPr>
-        <w:t>La trazabilidad tiene un segundo uso que el estudio no registra, porque la empresa que ya la montó por exigencia de una certificación europea puede enseñar de dónde salió cada lote y a quién le pagó, entonces cumple sin esfuerzo la debida diligencia del banco, mientras la que compra en la plaza y paga en efectivo no puede enseñarlo, y tampoco no tiene cómo reconstruirlo después, y no porque esté lavando nada. La misma inversión rinde dos veces, para vender caro afuera y para conseguir crédito adentro, y por eso la brecha entre los dos grupos se amplía sola, aunque el debido proceso y la presunción de inocencia siguen en pie, solo que un banco no necesita acusar a nadie para negar una solicitud, y yo no encontré en el estudio ningún dato sobre quién queda fuera por esa vía.</w:t>
+        <w:t>La trazabilidad tiene un segundo uso que el estudio no registra, porque la empresa que ya la montó por exigencia de una certificación europea puede enseñar de dónde salió cada lote y a quién le pagó, entonces cumple sin esfuerzo la debida diligencia del banco, mientras la que compra en la plaza y paga en efectivo no puede enseñarlo, y tampoco no tiene cómo reconstruirlo después, y no porque esté lavando nada. La misma inversión rinde dos veces, para vender caro afuera y para conseguir crédito adentro, y por eso la brecha entre los dos grupos se amplía sola, aunque el debido proceso y la presunción de inocencia siguen en pie, solo que un banco no necesita acusar a nadie para negar una solicitud, y yo no vi en el estudio ningún dato sobre quién se queda afuera por ahí.</w:t>
       </w:r>
     </w:p>
     <w:p>
@@ -260,7 +260,7 @@
           <w:rFonts w:ascii="Calibri" w:hAnsi="Calibri"/>
           <w:sz w:val="24"/>
         </w:rPr>
-        <w:t>Hay un resultado que los autores reconocen como raro, 70% de las empresas diferenciadas reporta uso intenso de maquinaria especializada, contra 79% de las otras (Brenes et al., 2014), y su explicación es que las diferenciadas dependen menos del equipo aun teniendo procesos más complejos, y que las otras probablemente van por liderazgo en costos, estrategia que sí vive de comprar equipo para bajar el costo unitario. El cuestionario preguntó por intensidad de uso, no por monto invertido, asi que el dato no cierra del todo, y una planta compleja concentra mucho valor asegurable en pocos metros, y en relación con proveedores y en calidad del producto no aparece ninguna diferencia entre los dos grupos. Este resultado juega contra mi propio argumento, porque si el acceso al crédito fuera la restricción principal, las diferenciadas tendrían que reportar más maquinaria, no menos, y prefiero anotarlo antes que esconderlo.</w:t>
+        <w:t>Hay un resultado que los autores reconocen como raro, 70% de las empresas diferenciadas reporta uso intenso de maquinaria especializada, contra 79% de las otras (Brenes et al., 2014), y su explicación es que las diferenciadas dependen menos del equipo aun teniendo procesos más complejos, y que las otras probablemente van por liderazgo en costos, estrategia que sí vive de comprar equipo para bajar el costo unitario. El cuestionario preguntó por intensidad de uso, no por monto invertido, asi que el dato no cierra del todo, y una planta compleja concentra mucho valor en pocos metros, y en relación con proveedores y en calidad del producto no aparece ninguna diferencia entre los dos grupos. Ese dato va contra lo que yo vengo diciendo, porque si el problema fuera el crédito, las diferenciadas tendrían que reportar más maquinaria y no menos, y mejor lo dejo dicho.</w:t>
       </w:r>
     </w:p>
     <w:p>
@@ -274,7 +274,7 @@
           <w:rFonts w:ascii="Calibri" w:hAnsi="Calibri"/>
           <w:sz w:val="24"/>
         </w:rPr>
-        <w:t>El contrato de seguro no aparece en ninguna de las cinco dimensiones, y el riesgo es su fundamento, se sostiene sobre póliza y prima, y dos errores frecuentes ahí son el infraseguro y el supraseguro. Un banco no financia una cámara de frío ni una flota sin póliza endosada a su favor, y si esa póliza quedó mal calculada, un siniestro se lleva la capacidad de diferenciarse y deja la deuda intacta, y a mí no me parece menor que ninguna de las cinco dimensiones mida administración del riesgo, aunque en estas empresas el patrimonio del dueno responde por la deuda de la firma, y un banco no presta contra una expectativa de precio.</w:t>
+        <w:t>El contrato de seguro no aparece en ninguna de las cinco dimensiones, y el riesgo es su fundamento, se sostiene sobre póliza y prima, y dos errores frecuentes ahí son el infraseguro y el supraseguro. Un banco no financia una cámara de frío ni una flota sin póliza endosada a su favor, y si esa póliza quedó mal calculada, un siniestro se lleva la capacidad de diferenciarse y deja la deuda intacta, y se me hace raro que ninguna de las cinco dimensiones mida administración del riesgo, aunque en estas empresas el patrimonio del dueno responde por la deuda de la firma, y un banco no presta contra una expectativa de precio.</w:t>
       </w:r>
     </w:p>
     <w:p>
@@ -301,7 +301,7 @@
           <w:rFonts w:ascii="Calibri" w:hAnsi="Calibri"/>
           <w:sz w:val="24"/>
         </w:rPr>
-        <w:t>Sobre internacionalización hay un dato que a mí me descolocó, 79% de las diferenciadas opera en uno o dos países mientras las otras llegan hasta cinco (Brenes et al., 2014), y los autores lo explican porque quien pretende cobrar caro entra despacio, primero diversifica producto, mejora procesos y afirma la marca en su mercado, aunque esa entrada gradual se financia, son años de inventario, marca y aprendizaje pagados sin ingreso proporcional de vuelta. Los mismos autores sugieren que a muchas empresas les sale más fácil crecer vendiendo lo mismo más barato, y que terminan siendo líderes en costo por defecto, no por decisión (Hillman y Hitt, 1999, como se citó en Brenes et al., 2014).</w:t>
+        <w:t>Sobre internacionalización hay un dato que no me esperaba, 79% de las diferenciadas opera en uno o dos países mientras las otras llegan hasta cinco (Brenes et al., 2014), y los autores lo explican porque quien pretende cobrar caro entra despacio, primero diversifica producto, mejora procesos y afirma la marca en su mercado, aunque esa entrada gradual se financia, son años de inventario, marca y aprendizaje pagados sin ingreso proporcional de vuelta. Los mismos autores sugieren que a muchas empresas les sale más fácil crecer vendiendo lo mismo más barato, y que terminan siendo líderes en costo por defecto, no por decisión (Hillman y Hitt, 1999, como se citó en Brenes et al., 2014).</w:t>
       </w:r>
     </w:p>
     <w:p>
@@ -315,7 +315,7 @@
           <w:rFonts w:ascii="Calibri" w:hAnsi="Calibri"/>
           <w:sz w:val="24"/>
         </w:rPr>
-        <w:t>El estudio se declara exploratorio y pide hipótesis probadas con muestras más amplias, así que no puedo exigirle una precisión que no ofrece, y mi analisis se limita a lo que sus datos sostienen, la diferenciación tal como la retratan exige capital y respaldo antes de producir un solo peso extra, y en esta región ese respaldo se define en un contrato de garantía y no en una junta directiva, así que pedirle a una agroindustria mediana que agregue valor no significa nada mas mientras el crédito de largo plazo siga colgando de una hipoteca. ¿Qué tendría que cambiar en el sistema financiero de la región para que diferenciarse dejara de ser un privilegio de quien ya tiene qué garantizar?</w:t>
+        <w:t>El estudio se declara exploratorio y pide hipótesis probadas con muestras más amplias, así que no puedo pedirle una precisión que no ofrece, y me quedo con lo que sus datos alcanzan a sostener, la diferenciación tal como la retratan exige capital y respaldo antes de producir un solo peso extra, y en esta región ese respaldo se define en un contrato de garantía y no en una junta directiva, así que pedirle a una agroindustria mediana que agregue valor no significa nada mas mientras el crédito de largo plazo siga colgando de una hipoteca. ¿Qué tendría que cambiar en el sistema financiero de la región para que diferenciarse dejara de ser un privilegio de quien ya tiene qué garantizar?</w:t>
       </w:r>
     </w:p>
     <w:p>

</xml_diff>

<commit_message>
Ajustar registro: juicio analitico en vez de habla coloquial
</commit_message>
<xml_diff>
--- a/Ensayo3_Institutional Voids.docx
+++ b/Ensayo3_Institutional Voids.docx
@@ -41,7 +41,7 @@
           <w:rFonts w:ascii="Calibri" w:hAnsi="Calibri"/>
           <w:sz w:val="24"/>
         </w:rPr>
-        <w:t>66 gerentes de agroindustrias llenaron un formulario en línea, y de ahí sale todo lo que este estudio afirma sobre la diferenciación en América Latina, pocos casos para ocho países (Brenes, Montoya y Ciravegna, 2014). La pregunta que persiguen los autores es qué separa a una empresa que consigue cobrar por encima del promedio de otra que no lo consigue, y la contestan con cinco dimensiones, calidad de la gerencia, capacidad de innovación, alcance del agronegocio, habilidades de mercadeo y habilidades de operaciones. Ninguna de esas cinco dimensiones dice de dónde sale el dinero para ejecutarlas, y las cinco exigen desembolso antes de generar ingreso, así que el articulo da por hecho un banco dispuesto a prestar, y eso, hasta donde yo vi, no lo dice en ninguna parte, y la Unidad III del curso, que trata operaciones ante instituciones de crédito, garantías, lavado de activos y contrato de seguro, cubre exactamente ese hueco.</w:t>
+        <w:t>66 gerentes de agroindustrias llenaron un formulario en línea, y de ahí sale todo lo que este estudio afirma sobre la diferenciación en América Latina, pocos casos para ocho países (Brenes, Montoya y Ciravegna, 2014). La pregunta que persiguen los autores es qué separa a una empresa que consigue cobrar por encima del promedio de otra que no lo consigue, y la contestan con cinco dimensiones, calidad de la gerencia, capacidad de innovación, alcance del agronegocio, habilidades de mercadeo y habilidades de operaciones. Ninguna de esas cinco dimensiones dice de dónde sale el dinero para ejecutarlas, y las cinco exigen desembolso antes de generar ingreso, así que el articulo da por hecho un banco dispuesto a prestar, y no encontré ese supuesto discutido en ninguna parte del articulo, y la Unidad III del curso, que trata operaciones ante instituciones de crédito, garantías, lavado de activos y contrato de seguro, cubre exactamente ese hueco.</w:t>
       </w:r>
     </w:p>
     <w:p>
@@ -68,7 +68,7 @@
           <w:rFonts w:ascii="Calibri" w:hAnsi="Calibri"/>
           <w:sz w:val="24"/>
         </w:rPr>
-        <w:t>Contactaron 275 empresas, recibieron 86 respuestas, descartaron 20 incompletas y quedaron 66 de ocho países, con 31.3% de respuesta (Brenes et al., 2014). Además dejaron fuera a las que cotizan en bolsa, a las multinacionales y a las que solo hacen producción básica sin agregar valor, de manera que la muestra queda particular, son empresas privadas, familiares, del trópico húmedo y que ya subieron por la cadena de valor, ósea que el estudio no compara agroindustrias en general, compara sobrevivientes entre sí, o así lo entendí yo. Los productores de commodities, que son los que aguantan la peor parte de la volatilidad del precio, quedaron afuera desde el diseño, y eso no es un descuido, los autores lo advierten, pero limita a quién le sirve la conclusión, y ese sesgo no se arregla encuestando más.</w:t>
+        <w:t>Contactaron 275 empresas y quedaron 66 de ocho países, con 31.3% de respuesta (Brenes et al., 2014). Además dejaron fuera a las que cotizan en bolsa, a las multinacionales y a las que solo hacen producción básica, de manera que la muestra queda particular, son empresas privadas, familiares, del trópico húmedo y que ya subieron por la cadena de valor, ósea que el estudio no compara agroindustrias en general, compara sobrevivientes entre sí, y a mi juicio esa diferencia cambia el alcance de la conclusión. Los productores de commodities, que son los que aguantan la peor parte de la volatilidad del precio, quedaron afuera desde el diseño, y eso no es un descuido, los autores lo advierten, pero limita a quién le sirve la conclusión, y ese sesgo no se arregla encuestando más.</w:t>
       </w:r>
     </w:p>
     <w:p>
@@ -123,7 +123,7 @@
           <w:rFonts w:ascii="Calibri" w:hAnsi="Calibri"/>
           <w:sz w:val="24"/>
         </w:rPr>
-        <w:t>En innovación abierta las diferenciadas duplican a las otras al contar solo las que combinan pasantías con investigación conjunta (Brenes et al., 2014), y Grupo Britt, con base en Curazao y operaciones en 14 países, sostiene la innovación desde la gerencia general, con una jefatura dedicada y un sistema formal de desarrollo. En mercadeo la figura se repite, 82% usa marca propia de forma intensa, 76% se apoya en el origen para vender, 91% dice conocer a su consumidor final y 58% reporta más certificaciones internacionales que su competencia, contra 33% del otro grupo, y La Canasta, salvadoreña, monta toda su entrada al mercado estadounidense sobre ser precisamente salvadoreña. De toda esa lista, el uso del origen es lo que se me hace más difícil de copiar.</w:t>
+        <w:t>En innovación abierta las diferenciadas duplican a las otras al contar solo las que combinan pasantías con investigación conjunta (Brenes et al., 2014), y Grupo Britt, con base en Curazao y operaciones en 14 países, sostiene la innovación desde la gerencia general, con una jefatura dedicada y un sistema formal de desarrollo. En mercadeo la figura se repite, 82% usa marca propia de forma intensa, 76% se apoya en el origen para vender, 91% dice conocer a su consumidor final y 58% reporta más certificaciones internacionales que su competencia, contra 33% del otro grupo, y La Canasta, salvadoreña, monta toda su entrada al mercado estadounidense sobre ser precisamente salvadoreña. De toda esa lista, el uso del origen me parece el más difícil de copiar para un competidor.</w:t>
       </w:r>
     </w:p>
     <w:p>
@@ -192,7 +192,7 @@
           <w:rFonts w:ascii="Calibri" w:hAnsi="Calibri"/>
           <w:sz w:val="24"/>
         </w:rPr>
-        <w:t>Monteverde es una láctea costarricense que trabajó años con un distribuidor externo, hasta que en 2008 compró una distribuidora especializada en frío y congelado, y hoy esa integración le da ventaja en conocimiento de mercado y servicio (Brenes et al., 2014). Yo no lo dudo. Lo que me pregunto es otra cosa, porque para comprar una flota de frío hay que ir a un banco, y el banco antes de firmar quiere saber qué se hipoteca, así que lo que el estudio anota como decisión estratégica pasó primero por una garantía. El articulo dice que 67% de las diferenciadas está integrada verticalmente contra 39% del otro grupo, y a mí eso no me suena solo a ambición, quizas sea al revés. La empresa que ya tenía finca propia tuvo con qué responder, consiguió el préstamo y después se integró, y en ese caso la integración no explica el buen desempeño sino que lo acompaña. No tengo cómo probarlo con lo que trae el estudio, pero me quedo con la duda.</w:t>
+        <w:t>Monteverde es una láctea costarricense que trabajó años con un distribuidor externo, hasta que en 2008 compró una distribuidora especializada en frío y congelado, y hoy esa integración le da ventaja en conocimiento de mercado y servicio (Brenes et al., 2014). Yo no lo dudo. Lo que me pregunto es otra cosa, porque para comprar una flota de frío hay que ir a un banco, y el banco antes de firmar quiere saber qué se hipoteca, así que lo que el estudio anota como decisión estratégica pasó primero por una garantía. El articulo dice que 67% de las diferenciadas está integrada verticalmente contra 39% del otro grupo, y para mí eso no es solo ambición estratégica, quizas sea al revés. La empresa que ya tenía finca propia tuvo con qué responder, consiguió el préstamo y después se integró, y en ese caso la integración no explica el buen desempeño sino que lo acompaña. No tengo cómo probarlo con lo que trae el estudio, pero me quedo con la duda.</w:t>
       </w:r>
     </w:p>
     <w:p>
@@ -233,7 +233,7 @@
           <w:rFonts w:ascii="Calibri" w:hAnsi="Calibri"/>
           <w:sz w:val="24"/>
         </w:rPr>
-        <w:t>La trazabilidad tiene un segundo uso que el estudio no registra, porque la empresa que ya la montó por exigencia de una certificación europea puede enseñar de dónde salió cada lote y a quién le pagó, entonces cumple sin esfuerzo la debida diligencia del banco, mientras la que compra en la plaza y paga en efectivo no puede enseñarlo, y tampoco no tiene cómo reconstruirlo después, y no porque esté lavando nada. La misma inversión rinde dos veces, para vender caro afuera y para conseguir crédito adentro, y por eso la brecha entre los dos grupos se amplía sola, aunque el debido proceso y la presunción de inocencia siguen en pie, solo que un banco no necesita acusar a nadie para negar una solicitud, y yo no vi en el estudio ningún dato sobre quién se queda afuera por ahí.</w:t>
+        <w:t>La trazabilidad tiene un segundo uso que el estudio no registra, porque la empresa que ya la montó por exigencia de una certificación europea puede enseñar de dónde salió cada lote y a quién le pagó, entonces cumple sin esfuerzo la debida diligencia del banco, mientras la que compra en la plaza y paga en efectivo no puede enseñarlo, y tampoco no tiene cómo reconstruirlo después, y no porque esté lavando nada. La misma inversión rinde dos veces, para vender caro afuera y para conseguir crédito adentro, y por eso la brecha entre los dos grupos se amplía sola, aunque el debido proceso y la presunción de inocencia siguen en pie, solo que un banco no necesita acusar a nadie para negar una solicitud, y el estudio no aporta ningún dato sobre quién queda excluido, que para mí es el vacío más grande del análisis.</w:t>
       </w:r>
     </w:p>
     <w:p>
@@ -260,7 +260,7 @@
           <w:rFonts w:ascii="Calibri" w:hAnsi="Calibri"/>
           <w:sz w:val="24"/>
         </w:rPr>
-        <w:t>Hay un resultado que los autores reconocen como raro, 70% de las empresas diferenciadas reporta uso intenso de maquinaria especializada, contra 79% de las otras (Brenes et al., 2014), y su explicación es que las diferenciadas dependen menos del equipo aun teniendo procesos más complejos, y que las otras probablemente van por liderazgo en costos, estrategia que sí vive de comprar equipo para bajar el costo unitario. El cuestionario preguntó por intensidad de uso, no por monto invertido, asi que el dato no cierra del todo, y una planta compleja concentra mucho valor en pocos metros, y en relación con proveedores y en calidad del producto no aparece ninguna diferencia entre los dos grupos. Ese dato va contra lo que yo vengo diciendo, porque si el problema fuera el crédito, las diferenciadas tendrían que reportar más maquinaria y no menos, y mejor lo dejo dicho.</w:t>
+        <w:t>Hay un resultado que los autores reconocen como raro, 70% de las empresas diferenciadas reporta uso intenso de maquinaria especializada, contra 79% de las otras (Brenes et al., 2014), y su explicación es que las diferenciadas dependen menos del equipo aun teniendo procesos más complejos, y que las otras probablemente van por liderazgo en costos, estrategia que sí vive de comprar equipo para bajar el costo unitario. El cuestionario preguntó por intensidad de uso, no por monto, asi que el dato no cierra del todo, y una planta compleja concentra mucho valor en pocos metros, y en proveedores y calidad del producto no aparece ninguna diferencia. Ese dato va contra lo que yo vengo diciendo, porque si el problema fuera el crédito, las diferenciadas tendrían que reportar más maquinaria y no menos, y no tengo con qué responder a esa objeción.</w:t>
       </w:r>
     </w:p>
     <w:p>
@@ -274,7 +274,7 @@
           <w:rFonts w:ascii="Calibri" w:hAnsi="Calibri"/>
           <w:sz w:val="24"/>
         </w:rPr>
-        <w:t>El contrato de seguro no aparece en ninguna de las cinco dimensiones, y el riesgo es su fundamento, se sostiene sobre póliza y prima, y dos errores frecuentes ahí son el infraseguro y el supraseguro. Un banco no financia una cámara de frío ni una flota sin póliza endosada a su favor, y si esa póliza quedó mal calculada, un siniestro se lleva la capacidad de diferenciarse y deja la deuda intacta, y se me hace raro que ninguna de las cinco dimensiones mida administración del riesgo, aunque en estas empresas el patrimonio del dueno responde por la deuda de la firma, y un banco no presta contra una expectativa de precio.</w:t>
+        <w:t>El contrato de seguro no aparece en ninguna de las cinco dimensiones, y el riesgo es su fundamento, se sostiene sobre póliza y prima, y dos errores frecuentes ahí son el infraseguro y el supraseguro. Un banco no financia una cámara de frío ni una flota sin póliza endosada a su favor, y si esa póliza quedó mal calculada, un siniestro se lleva la capacidad de diferenciarse y deja la deuda intacta, y me parece una omisión importante que ninguna de las cinco dimensiones mida administración del riesgo, aunque en estas empresas el patrimonio del dueno responde por la deuda de la firma, y un banco no presta contra una expectativa de precio.</w:t>
       </w:r>
     </w:p>
     <w:p>

</xml_diff>

<commit_message>
Agregar seccion de conclusion y separarla de los limites
</commit_message>
<xml_diff>
--- a/Ensayo3_Institutional Voids.docx
+++ b/Ensayo3_Institutional Voids.docx
@@ -41,7 +41,7 @@
           <w:rFonts w:ascii="Calibri" w:hAnsi="Calibri"/>
           <w:sz w:val="24"/>
         </w:rPr>
-        <w:t>66 gerentes de agroindustrias llenaron un formulario en línea, y de ahí sale todo lo que este estudio afirma sobre la diferenciación en América Latina, pocos casos para ocho países (Brenes, Montoya y Ciravegna, 2014). La pregunta que persiguen los autores es qué separa a una empresa que consigue cobrar por encima del promedio de otra que no lo consigue, y la contestan con cinco dimensiones, calidad de la gerencia, capacidad de innovación, alcance del agronegocio, habilidades de mercadeo y habilidades de operaciones. Ninguna de esas cinco dimensiones dice de dónde sale el dinero para ejecutarlas, y las cinco exigen desembolso antes de generar ingreso, así que el articulo da por hecho un banco dispuesto a prestar, y no encontré ese supuesto discutido en ninguna parte del articulo, y la Unidad III del curso, que trata operaciones ante instituciones de crédito, garantías, lavado de activos y contrato de seguro, cubre exactamente ese hueco.</w:t>
+        <w:t>66 gerentes de agroindustrias llenaron un formulario en línea, y de ahí sale todo lo que este estudio afirma sobre la diferenciación en América Latina, pocos casos para ocho países (Brenes, Montoya y Ciravegna, 2014). La pregunta que persiguen los autores es qué separa a una empresa que consigue cobrar por encima del promedio de otra que no lo consigue, y la contestan con cinco dimensiones, calidad de la gerencia, capacidad de innovación, alcance del agronegocio, habilidades de mercadeo y habilidades de operaciones. Ninguna de esas cinco dimensiones dice de dónde sale el dinero para ejecutarlas, y las cinco exigen desembolso antes de generar ingreso, así que el articulo da por hecho un banco dispuesto a prestar, y no encontré ese supuesto discutido en el articulo, y la Unidad III del curso, que trata operaciones ante instituciones de crédito, garantías, lavado de activos y contrato de seguro, cubre exactamente ese hueco.</w:t>
       </w:r>
     </w:p>
     <w:p>
@@ -68,7 +68,7 @@
           <w:rFonts w:ascii="Calibri" w:hAnsi="Calibri"/>
           <w:sz w:val="24"/>
         </w:rPr>
-        <w:t>Contactaron 275 empresas y quedaron 66 de ocho países, con 31.3% de respuesta (Brenes et al., 2014). Además dejaron fuera a las que cotizan en bolsa, a las multinacionales y a las que solo hacen producción básica, de manera que la muestra queda particular, son empresas privadas, familiares, del trópico húmedo y que ya subieron por la cadena de valor, ósea que el estudio no compara agroindustrias en general, compara sobrevivientes entre sí, y a mi juicio esa diferencia cambia el alcance de la conclusión. Los productores de commodities, que son los que aguantan la peor parte de la volatilidad del precio, quedaron afuera desde el diseño, y eso no es un descuido, los autores lo advierten, pero limita a quién le sirve la conclusión, y ese sesgo no se arregla encuestando más.</w:t>
+        <w:t>Contactaron 275 empresas y quedaron 66 de ocho países, con 31.3% de respuesta (Brenes et al., 2014). Además dejaron fuera a las que cotizan en bolsa, a las multinacionales y a las que solo hacen producción básica, de manera que quedan solo empresas privadas, familiares, del trópico húmedo y que ya subieron por la cadena de valor, ósea que el estudio no compara agroindustrias en general, compara sobrevivientes entre sí, y a mi juicio esa diferencia cambia el alcance de la conclusión. Los productores de commodities, que aguantan la peor parte de la volatilidad, quedaron afuera desde el diseño, y eso no es un descuido, los autores lo advierten, pero limita a quién le sirve la conclusión, y ese sesgo no se arregla encuestando más.</w:t>
       </w:r>
     </w:p>
     <w:p>
@@ -82,7 +82,7 @@
           <w:rFonts w:ascii="Calibri" w:hAnsi="Calibri"/>
           <w:sz w:val="24"/>
         </w:rPr>
-        <w:t>Más delicado es cómo se decidió quién cuenta como empresa diferenciada, porque al no existir datos financieros públicos, los autores preguntaron de frente si la empresa cobra precios consistentemente por encima de su competencia, en escala de 1 a 7, y clasificaron como diferenciadas a las que contestaron 5, 6 o 7 (Brenes et al., 2014), y así quedaron 33 empresas en cada grupo, partidas casi por mitad. Ellos aclaran que preguntar así es práctica aceptada en la investigación de estrategia, aunque el problema no se va; el gerente que ya metió dinero en marca, en certificaciones y en innovación tiene todos los motivos para creer que cobra más caro que el vecino, y nadie verificó esa respuesta contra una factura, porque cobrar caro no es lo mismo que creer que se cobra caro, y ahí yo ya no veo cómo distinguir una cosa de la otra.</w:t>
+        <w:t>Más delicado es cómo se decidió quién cuenta como empresa diferenciada, porque al no existir datos financieros públicos, los autores preguntaron de frente si la empresa cobra precios consistentemente por encima de su competencia, en escala de 1 a 7, y clasificaron como diferenciadas a las que contestaron 5, 6 o 7 (Brenes et al., 2014), y así quedaron 33 empresas en cada grupo. Ellos aclaran que preguntar así es práctica aceptada, aunque el problema no se va; el gerente que ya metió dinero en marca, en certificaciones y en innovación tiene todos los motivos para creer que cobra más caro que el vecino, y nadie verificó esa respuesta contra una factura, porque cobrar caro no es lo mismo que creer que se cobra caro, y ahí yo ya no veo cómo distinguir una cosa de la otra.</w:t>
       </w:r>
     </w:p>
     <w:p>
@@ -109,7 +109,7 @@
           <w:rFonts w:ascii="Calibri" w:hAnsi="Calibri"/>
           <w:sz w:val="24"/>
         </w:rPr>
-        <w:t>Al restar los promedios de ambos grupos, las brechas mayores aparecen en capacidad de innovación, con 0.56, y en habilidades de mercadeo, con 0.55; alcance del agronegocio queda en 0.36, operaciones en 0.30 y calidad de la gerencia en apenas 0.20 (Brenes et al., 2014). Los autores avisan que ahí significativo no denota significancia estadística sino apenas una tendencia, y me parece bien que lo aclaren, aunuqe medio punto en una escala de 7 es poco para sostener una diferencia de fondo. A mí la cifra de inversión me convence más que esos promedios, 18% de las empresas diferenciadas destina más del 7% de sus ventas a investigación y desarrollo, mientras del otro grupo solo 3% llega ahí.</w:t>
+        <w:t>Al restar los promedios, las brechas mayores aparecen en capacidad de innovación, con 0.56, y en habilidades de mercadeo, con 0.55; alcance del agronegocio queda en 0.36, operaciones en 0.30 y calidad de la gerencia en 0.20 (Brenes et al., 2014). Los autores avisan que ahí significativo no denota significancia estadística sino apenas una tendencia, y me parece bien que lo aclaren, aunuqe medio punto en una escala de 7 es poco para sostener una diferencia de fondo. A mí la cifra de inversión me convence más que esos promedios, 18% de las diferenciadas destina más del 7% de sus ventas a investigación y desarrollo, mientras del otro grupo solo 3% llega ahí.</w:t>
       </w:r>
     </w:p>
     <w:p>
@@ -123,7 +123,7 @@
           <w:rFonts w:ascii="Calibri" w:hAnsi="Calibri"/>
           <w:sz w:val="24"/>
         </w:rPr>
-        <w:t>En innovación abierta las diferenciadas duplican a las otras al contar solo las que combinan pasantías con investigación conjunta (Brenes et al., 2014), y Grupo Britt, con base en Curazao y operaciones en 14 países, sostiene la innovación desde la gerencia general, con una jefatura dedicada y un sistema formal de desarrollo. En mercadeo la figura se repite, 82% usa marca propia de forma intensa, 76% se apoya en el origen para vender, 91% dice conocer a su consumidor final y 58% reporta más certificaciones internacionales que su competencia, contra 33% del otro grupo, y La Canasta, salvadoreña, monta toda su entrada al mercado estadounidense sobre ser precisamente salvadoreña. De toda esa lista, el uso del origen me parece el más difícil de copiar para un competidor.</w:t>
+        <w:t>En innovación abierta las diferenciadas duplican a las otras al contar solo las que combinan pasantías con investigación conjunta (Brenes et al., 2014), y Grupo Britt, con operaciones en 14 países, sostiene la innovación desde la gerencia general, con una jefatura dedicada y un sistema formal de desarrollo. En mercadeo la figura se repite, 82% usa marca propia de forma intensa, 76% se apoya en el origen para vender, 91% dice conocer a su consumidor final y 58% reporta más certificaciones internacionales que su competencia, contra 33% del otro grupo, y La Canasta, salvadoreña, entra al mercado estadounidense apoyada en ser salvadoreña. De toda esa lista, el uso del origen me parece el más difícil de copiar para un competidor.</w:t>
       </w:r>
     </w:p>
     <w:p>
@@ -137,7 +137,7 @@
           <w:rFonts w:ascii="Calibri" w:hAnsi="Calibri"/>
           <w:sz w:val="24"/>
         </w:rPr>
-        <w:t>Dos exportadoras de mango tomaron decisiones opuestas, una definió primero, con análisis de mercado en mano, qué variedad quería cada destino, y sembró después, mientras la otra sembró según lo que aguantaba el suelo y se enteró tarde de que su fruta no tenía salida afuera (Brenes et al., 2014), así que para mí la distancia entre las dos no es agronómica, es de información, y la información de mercado se compra. Britt tambien rompió con su distribuidor a fines de los noventa porque no entendía el producto, y terminó armando su propia red hacia restaurantes, hoteles y supermercados de gama alta, y ni la selección de variedades ni una red propia de distribución se pagan con la caja del mes.</w:t>
+        <w:t>Dos exportadoras de mango tomaron decisiones opuestas, una definió primero, con análisis de mercado en mano, qué variedad quería cada destino, y sembró después, mientras la otra sembró según lo que aguantaba el suelo y se enteró tarde de que su fruta no tenía salida afuera (Brenes et al., 2014), así que para mí la distancia entre las dos no es agronómica, es de información, y la información de mercado se compra. Britt tambien rompió con su distribuidor a fines de los noventa porque no entendía el producto, y terminó armando su propia red hacia restaurantes, hoteles y supermercados, y ni la selección de variedades ni una red propia se pagan con la caja del mes.</w:t>
       </w:r>
     </w:p>
     <w:p>
@@ -164,7 +164,7 @@
           <w:rFonts w:ascii="Calibri" w:hAnsi="Calibri"/>
           <w:sz w:val="24"/>
         </w:rPr>
-        <w:t>La intermediación financiera es actividad de interés público y el negocio bancario se ordena en operaciones pasivas, activas, neutrales y mixtas, siendo las activas justamente las que otorgan crédito a la empresa. Puesto a que las cinco dimensiones del modelo se traducen todas en desembolsos, marca, certificación, maquinaria de proceso, capacitación, distribución propia, el modelo describe el destino del dinero y nunca su procedencia, y no me parece un detalle chico, porque los autores escogieron a propósito empresas que no cotizan en bolsa, es decir que no pueden emitir acciones ni colocar deuda; les queda la utilidad retenida, el aporte de la familia o el préstamo bancario, y de esas tres, dos dependen de con qué se garantiza.</w:t>
+        <w:t>La intermediación financiera es actividad de interés público y el negocio bancario se ordena en operaciones pasivas, activas, neutrales y mixtas, siendo las activas las que otorgan crédito. Puesto a que las cinco dimensiones se traducen todas en desembolsos, marca, certificación, maquinaria, capacitación, distribución propia, el modelo describe el destino del dinero y nunca su procedencia, y no me parece un detalle chico, porque los autores escogieron a propósito empresas que no cotizan en bolsa, es decir que no pueden emitir acciones ni colocar deuda; les queda la utilidad retenida, el aporte de la familia o el préstamo bancario, y de esas tres, dos dependen de con qué se garantiza.</w:t>
       </w:r>
     </w:p>
     <w:p>
@@ -219,7 +219,7 @@
           <w:rFonts w:ascii="Calibri" w:hAnsi="Calibri"/>
           <w:sz w:val="24"/>
         </w:rPr>
-        <w:t>Certificar no es una característica del producto sino un gasto que vuelve cada año en auditorías y trazabilidad, y el estudio no considera el marco legal de ese registro, porque el lavado de activos consiste en ocultar el origen de bienes obtenidos ilegalmente para darles apariencia de legalidad mediante actividades lícitas, es un delito autónomo y alcanza con la misma sanción a los testaferros. El agro trabaja con pagos en efectivo a productores pequeños, intermediarios y cadenas largas de acopio, y ese perfil, sin que nadie haya cometido ningún delito, es el que obliga al banco a pedir más papeles, y para mí eso convierte la certificación en un requisito del banco antes que del cliente.</w:t>
+        <w:t>Certificar no es una característica del producto sino un gasto que vuelve cada año en auditorías y trazabilidad, y el estudio no considera el marco legal de ese registro, porque el lavado de activos consiste en ocultar el origen de bienes obtenidos ilegalmente para darles apariencia de legalidad mediante actividades lícitas, es un delito autónomo que alcanza tambien a los testaferros. El agro paga en efectivo a productores pequeños, con intermediarios y cadenas de acopio, y ese perfil, sin que nadie haya cometido ningún delito, obliga al banco a pedir más papeles, y para mí eso convierte la certificación en un requisito del banco antes que del cliente.</w:t>
       </w:r>
     </w:p>
     <w:p>
@@ -233,7 +233,7 @@
           <w:rFonts w:ascii="Calibri" w:hAnsi="Calibri"/>
           <w:sz w:val="24"/>
         </w:rPr>
-        <w:t>La trazabilidad tiene un segundo uso que el estudio no registra, porque la empresa que ya la montó por exigencia de una certificación europea puede enseñar de dónde salió cada lote y a quién le pagó, entonces cumple sin esfuerzo la debida diligencia del banco, mientras la que compra en la plaza y paga en efectivo no puede enseñarlo, y tampoco no tiene cómo reconstruirlo después, y no porque esté lavando nada. La misma inversión rinde dos veces, para vender caro afuera y para conseguir crédito adentro, y por eso la brecha entre los dos grupos se amplía sola, aunque el debido proceso y la presunción de inocencia siguen en pie, solo que un banco no necesita acusar a nadie para negar una solicitud, y el estudio no aporta ningún dato sobre quién queda excluido, que para mí es el vacío más grande del análisis.</w:t>
+        <w:t>La trazabilidad tiene un segundo uso que el estudio no registra, porque la empresa que ya la montó por exigencia de una certificación europea puede enseñar de dónde salió cada lote y a quién le pagó, entonces cumple sin esfuerzo la debida diligencia del banco, mientras la que compra en la plaza y paga en efectivo no puede enseñarlo, y tampoco no tiene cómo reconstruirlo, y no porque esté lavando nada. La misma inversión rinde dos veces, para vender caro afuera y para conseguir crédito adentro, y por eso la brecha entre los dos grupos se amplía sola, aunque el debido proceso y la presunción de inocencia siguen en pie, solo que un banco no necesita acusar a nadie para negar una solicitud, y el estudio no aporta ningún dato sobre quién queda excluido, que para mí es el vacío más grande.</w:t>
       </w:r>
     </w:p>
     <w:p>
@@ -260,7 +260,7 @@
           <w:rFonts w:ascii="Calibri" w:hAnsi="Calibri"/>
           <w:sz w:val="24"/>
         </w:rPr>
-        <w:t>Hay un resultado que los autores reconocen como raro, 70% de las empresas diferenciadas reporta uso intenso de maquinaria especializada, contra 79% de las otras (Brenes et al., 2014), y su explicación es que las diferenciadas dependen menos del equipo aun teniendo procesos más complejos, y que las otras probablemente van por liderazgo en costos, estrategia que sí vive de comprar equipo para bajar el costo unitario. El cuestionario preguntó por intensidad de uso, no por monto, asi que el dato no cierra del todo, y una planta compleja concentra mucho valor en pocos metros, y en proveedores y calidad del producto no aparece ninguna diferencia. Ese dato va contra lo que yo vengo diciendo, porque si el problema fuera el crédito, las diferenciadas tendrían que reportar más maquinaria y no menos, y por ahora no tengo con qué responder a esa objeción.</w:t>
+        <w:t>Hay un resultado que los autores reconocen como raro, 70% de las empresas diferenciadas reporta uso intenso de maquinaria especializada, contra 79% de las otras (Brenes et al., 2014), y su explicación es que las diferenciadas dependen menos del equipo aun teniendo procesos más complejos, y que las otras probablemente van por liderazgo en costos, estrategia que vive de comprar equipo para bajar costos. El cuestionario preguntó por intensidad de uso, no por monto, asi que no cierra del todo, y una planta compleja concentra mucho valor en pocos metros, y en proveedores y calidad del producto no aparece ninguna diferencia. Ese dato va contra lo que yo vengo diciendo, porque si el problema fuera el crédito, las diferenciadas tendrían que reportar más maquinaria y no menos, y por ahora no tengo con qué responder a esa objeción.</w:t>
       </w:r>
     </w:p>
     <w:p>
@@ -274,7 +274,7 @@
           <w:rFonts w:ascii="Calibri" w:hAnsi="Calibri"/>
           <w:sz w:val="24"/>
         </w:rPr>
-        <w:t>El contrato de seguro no aparece en ninguna de las cinco dimensiones, y el riesgo es su fundamento, se sostiene sobre póliza y prima, y dos errores frecuentes ahí son el infraseguro y el supraseguro. Un banco no financia una cámara de frío ni una flota sin póliza endosada a su favor, y si esa póliza quedó mal calculada, un siniestro se lleva la capacidad de diferenciarse y deja la deuda intacta, y me parece una omisión importante que ninguna de las cinco dimensiones mida administración del riesgo, aunque en estas empresas el patrimonio del dueno responde por la deuda de la firma, y un banco no presta contra una expectativa de precio.</w:t>
+        <w:t>El contrato de seguro no aparece en ninguna de las cinco dimensiones, aunque el riesgo es su fundamento y dos errores frecuentes son el infraseguro y el supraseguro. Un banco no financia una cámara de frío sin póliza endosada a su favor, y si quedó mal calculada, un siniestro se lleva la capacidad de diferenciarse y deja la deuda intacta, y me parece una omisión importante que ninguna de las cinco dimensiones mida administración del riesgo, aunque en estas empresas el patrimonio del dueno responde por la deuda de la firma, y un banco no presta contra una expectativa de precio.</w:t>
       </w:r>
     </w:p>
     <w:p>
@@ -301,7 +301,7 @@
           <w:rFonts w:ascii="Calibri" w:hAnsi="Calibri"/>
           <w:sz w:val="24"/>
         </w:rPr>
-        <w:t>Sobre internacionalización hay un dato que no me esperaba, 79% de las diferenciadas opera en uno o dos países mientras las otras llegan hasta cinco (Brenes et al., 2014), y los autores lo explican porque quien pretende cobrar caro entra despacio, primero diversifica producto, mejora procesos y afirma la marca en su mercado, aunque esa entrada gradual se financia, son años de inventario, marca y aprendizaje pagados sin ingreso proporcional de vuelta. Los mismos autores sugieren que a muchas empresas les sale más fácil crecer vendiendo lo mismo más barato, y que terminan siendo líderes en costo por defecto, no por decisión (Hillman y Hitt, 1999, como se citó en Brenes et al., 2014).</w:t>
+        <w:t>Sobre internacionalización hay un dato que no me esperaba, 79% de las diferenciadas opera en uno o dos países mientras las otras llegan hasta cinco (Brenes et al., 2014), y los autores lo explican porque quien pretende cobrar caro entra despacio, primero diversifica producto, mejora procesos y afirma la marca en su mercado, aunque esa entrada gradual se financia, son años de inventario, marca y aprendizaje pagados sin ingreso proporcional de vuelta. Los mismos autores sugieren que a muchas empresas les sale más fácil crecer vendiendo lo mismo más barato, y que terminan siendo líderes en costo por defecto (Hillman y Hitt, 1999, como se citó en Brenes et al., 2014).</w:t>
       </w:r>
     </w:p>
     <w:p>
@@ -315,7 +315,35 @@
           <w:rFonts w:ascii="Calibri" w:hAnsi="Calibri"/>
           <w:sz w:val="24"/>
         </w:rPr>
-        <w:t>El estudio se declara exploratorio y pide hipótesis probadas con muestras más amplias, así que no puedo pedirle una precisión que no ofrece, y me quedo con lo que sus datos alcanzan a sostener, la diferenciación tal como la retratan exige capital y respaldo antes de producir un solo peso extra, y en esta región ese respaldo se define en un contrato de garantía y no en una junta directiva, así que pedirle a una agroindustria mediana que agregue valor no significa nada mas mientras el crédito de largo plazo siga colgando de una hipoteca. ¿Qué tendría que cambiar en el sistema financiero de la región para que diferenciarse dejara de ser un privilegio de quien ya tiene qué garantizar?</w:t>
+        <w:t>El estudio se declara exploratorio y pide hipótesis probadas con muestras más amplias, así que no puedo pedirle una precisión que no ofrece. Tampoco puedo sostener que el crédito lo explique todo, porque el dato de la maquinaria va en contra y una muestra de 66 empresas privadas del trópico húmedo no alcanza para generalizar al sector.</w:t>
+      </w:r>
+    </w:p>
+    <w:p>
+      <w:pPr>
+        <w:spacing w:line="480" w:lineRule="auto" w:after="120" w:before="240"/>
+      </w:pPr>
+      <w:r>
+        <w:rPr>
+          <w:rFonts w:ascii="Calibri" w:hAnsi="Calibri"/>
+          <w:b/>
+          <w:sz w:val="24"/>
+        </w:rPr>
+        <w:t>Conclusión, la diferenciación empieza en el banco</w:t>
+      </w:r>
+    </w:p>
+    <w:p>
+      <w:pPr>
+        <w:spacing w:line="480" w:lineRule="auto" w:after="200"/>
+        <w:ind w:firstLine="709"/>
+        <w:jc w:val="both"/>
+      </w:pPr>
+      <w:r>
+        <w:rPr>
+          <w:rFonts w:ascii="Calibri" w:hAnsi="Calibri"/>
+          <w:b w:val="0"/>
+          <w:sz w:val="24"/>
+        </w:rPr>
+        <w:t>El estudio identifica bien qué hacen distinto las empresas que logran cobrar más caro, porque innovan, marcan, certifican y procesan, y eso queda medido. Lo que no explica es cómo llegaron a estar en condiciones de hacerlo, y ahí la Unidad III completa el cuadro, porque cada una de esas cinco dimensiones supone un banco que preste, un bien que se hipoteque y una póliza que respalde la operación. Mi conclusión es que en esta región la diferenciación no empieza en una decisión de estrategia sino en una operación de crédito con garantía real, y que el articulo, sin proponérselo, describe a las empresas que ya pasaron ese filtro. ¿Qué tendría que cambiar en el sistema financiero para que diferenciarse dejara de ser un privilegio de quien ya tiene qué garantizar?</w:t>
       </w:r>
     </w:p>
     <w:p>

</xml_diff>